<commit_message>
docs: portada institucional, Times New Roman y evidencias RSU reales
- Portada según el modelo del grupo (escudo de la UNAJMA) en todos los documentos
- Fuente Times New Roman en documentos y presentación
- Parte 8 del informe, diapositiva 9 y 7_Evidencias_RSU con la demostración
  por Google Meet del 20/10/2026 y sus capturas

Co-Authored-By: Claude Opus 5.5 <noreply@anthropic.com>
</commit_message>
<xml_diff>
--- a/docs/entrega/2_Informe.docx
+++ b/docs/entrega/2_Informe.docx
@@ -4,96 +4,8 @@
   <w:body>
     <w:p>
       <w:pPr>
-        <w:spacing w:after="600" w:line="240" w:lineRule="auto"/>
-      </w:pPr>
-    </w:p>
-    <w:p>
-      <w:pPr>
-        <w:jc w:val="center"/>
-      </w:pPr>
-      <w:r>
-        <w:rPr>
-          <w:b/>
-          <w:color w:val="1E3A8A"/>
-          <w:sz w:val="32"/>
-        </w:rPr>
-        <w:t>UNIVERSIDAD NACIONAL JOSÉ MARÍA ARGUEDAS</w:t>
-      </w:r>
-    </w:p>
-    <w:p>
-      <w:pPr>
-        <w:jc w:val="center"/>
-      </w:pPr>
-      <w:r>
-        <w:t>Facultad de Ingeniería · Escuela Profesional de Ingeniería de Sistemas</w:t>
-      </w:r>
-    </w:p>
-    <w:p>
-      <w:pPr>
-        <w:jc w:val="center"/>
-      </w:pPr>
-      <w:r>
-        <w:t>Asignatura: Computación Gráfica (IIAD65) · Semestre 2026-II</w:t>
-      </w:r>
-    </w:p>
-    <w:p>
-      <w:pPr>
-        <w:spacing w:after="800" w:line="240" w:lineRule="auto"/>
-      </w:pPr>
-    </w:p>
-    <w:p>
-      <w:pPr>
-        <w:jc w:val="center"/>
-      </w:pPr>
-      <w:r>
-        <w:rPr>
-          <w:b/>
-          <w:color w:val="4B5563"/>
-          <w:sz w:val="26"/>
-        </w:rPr>
-        <w:t>INFORME TÉCNICO (AVANCE AL 50 %)</w:t>
-      </w:r>
-    </w:p>
-    <w:p>
-      <w:pPr>
-        <w:jc w:val="center"/>
-      </w:pPr>
-      <w:r>
-        <w:rPr>
-          <w:b/>
-          <w:color w:val="1E3A8A"/>
-          <w:sz w:val="36"/>
-        </w:rPr>
-        <w:t>GEOMATRIZ 2D: LABORATORIO INTERACTIVO DE GEOMETRÍA 2D CON MATRICES VISIBLES</w:t>
-      </w:r>
-    </w:p>
-    <w:p>
-      <w:pPr>
-        <w:jc w:val="center"/>
-      </w:pPr>
-      <w:r>
-        <w:rPr>
-          <w:i/>
-          <w:sz w:val="22"/>
-        </w:rPr>
-        <w:t>Tema N.º 3 — Laboratorio de geometría con matrices visibles (traslación, rotación, escalado, coordenadas homogéneas)</w:t>
-      </w:r>
-    </w:p>
-    <w:p>
-      <w:pPr>
-        <w:spacing w:after="600" w:line="240" w:lineRule="auto"/>
-      </w:pPr>
-    </w:p>
-    <w:p>
-      <w:pPr>
-        <w:jc w:val="center"/>
-      </w:pPr>
-      <w:r>
-        <w:rPr>
-          <w:b/>
-        </w:rPr>
-        <w:t>Grupo N.º: 3</w:t>
-      </w:r>
+        <w:spacing w:line="240" w:lineRule="auto"/>
+      </w:pPr>
     </w:p>
     <w:p>
       <w:pPr>
@@ -103,8 +15,98 @@
       <w:r>
         <w:rPr>
           <w:b/>
-        </w:rPr>
-        <w:t>Integrantes (rol):</w:t>
+          <w:color w:val="000000"/>
+          <w:sz w:val="36"/>
+        </w:rPr>
+        <w:t>UNIVERSIDAD NACIONAL JOSÉ MARÍA ARGUEDAS</w:t>
+      </w:r>
+    </w:p>
+    <w:p>
+      <w:pPr>
+        <w:spacing w:after="0"/>
+        <w:jc w:val="center"/>
+      </w:pPr>
+      <w:r>
+        <w:rPr>
+          <w:color w:val="000000"/>
+          <w:sz w:val="26"/>
+        </w:rPr>
+        <w:t>Facultad de Ingeniería</w:t>
+      </w:r>
+    </w:p>
+    <w:p>
+      <w:pPr>
+        <w:spacing w:after="160"/>
+        <w:jc w:val="center"/>
+      </w:pPr>
+      <w:r>
+        <w:rPr>
+          <w:color w:val="000000"/>
+          <w:sz w:val="26"/>
+        </w:rPr>
+        <w:t>Escuela Profesional de Ingeniería de Sistemas</w:t>
+      </w:r>
+    </w:p>
+    <w:p>
+      <w:pPr>
+        <w:jc w:val="center"/>
+      </w:pPr>
+      <w:r>
+        <w:rPr>
+          <w:noProof/>
+        </w:rPr>
+        <w:drawing>
+          <wp:inline distT="0" distB="0" distL="0" distR="0" wp14:anchorId="63F026F8" wp14:editId="0F13F4B4">
+            <wp:extent cx="1872000" cy="2186496"/>
+            <wp:effectExtent l="0" t="0" r="0" b="0"/>
+            <wp:docPr id="1" name="Picture 1"/>
+            <wp:cNvGraphicFramePr>
+              <a:graphicFrameLocks xmlns:a="http://schemas.openxmlformats.org/drawingml/2006/main" noChangeAspect="1"/>
+            </wp:cNvGraphicFramePr>
+            <a:graphic xmlns:a="http://schemas.openxmlformats.org/drawingml/2006/main">
+              <a:graphicData uri="http://schemas.openxmlformats.org/drawingml/2006/picture">
+                <pic:pic xmlns:pic="http://schemas.openxmlformats.org/drawingml/2006/picture">
+                  <pic:nvPicPr>
+                    <pic:cNvPr id="0" name="logo_unajma.png"/>
+                    <pic:cNvPicPr/>
+                  </pic:nvPicPr>
+                  <pic:blipFill>
+                    <a:blip r:embed="rId8"/>
+                    <a:stretch>
+                      <a:fillRect/>
+                    </a:stretch>
+                  </pic:blipFill>
+                  <pic:spPr>
+                    <a:xfrm>
+                      <a:off x="0" y="0"/>
+                      <a:ext cx="1872000" cy="2186496"/>
+                    </a:xfrm>
+                    <a:prstGeom prst="rect">
+                      <a:avLst/>
+                    </a:prstGeom>
+                  </pic:spPr>
+                </pic:pic>
+              </a:graphicData>
+            </a:graphic>
+          </wp:inline>
+        </w:drawing>
+      </w:r>
+    </w:p>
+    <w:p>
+      <w:pPr>
+        <w:spacing w:after="80" w:line="240" w:lineRule="auto"/>
+      </w:pPr>
+    </w:p>
+    <w:p>
+      <w:pPr>
+        <w:spacing w:after="240"/>
+        <w:jc w:val="center"/>
+      </w:pPr>
+      <w:r>
+        <w:rPr>
+          <w:color w:val="000000"/>
+        </w:rPr>
+        <w:t>Asignatura: Computación Gráfica (IIAD65) · Semestre 2026-II</w:t>
       </w:r>
     </w:p>
     <w:p>
@@ -114,9 +116,25 @@
       </w:pPr>
       <w:r>
         <w:rPr>
-          <w:sz w:val="22"/>
-        </w:rPr>
-        <w:t>1. Oscco Zarabia Rider Gilmar (Coordinación, renderizado y plano cartesiano, repositorio e informe)</w:t>
+          <w:b/>
+          <w:color w:val="000000"/>
+          <w:sz w:val="26"/>
+        </w:rPr>
+        <w:t>INFORME TÉCNICO (AVANCE AL 50 %)</w:t>
+      </w:r>
+    </w:p>
+    <w:p>
+      <w:pPr>
+        <w:spacing w:after="240"/>
+        <w:jc w:val="center"/>
+      </w:pPr>
+      <w:r>
+        <w:rPr>
+          <w:b/>
+          <w:color w:val="000000"/>
+          <w:sz w:val="30"/>
+        </w:rPr>
+        <w:t>GEOMATRIZ 2D: LABORATORIO INTERACTIVO DE GEOMETRÍA 2D CON MATRICES VISIBLES</w:t>
       </w:r>
     </w:p>
     <w:p>
@@ -126,18 +144,59 @@
       </w:pPr>
       <w:r>
         <w:rPr>
+          <w:b/>
+          <w:color w:val="000000"/>
+        </w:rPr>
+        <w:t>Grupo N.º: 3</w:t>
+      </w:r>
+    </w:p>
+    <w:p>
+      <w:pPr>
+        <w:spacing w:after="0"/>
+        <w:jc w:val="center"/>
+      </w:pPr>
+      <w:r>
+        <w:rPr>
+          <w:b/>
+          <w:color w:val="000000"/>
+        </w:rPr>
+        <w:t>Integrantes (rol):</w:t>
+      </w:r>
+    </w:p>
+    <w:p>
+      <w:pPr>
+        <w:spacing w:after="0"/>
+        <w:jc w:val="center"/>
+      </w:pPr>
+      <w:r>
+        <w:rPr>
+          <w:color w:val="000000"/>
           <w:sz w:val="22"/>
         </w:rPr>
+        <w:t>1. Oscco Zarabia Rider Gilmar (Coordinación, renderizado y plano cartesiano, repositorio e informe)</w:t>
+      </w:r>
+    </w:p>
+    <w:p>
+      <w:pPr>
+        <w:spacing w:after="0"/>
+        <w:jc w:val="center"/>
+      </w:pPr>
+      <w:r>
+        <w:rPr>
+          <w:color w:val="000000"/>
+          <w:sz w:val="22"/>
+        </w:rPr>
         <w:t>2. Vargas Alhuay Hernan (Núcleo matemático (matrices y composición) y pruebas)</w:t>
       </w:r>
     </w:p>
     <w:p>
       <w:pPr>
-        <w:spacing w:after="40"/>
+        <w:spacing w:after="0"/>
         <w:jc w:val="center"/>
       </w:pPr>
       <w:r>
         <w:rPr>
+          <w:color w:val="000000"/>
           <w:sz w:val="22"/>
         </w:rPr>
         <w:t>3. Chilingano Lazo Albert (Interfaz, validación, explicaciones, manual de usuario y video)</w:t>
@@ -145,31 +204,45 @@
     </w:p>
     <w:p>
       <w:pPr>
-        <w:spacing w:after="400" w:line="240" w:lineRule="auto"/>
-      </w:pPr>
-    </w:p>
-    <w:p>
-      <w:pPr>
+        <w:spacing w:after="80" w:line="240" w:lineRule="auto"/>
+      </w:pPr>
+    </w:p>
+    <w:p>
+      <w:pPr>
+        <w:spacing w:after="0"/>
         <w:jc w:val="center"/>
       </w:pPr>
       <w:r>
-        <w:t>Docente: Mtro. Jhamer Anderson Rojas Silva</w:t>
-      </w:r>
-    </w:p>
-    <w:p>
-      <w:pPr>
-        <w:spacing w:after="800" w:line="240" w:lineRule="auto"/>
-      </w:pPr>
-    </w:p>
-    <w:p>
-      <w:pPr>
+        <w:rPr>
+          <w:b/>
+          <w:color w:val="000000"/>
+        </w:rPr>
+        <w:t>Docente:</w:t>
+      </w:r>
+    </w:p>
+    <w:p>
+      <w:pPr>
+        <w:spacing w:after="280"/>
         <w:jc w:val="center"/>
       </w:pPr>
       <w:r>
         <w:rPr>
+          <w:color w:val="000000"/>
+        </w:rPr>
+        <w:t>Mtro. Jhamer Anderson Rojas Silva</w:t>
+      </w:r>
+    </w:p>
+    <w:p>
+      <w:pPr>
+        <w:spacing w:after="0"/>
+        <w:jc w:val="center"/>
+      </w:pPr>
+      <w:r>
+        <w:rPr>
           <w:b/>
-        </w:rPr>
-        <w:t>Andahuaylas, Perú · octubre de 2026</w:t>
+          <w:color w:val="000000"/>
+        </w:rPr>
+        <w:t>Andahuaylas, Perú, octubre de 2026</w:t>
       </w:r>
     </w:p>
     <w:p>
@@ -195,7 +268,7 @@
           <w:tab w:val="right" w:leader="dot" w:pos="9062"/>
         </w:tabs>
         <w:rPr>
-          <w:rFonts w:asciiTheme="minorHAnsi" w:eastAsiaTheme="minorEastAsia" w:hAnsiTheme="minorHAnsi"/>
+          <w:rFonts w:asciiTheme="minorHAnsi" w:eastAsiaTheme="minorEastAsia" w:hAnsiTheme="minorHAnsi" w:cstheme="minorBidi"/>
           <w:noProof/>
           <w:kern w:val="2"/>
           <w:szCs w:val="24"/>
@@ -212,7 +285,7 @@
       <w:r>
         <w:fldChar w:fldCharType="separate"/>
       </w:r>
-      <w:hyperlink w:anchor="_Toc243350484" w:history="1">
+      <w:hyperlink w:anchor="_Toc243401729" w:history="1">
         <w:r>
           <w:rPr>
             <w:rStyle w:val="Hipervnculo"/>
@@ -239,7 +312,7 @@
             <w:noProof/>
             <w:webHidden/>
           </w:rPr>
-          <w:instrText xml:space="preserve"> PAGEREF _Toc243350484 \h </w:instrText>
+          <w:instrText xml:space="preserve"> PAGEREF _Toc243401729 \h </w:instrText>
         </w:r>
         <w:r>
           <w:rPr>
@@ -277,7 +350,7 @@
           <w:tab w:val="right" w:leader="dot" w:pos="9062"/>
         </w:tabs>
         <w:rPr>
-          <w:rFonts w:asciiTheme="minorHAnsi" w:eastAsiaTheme="minorEastAsia" w:hAnsiTheme="minorHAnsi"/>
+          <w:rFonts w:asciiTheme="minorHAnsi" w:eastAsiaTheme="minorEastAsia" w:hAnsiTheme="minorHAnsi" w:cstheme="minorBidi"/>
           <w:noProof/>
           <w:kern w:val="2"/>
           <w:szCs w:val="24"/>
@@ -285,7 +358,7 @@
           <w14:ligatures w14:val="standardContextual"/>
         </w:rPr>
       </w:pPr>
-      <w:hyperlink w:anchor="_Toc243350485" w:history="1">
+      <w:hyperlink w:anchor="_Toc243401730" w:history="1">
         <w:r>
           <w:rPr>
             <w:rStyle w:val="Hipervnculo"/>
@@ -312,7 +385,7 @@
             <w:noProof/>
             <w:webHidden/>
           </w:rPr>
-          <w:instrText xml:space="preserve"> PAGEREF _Toc243350485 \h </w:instrText>
+          <w:instrText xml:space="preserve"> PAGEREF _Toc243401730 \h </w:instrText>
         </w:r>
         <w:r>
           <w:rPr>
@@ -350,7 +423,7 @@
           <w:tab w:val="right" w:leader="dot" w:pos="9062"/>
         </w:tabs>
         <w:rPr>
-          <w:rFonts w:asciiTheme="minorHAnsi" w:eastAsiaTheme="minorEastAsia" w:hAnsiTheme="minorHAnsi"/>
+          <w:rFonts w:asciiTheme="minorHAnsi" w:eastAsiaTheme="minorEastAsia" w:hAnsiTheme="minorHAnsi" w:cstheme="minorBidi"/>
           <w:noProof/>
           <w:kern w:val="2"/>
           <w:szCs w:val="24"/>
@@ -358,7 +431,7 @@
           <w14:ligatures w14:val="standardContextual"/>
         </w:rPr>
       </w:pPr>
-      <w:hyperlink w:anchor="_Toc243350486" w:history="1">
+      <w:hyperlink w:anchor="_Toc243401731" w:history="1">
         <w:r>
           <w:rPr>
             <w:rStyle w:val="Hipervnculo"/>
@@ -385,7 +458,7 @@
             <w:noProof/>
             <w:webHidden/>
           </w:rPr>
-          <w:instrText xml:space="preserve"> PAGEREF _Toc243350486 \h </w:instrText>
+          <w:instrText xml:space="preserve"> PAGEREF _Toc243401731 \h </w:instrText>
         </w:r>
         <w:r>
           <w:rPr>
@@ -423,7 +496,7 @@
           <w:tab w:val="right" w:leader="dot" w:pos="9062"/>
         </w:tabs>
         <w:rPr>
-          <w:rFonts w:asciiTheme="minorHAnsi" w:eastAsiaTheme="minorEastAsia" w:hAnsiTheme="minorHAnsi"/>
+          <w:rFonts w:asciiTheme="minorHAnsi" w:eastAsiaTheme="minorEastAsia" w:hAnsiTheme="minorHAnsi" w:cstheme="minorBidi"/>
           <w:noProof/>
           <w:kern w:val="2"/>
           <w:szCs w:val="24"/>
@@ -431,7 +504,7 @@
           <w14:ligatures w14:val="standardContextual"/>
         </w:rPr>
       </w:pPr>
-      <w:hyperlink w:anchor="_Toc243350487" w:history="1">
+      <w:hyperlink w:anchor="_Toc243401732" w:history="1">
         <w:r>
           <w:rPr>
             <w:rStyle w:val="Hipervnculo"/>
@@ -458,7 +531,7 @@
             <w:noProof/>
             <w:webHidden/>
           </w:rPr>
-          <w:instrText xml:space="preserve"> PAGEREF _Toc243350487 \h </w:instrText>
+          <w:instrText xml:space="preserve"> PAGEREF _Toc243401732 \h </w:instrText>
         </w:r>
         <w:r>
           <w:rPr>
@@ -496,7 +569,7 @@
           <w:tab w:val="right" w:leader="dot" w:pos="9062"/>
         </w:tabs>
         <w:rPr>
-          <w:rFonts w:asciiTheme="minorHAnsi" w:eastAsiaTheme="minorEastAsia" w:hAnsiTheme="minorHAnsi"/>
+          <w:rFonts w:asciiTheme="minorHAnsi" w:eastAsiaTheme="minorEastAsia" w:hAnsiTheme="minorHAnsi" w:cstheme="minorBidi"/>
           <w:noProof/>
           <w:kern w:val="2"/>
           <w:szCs w:val="24"/>
@@ -504,7 +577,7 @@
           <w14:ligatures w14:val="standardContextual"/>
         </w:rPr>
       </w:pPr>
-      <w:hyperlink w:anchor="_Toc243350488" w:history="1">
+      <w:hyperlink w:anchor="_Toc243401733" w:history="1">
         <w:r>
           <w:rPr>
             <w:rStyle w:val="Hipervnculo"/>
@@ -531,7 +604,7 @@
             <w:noProof/>
             <w:webHidden/>
           </w:rPr>
-          <w:instrText xml:space="preserve"> PAGEREF _Toc243350488 \h </w:instrText>
+          <w:instrText xml:space="preserve"> PAGEREF _Toc243401733 \h </w:instrText>
         </w:r>
         <w:r>
           <w:rPr>
@@ -569,7 +642,7 @@
           <w:tab w:val="right" w:leader="dot" w:pos="9062"/>
         </w:tabs>
         <w:rPr>
-          <w:rFonts w:asciiTheme="minorHAnsi" w:eastAsiaTheme="minorEastAsia" w:hAnsiTheme="minorHAnsi"/>
+          <w:rFonts w:asciiTheme="minorHAnsi" w:eastAsiaTheme="minorEastAsia" w:hAnsiTheme="minorHAnsi" w:cstheme="minorBidi"/>
           <w:noProof/>
           <w:kern w:val="2"/>
           <w:szCs w:val="24"/>
@@ -577,7 +650,7 @@
           <w14:ligatures w14:val="standardContextual"/>
         </w:rPr>
       </w:pPr>
-      <w:hyperlink w:anchor="_Toc243350489" w:history="1">
+      <w:hyperlink w:anchor="_Toc243401734" w:history="1">
         <w:r>
           <w:rPr>
             <w:rStyle w:val="Hipervnculo"/>
@@ -604,7 +677,7 @@
             <w:noProof/>
             <w:webHidden/>
           </w:rPr>
-          <w:instrText xml:space="preserve"> PAGEREF _Toc243350489 \h </w:instrText>
+          <w:instrText xml:space="preserve"> PAGEREF _Toc243401734 \h </w:instrText>
         </w:r>
         <w:r>
           <w:rPr>
@@ -642,7 +715,7 @@
           <w:tab w:val="right" w:leader="dot" w:pos="9062"/>
         </w:tabs>
         <w:rPr>
-          <w:rFonts w:asciiTheme="minorHAnsi" w:eastAsiaTheme="minorEastAsia" w:hAnsiTheme="minorHAnsi"/>
+          <w:rFonts w:asciiTheme="minorHAnsi" w:eastAsiaTheme="minorEastAsia" w:hAnsiTheme="minorHAnsi" w:cstheme="minorBidi"/>
           <w:noProof/>
           <w:kern w:val="2"/>
           <w:szCs w:val="24"/>
@@ -650,7 +723,7 @@
           <w14:ligatures w14:val="standardContextual"/>
         </w:rPr>
       </w:pPr>
-      <w:hyperlink w:anchor="_Toc243350490" w:history="1">
+      <w:hyperlink w:anchor="_Toc243401735" w:history="1">
         <w:r>
           <w:rPr>
             <w:rStyle w:val="Hipervnculo"/>
@@ -677,7 +750,7 @@
             <w:noProof/>
             <w:webHidden/>
           </w:rPr>
-          <w:instrText xml:space="preserve"> PAGEREF _Toc243350490 \h </w:instrText>
+          <w:instrText xml:space="preserve"> PAGEREF _Toc243401735 \h </w:instrText>
         </w:r>
         <w:r>
           <w:rPr>
@@ -715,7 +788,7 @@
           <w:tab w:val="right" w:leader="dot" w:pos="9062"/>
         </w:tabs>
         <w:rPr>
-          <w:rFonts w:asciiTheme="minorHAnsi" w:eastAsiaTheme="minorEastAsia" w:hAnsiTheme="minorHAnsi"/>
+          <w:rFonts w:asciiTheme="minorHAnsi" w:eastAsiaTheme="minorEastAsia" w:hAnsiTheme="minorHAnsi" w:cstheme="minorBidi"/>
           <w:noProof/>
           <w:kern w:val="2"/>
           <w:szCs w:val="24"/>
@@ -723,7 +796,7 @@
           <w14:ligatures w14:val="standardContextual"/>
         </w:rPr>
       </w:pPr>
-      <w:hyperlink w:anchor="_Toc243350491" w:history="1">
+      <w:hyperlink w:anchor="_Toc243401736" w:history="1">
         <w:r>
           <w:rPr>
             <w:rStyle w:val="Hipervnculo"/>
@@ -750,7 +823,7 @@
             <w:noProof/>
             <w:webHidden/>
           </w:rPr>
-          <w:instrText xml:space="preserve"> PAGEREF _Toc243350491 \h </w:instrText>
+          <w:instrText xml:space="preserve"> PAGEREF _Toc243401736 \h </w:instrText>
         </w:r>
         <w:r>
           <w:rPr>
@@ -788,7 +861,7 @@
           <w:tab w:val="right" w:leader="dot" w:pos="9062"/>
         </w:tabs>
         <w:rPr>
-          <w:rFonts w:asciiTheme="minorHAnsi" w:eastAsiaTheme="minorEastAsia" w:hAnsiTheme="minorHAnsi"/>
+          <w:rFonts w:asciiTheme="minorHAnsi" w:eastAsiaTheme="minorEastAsia" w:hAnsiTheme="minorHAnsi" w:cstheme="minorBidi"/>
           <w:noProof/>
           <w:kern w:val="2"/>
           <w:szCs w:val="24"/>
@@ -796,7 +869,7 @@
           <w14:ligatures w14:val="standardContextual"/>
         </w:rPr>
       </w:pPr>
-      <w:hyperlink w:anchor="_Toc243350492" w:history="1">
+      <w:hyperlink w:anchor="_Toc243401737" w:history="1">
         <w:r>
           <w:rPr>
             <w:rStyle w:val="Hipervnculo"/>
@@ -823,7 +896,7 @@
             <w:noProof/>
             <w:webHidden/>
           </w:rPr>
-          <w:instrText xml:space="preserve"> PAGEREF _Toc243350492 \h </w:instrText>
+          <w:instrText xml:space="preserve"> PAGEREF _Toc243401737 \h </w:instrText>
         </w:r>
         <w:r>
           <w:rPr>
@@ -861,7 +934,7 @@
           <w:tab w:val="right" w:leader="dot" w:pos="9062"/>
         </w:tabs>
         <w:rPr>
-          <w:rFonts w:asciiTheme="minorHAnsi" w:eastAsiaTheme="minorEastAsia" w:hAnsiTheme="minorHAnsi"/>
+          <w:rFonts w:asciiTheme="minorHAnsi" w:eastAsiaTheme="minorEastAsia" w:hAnsiTheme="minorHAnsi" w:cstheme="minorBidi"/>
           <w:noProof/>
           <w:kern w:val="2"/>
           <w:szCs w:val="24"/>
@@ -869,7 +942,7 @@
           <w14:ligatures w14:val="standardContextual"/>
         </w:rPr>
       </w:pPr>
-      <w:hyperlink w:anchor="_Toc243350493" w:history="1">
+      <w:hyperlink w:anchor="_Toc243401738" w:history="1">
         <w:r>
           <w:rPr>
             <w:rStyle w:val="Hipervnculo"/>
@@ -896,7 +969,7 @@
             <w:noProof/>
             <w:webHidden/>
           </w:rPr>
-          <w:instrText xml:space="preserve"> PAGEREF _Toc243350493 \h </w:instrText>
+          <w:instrText xml:space="preserve"> PAGEREF _Toc243401738 \h </w:instrText>
         </w:r>
         <w:r>
           <w:rPr>
@@ -934,7 +1007,7 @@
           <w:tab w:val="right" w:leader="dot" w:pos="9062"/>
         </w:tabs>
         <w:rPr>
-          <w:rFonts w:asciiTheme="minorHAnsi" w:eastAsiaTheme="minorEastAsia" w:hAnsiTheme="minorHAnsi"/>
+          <w:rFonts w:asciiTheme="minorHAnsi" w:eastAsiaTheme="minorEastAsia" w:hAnsiTheme="minorHAnsi" w:cstheme="minorBidi"/>
           <w:noProof/>
           <w:kern w:val="2"/>
           <w:szCs w:val="24"/>
@@ -942,7 +1015,7 @@
           <w14:ligatures w14:val="standardContextual"/>
         </w:rPr>
       </w:pPr>
-      <w:hyperlink w:anchor="_Toc243350494" w:history="1">
+      <w:hyperlink w:anchor="_Toc243401739" w:history="1">
         <w:r>
           <w:rPr>
             <w:rStyle w:val="Hipervnculo"/>
@@ -969,7 +1042,7 @@
             <w:noProof/>
             <w:webHidden/>
           </w:rPr>
-          <w:instrText xml:space="preserve"> PAGEREF _Toc243350494 \h </w:instrText>
+          <w:instrText xml:space="preserve"> PAGEREF _Toc243401739 \h </w:instrText>
         </w:r>
         <w:r>
           <w:rPr>
@@ -989,7 +1062,7 @@
             <w:noProof/>
             <w:webHidden/>
           </w:rPr>
-          <w:t>7</w:t>
+          <w:t>6</w:t>
         </w:r>
         <w:r>
           <w:rPr>
@@ -1007,7 +1080,7 @@
           <w:tab w:val="right" w:leader="dot" w:pos="9062"/>
         </w:tabs>
         <w:rPr>
-          <w:rFonts w:asciiTheme="minorHAnsi" w:eastAsiaTheme="minorEastAsia" w:hAnsiTheme="minorHAnsi"/>
+          <w:rFonts w:asciiTheme="minorHAnsi" w:eastAsiaTheme="minorEastAsia" w:hAnsiTheme="minorHAnsi" w:cstheme="minorBidi"/>
           <w:noProof/>
           <w:kern w:val="2"/>
           <w:szCs w:val="24"/>
@@ -1015,7 +1088,7 @@
           <w14:ligatures w14:val="standardContextual"/>
         </w:rPr>
       </w:pPr>
-      <w:hyperlink w:anchor="_Toc243350495" w:history="1">
+      <w:hyperlink w:anchor="_Toc243401740" w:history="1">
         <w:r>
           <w:rPr>
             <w:rStyle w:val="Hipervnculo"/>
@@ -1042,7 +1115,7 @@
             <w:noProof/>
             <w:webHidden/>
           </w:rPr>
-          <w:instrText xml:space="preserve"> PAGEREF _Toc243350495 \h </w:instrText>
+          <w:instrText xml:space="preserve"> PAGEREF _Toc243401740 \h </w:instrText>
         </w:r>
         <w:r>
           <w:rPr>
@@ -1080,7 +1153,7 @@
           <w:tab w:val="right" w:leader="dot" w:pos="9062"/>
         </w:tabs>
         <w:rPr>
-          <w:rFonts w:asciiTheme="minorHAnsi" w:eastAsiaTheme="minorEastAsia" w:hAnsiTheme="minorHAnsi"/>
+          <w:rFonts w:asciiTheme="minorHAnsi" w:eastAsiaTheme="minorEastAsia" w:hAnsiTheme="minorHAnsi" w:cstheme="minorBidi"/>
           <w:noProof/>
           <w:kern w:val="2"/>
           <w:szCs w:val="24"/>
@@ -1088,7 +1161,7 @@
           <w14:ligatures w14:val="standardContextual"/>
         </w:rPr>
       </w:pPr>
-      <w:hyperlink w:anchor="_Toc243350496" w:history="1">
+      <w:hyperlink w:anchor="_Toc243401741" w:history="1">
         <w:r>
           <w:rPr>
             <w:rStyle w:val="Hipervnculo"/>
@@ -1115,7 +1188,7 @@
             <w:noProof/>
             <w:webHidden/>
           </w:rPr>
-          <w:instrText xml:space="preserve"> PAGEREF _Toc243350496 \h </w:instrText>
+          <w:instrText xml:space="preserve"> PAGEREF _Toc243401741 \h </w:instrText>
         </w:r>
         <w:r>
           <w:rPr>
@@ -1153,7 +1226,7 @@
           <w:tab w:val="right" w:leader="dot" w:pos="9062"/>
         </w:tabs>
         <w:rPr>
-          <w:rFonts w:asciiTheme="minorHAnsi" w:eastAsiaTheme="minorEastAsia" w:hAnsiTheme="minorHAnsi"/>
+          <w:rFonts w:asciiTheme="minorHAnsi" w:eastAsiaTheme="minorEastAsia" w:hAnsiTheme="minorHAnsi" w:cstheme="minorBidi"/>
           <w:noProof/>
           <w:kern w:val="2"/>
           <w:szCs w:val="24"/>
@@ -1161,7 +1234,7 @@
           <w14:ligatures w14:val="standardContextual"/>
         </w:rPr>
       </w:pPr>
-      <w:hyperlink w:anchor="_Toc243350497" w:history="1">
+      <w:hyperlink w:anchor="_Toc243401742" w:history="1">
         <w:r>
           <w:rPr>
             <w:rStyle w:val="Hipervnculo"/>
@@ -1188,7 +1261,7 @@
             <w:noProof/>
             <w:webHidden/>
           </w:rPr>
-          <w:instrText xml:space="preserve"> PAGEREF _Toc243350497 \h </w:instrText>
+          <w:instrText xml:space="preserve"> PAGEREF _Toc243401742 \h </w:instrText>
         </w:r>
         <w:r>
           <w:rPr>
@@ -1226,7 +1299,7 @@
           <w:tab w:val="right" w:leader="dot" w:pos="9062"/>
         </w:tabs>
         <w:rPr>
-          <w:rFonts w:asciiTheme="minorHAnsi" w:eastAsiaTheme="minorEastAsia" w:hAnsiTheme="minorHAnsi"/>
+          <w:rFonts w:asciiTheme="minorHAnsi" w:eastAsiaTheme="minorEastAsia" w:hAnsiTheme="minorHAnsi" w:cstheme="minorBidi"/>
           <w:noProof/>
           <w:kern w:val="2"/>
           <w:szCs w:val="24"/>
@@ -1234,7 +1307,7 @@
           <w14:ligatures w14:val="standardContextual"/>
         </w:rPr>
       </w:pPr>
-      <w:hyperlink w:anchor="_Toc243350498" w:history="1">
+      <w:hyperlink w:anchor="_Toc243401743" w:history="1">
         <w:r>
           <w:rPr>
             <w:rStyle w:val="Hipervnculo"/>
@@ -1261,7 +1334,7 @@
             <w:noProof/>
             <w:webHidden/>
           </w:rPr>
-          <w:instrText xml:space="preserve"> PAGEREF _Toc243350498 \h </w:instrText>
+          <w:instrText xml:space="preserve"> PAGEREF _Toc243401743 \h </w:instrText>
         </w:r>
         <w:r>
           <w:rPr>
@@ -1281,7 +1354,7 @@
             <w:noProof/>
             <w:webHidden/>
           </w:rPr>
-          <w:t>8</w:t>
+          <w:t>7</w:t>
         </w:r>
         <w:r>
           <w:rPr>
@@ -1299,7 +1372,7 @@
           <w:tab w:val="right" w:leader="dot" w:pos="9062"/>
         </w:tabs>
         <w:rPr>
-          <w:rFonts w:asciiTheme="minorHAnsi" w:eastAsiaTheme="minorEastAsia" w:hAnsiTheme="minorHAnsi"/>
+          <w:rFonts w:asciiTheme="minorHAnsi" w:eastAsiaTheme="minorEastAsia" w:hAnsiTheme="minorHAnsi" w:cstheme="minorBidi"/>
           <w:noProof/>
           <w:kern w:val="2"/>
           <w:szCs w:val="24"/>
@@ -1307,7 +1380,7 @@
           <w14:ligatures w14:val="standardContextual"/>
         </w:rPr>
       </w:pPr>
-      <w:hyperlink w:anchor="_Toc243350499" w:history="1">
+      <w:hyperlink w:anchor="_Toc243401744" w:history="1">
         <w:r>
           <w:rPr>
             <w:rStyle w:val="Hipervnculo"/>
@@ -1334,7 +1407,7 @@
             <w:noProof/>
             <w:webHidden/>
           </w:rPr>
-          <w:instrText xml:space="preserve"> PAGEREF _Toc243350499 \h </w:instrText>
+          <w:instrText xml:space="preserve"> PAGEREF _Toc243401744 \h </w:instrText>
         </w:r>
         <w:r>
           <w:rPr>
@@ -1372,7 +1445,7 @@
           <w:tab w:val="right" w:leader="dot" w:pos="9062"/>
         </w:tabs>
         <w:rPr>
-          <w:rFonts w:asciiTheme="minorHAnsi" w:eastAsiaTheme="minorEastAsia" w:hAnsiTheme="minorHAnsi"/>
+          <w:rFonts w:asciiTheme="minorHAnsi" w:eastAsiaTheme="minorEastAsia" w:hAnsiTheme="minorHAnsi" w:cstheme="minorBidi"/>
           <w:noProof/>
           <w:kern w:val="2"/>
           <w:szCs w:val="24"/>
@@ -1380,7 +1453,7 @@
           <w14:ligatures w14:val="standardContextual"/>
         </w:rPr>
       </w:pPr>
-      <w:hyperlink w:anchor="_Toc243350500" w:history="1">
+      <w:hyperlink w:anchor="_Toc243401745" w:history="1">
         <w:r>
           <w:rPr>
             <w:rStyle w:val="Hipervnculo"/>
@@ -1407,7 +1480,7 @@
             <w:noProof/>
             <w:webHidden/>
           </w:rPr>
-          <w:instrText xml:space="preserve"> PAGEREF _Toc243350500 \h </w:instrText>
+          <w:instrText xml:space="preserve"> PAGEREF _Toc243401745 \h </w:instrText>
         </w:r>
         <w:r>
           <w:rPr>
@@ -1445,7 +1518,7 @@
           <w:tab w:val="right" w:leader="dot" w:pos="9062"/>
         </w:tabs>
         <w:rPr>
-          <w:rFonts w:asciiTheme="minorHAnsi" w:eastAsiaTheme="minorEastAsia" w:hAnsiTheme="minorHAnsi"/>
+          <w:rFonts w:asciiTheme="minorHAnsi" w:eastAsiaTheme="minorEastAsia" w:hAnsiTheme="minorHAnsi" w:cstheme="minorBidi"/>
           <w:noProof/>
           <w:kern w:val="2"/>
           <w:szCs w:val="24"/>
@@ -1453,7 +1526,7 @@
           <w14:ligatures w14:val="standardContextual"/>
         </w:rPr>
       </w:pPr>
-      <w:hyperlink w:anchor="_Toc243350501" w:history="1">
+      <w:hyperlink w:anchor="_Toc243401746" w:history="1">
         <w:r>
           <w:rPr>
             <w:rStyle w:val="Hipervnculo"/>
@@ -1480,7 +1553,7 @@
             <w:noProof/>
             <w:webHidden/>
           </w:rPr>
-          <w:instrText xml:space="preserve"> PAGEREF _Toc243350501 \h </w:instrText>
+          <w:instrText xml:space="preserve"> PAGEREF _Toc243401746 \h </w:instrText>
         </w:r>
         <w:r>
           <w:rPr>
@@ -1500,7 +1573,7 @@
             <w:noProof/>
             <w:webHidden/>
           </w:rPr>
-          <w:t>9</w:t>
+          <w:t>8</w:t>
         </w:r>
         <w:r>
           <w:rPr>
@@ -1518,7 +1591,7 @@
           <w:tab w:val="right" w:leader="dot" w:pos="9062"/>
         </w:tabs>
         <w:rPr>
-          <w:rFonts w:asciiTheme="minorHAnsi" w:eastAsiaTheme="minorEastAsia" w:hAnsiTheme="minorHAnsi"/>
+          <w:rFonts w:asciiTheme="minorHAnsi" w:eastAsiaTheme="minorEastAsia" w:hAnsiTheme="minorHAnsi" w:cstheme="minorBidi"/>
           <w:noProof/>
           <w:kern w:val="2"/>
           <w:szCs w:val="24"/>
@@ -1526,7 +1599,7 @@
           <w14:ligatures w14:val="standardContextual"/>
         </w:rPr>
       </w:pPr>
-      <w:hyperlink w:anchor="_Toc243350502" w:history="1">
+      <w:hyperlink w:anchor="_Toc243401747" w:history="1">
         <w:r>
           <w:rPr>
             <w:rStyle w:val="Hipervnculo"/>
@@ -1553,7 +1626,7 @@
             <w:noProof/>
             <w:webHidden/>
           </w:rPr>
-          <w:instrText xml:space="preserve"> PAGEREF _Toc243350502 \h </w:instrText>
+          <w:instrText xml:space="preserve"> PAGEREF _Toc243401747 \h </w:instrText>
         </w:r>
         <w:r>
           <w:rPr>
@@ -1573,7 +1646,7 @@
             <w:noProof/>
             <w:webHidden/>
           </w:rPr>
-          <w:t>10</w:t>
+          <w:t>9</w:t>
         </w:r>
         <w:r>
           <w:rPr>
@@ -1591,7 +1664,7 @@
           <w:tab w:val="right" w:leader="dot" w:pos="9062"/>
         </w:tabs>
         <w:rPr>
-          <w:rFonts w:asciiTheme="minorHAnsi" w:eastAsiaTheme="minorEastAsia" w:hAnsiTheme="minorHAnsi"/>
+          <w:rFonts w:asciiTheme="minorHAnsi" w:eastAsiaTheme="minorEastAsia" w:hAnsiTheme="minorHAnsi" w:cstheme="minorBidi"/>
           <w:noProof/>
           <w:kern w:val="2"/>
           <w:szCs w:val="24"/>
@@ -1599,7 +1672,7 @@
           <w14:ligatures w14:val="standardContextual"/>
         </w:rPr>
       </w:pPr>
-      <w:hyperlink w:anchor="_Toc243350503" w:history="1">
+      <w:hyperlink w:anchor="_Toc243401748" w:history="1">
         <w:r>
           <w:rPr>
             <w:rStyle w:val="Hipervnculo"/>
@@ -1626,7 +1699,7 @@
             <w:noProof/>
             <w:webHidden/>
           </w:rPr>
-          <w:instrText xml:space="preserve"> PAGEREF _Toc243350503 \h </w:instrText>
+          <w:instrText xml:space="preserve"> PAGEREF _Toc243401748 \h </w:instrText>
         </w:r>
         <w:r>
           <w:rPr>
@@ -1646,7 +1719,7 @@
             <w:noProof/>
             <w:webHidden/>
           </w:rPr>
-          <w:t>10</w:t>
+          <w:t>9</w:t>
         </w:r>
         <w:r>
           <w:rPr>
@@ -1664,7 +1737,7 @@
           <w:tab w:val="right" w:leader="dot" w:pos="9062"/>
         </w:tabs>
         <w:rPr>
-          <w:rFonts w:asciiTheme="minorHAnsi" w:eastAsiaTheme="minorEastAsia" w:hAnsiTheme="minorHAnsi"/>
+          <w:rFonts w:asciiTheme="minorHAnsi" w:eastAsiaTheme="minorEastAsia" w:hAnsiTheme="minorHAnsi" w:cstheme="minorBidi"/>
           <w:noProof/>
           <w:kern w:val="2"/>
           <w:szCs w:val="24"/>
@@ -1672,7 +1745,7 @@
           <w14:ligatures w14:val="standardContextual"/>
         </w:rPr>
       </w:pPr>
-      <w:hyperlink w:anchor="_Toc243350504" w:history="1">
+      <w:hyperlink w:anchor="_Toc243401749" w:history="1">
         <w:r>
           <w:rPr>
             <w:rStyle w:val="Hipervnculo"/>
@@ -1699,7 +1772,7 @@
             <w:noProof/>
             <w:webHidden/>
           </w:rPr>
-          <w:instrText xml:space="preserve"> PAGEREF _Toc243350504 \h </w:instrText>
+          <w:instrText xml:space="preserve"> PAGEREF _Toc243401749 \h </w:instrText>
         </w:r>
         <w:r>
           <w:rPr>
@@ -1719,7 +1792,7 @@
             <w:noProof/>
             <w:webHidden/>
           </w:rPr>
-          <w:t>11</w:t>
+          <w:t>10</w:t>
         </w:r>
         <w:r>
           <w:rPr>
@@ -1737,7 +1810,7 @@
           <w:tab w:val="right" w:leader="dot" w:pos="9062"/>
         </w:tabs>
         <w:rPr>
-          <w:rFonts w:asciiTheme="minorHAnsi" w:eastAsiaTheme="minorEastAsia" w:hAnsiTheme="minorHAnsi"/>
+          <w:rFonts w:asciiTheme="minorHAnsi" w:eastAsiaTheme="minorEastAsia" w:hAnsiTheme="minorHAnsi" w:cstheme="minorBidi"/>
           <w:noProof/>
           <w:kern w:val="2"/>
           <w:szCs w:val="24"/>
@@ -1745,7 +1818,7 @@
           <w14:ligatures w14:val="standardContextual"/>
         </w:rPr>
       </w:pPr>
-      <w:hyperlink w:anchor="_Toc243350505" w:history="1">
+      <w:hyperlink w:anchor="_Toc243401750" w:history="1">
         <w:r>
           <w:rPr>
             <w:rStyle w:val="Hipervnculo"/>
@@ -1772,7 +1845,7 @@
             <w:noProof/>
             <w:webHidden/>
           </w:rPr>
-          <w:instrText xml:space="preserve"> PAGEREF _Toc243350505 \h </w:instrText>
+          <w:instrText xml:space="preserve"> PAGEREF _Toc243401750 \h </w:instrText>
         </w:r>
         <w:r>
           <w:rPr>
@@ -1792,7 +1865,7 @@
             <w:noProof/>
             <w:webHidden/>
           </w:rPr>
-          <w:t>11</w:t>
+          <w:t>10</w:t>
         </w:r>
         <w:r>
           <w:rPr>
@@ -1810,7 +1883,7 @@
           <w:tab w:val="right" w:leader="dot" w:pos="9062"/>
         </w:tabs>
         <w:rPr>
-          <w:rFonts w:asciiTheme="minorHAnsi" w:eastAsiaTheme="minorEastAsia" w:hAnsiTheme="minorHAnsi"/>
+          <w:rFonts w:asciiTheme="minorHAnsi" w:eastAsiaTheme="minorEastAsia" w:hAnsiTheme="minorHAnsi" w:cstheme="minorBidi"/>
           <w:noProof/>
           <w:kern w:val="2"/>
           <w:szCs w:val="24"/>
@@ -1818,7 +1891,7 @@
           <w14:ligatures w14:val="standardContextual"/>
         </w:rPr>
       </w:pPr>
-      <w:hyperlink w:anchor="_Toc243350506" w:history="1">
+      <w:hyperlink w:anchor="_Toc243401751" w:history="1">
         <w:r>
           <w:rPr>
             <w:rStyle w:val="Hipervnculo"/>
@@ -1845,7 +1918,7 @@
             <w:noProof/>
             <w:webHidden/>
           </w:rPr>
-          <w:instrText xml:space="preserve"> PAGEREF _Toc243350506 \h </w:instrText>
+          <w:instrText xml:space="preserve"> PAGEREF _Toc243401751 \h </w:instrText>
         </w:r>
         <w:r>
           <w:rPr>
@@ -1865,7 +1938,7 @@
             <w:noProof/>
             <w:webHidden/>
           </w:rPr>
-          <w:t>11</w:t>
+          <w:t>10</w:t>
         </w:r>
         <w:r>
           <w:rPr>
@@ -1883,7 +1956,7 @@
           <w:tab w:val="right" w:leader="dot" w:pos="9062"/>
         </w:tabs>
         <w:rPr>
-          <w:rFonts w:asciiTheme="minorHAnsi" w:eastAsiaTheme="minorEastAsia" w:hAnsiTheme="minorHAnsi"/>
+          <w:rFonts w:asciiTheme="minorHAnsi" w:eastAsiaTheme="minorEastAsia" w:hAnsiTheme="minorHAnsi" w:cstheme="minorBidi"/>
           <w:noProof/>
           <w:kern w:val="2"/>
           <w:szCs w:val="24"/>
@@ -1891,7 +1964,7 @@
           <w14:ligatures w14:val="standardContextual"/>
         </w:rPr>
       </w:pPr>
-      <w:hyperlink w:anchor="_Toc243350507" w:history="1">
+      <w:hyperlink w:anchor="_Toc243401752" w:history="1">
         <w:r>
           <w:rPr>
             <w:rStyle w:val="Hipervnculo"/>
@@ -1918,7 +1991,7 @@
             <w:noProof/>
             <w:webHidden/>
           </w:rPr>
-          <w:instrText xml:space="preserve"> PAGEREF _Toc243350507 \h </w:instrText>
+          <w:instrText xml:space="preserve"> PAGEREF _Toc243401752 \h </w:instrText>
         </w:r>
         <w:r>
           <w:rPr>
@@ -1956,7 +2029,7 @@
           <w:tab w:val="right" w:leader="dot" w:pos="9062"/>
         </w:tabs>
         <w:rPr>
-          <w:rFonts w:asciiTheme="minorHAnsi" w:eastAsiaTheme="minorEastAsia" w:hAnsiTheme="minorHAnsi"/>
+          <w:rFonts w:asciiTheme="minorHAnsi" w:eastAsiaTheme="minorEastAsia" w:hAnsiTheme="minorHAnsi" w:cstheme="minorBidi"/>
           <w:noProof/>
           <w:kern w:val="2"/>
           <w:szCs w:val="24"/>
@@ -1964,7 +2037,7 @@
           <w14:ligatures w14:val="standardContextual"/>
         </w:rPr>
       </w:pPr>
-      <w:hyperlink w:anchor="_Toc243350508" w:history="1">
+      <w:hyperlink w:anchor="_Toc243401753" w:history="1">
         <w:r>
           <w:rPr>
             <w:rStyle w:val="Hipervnculo"/>
@@ -1991,7 +2064,7 @@
             <w:noProof/>
             <w:webHidden/>
           </w:rPr>
-          <w:instrText xml:space="preserve"> PAGEREF _Toc243350508 \h </w:instrText>
+          <w:instrText xml:space="preserve"> PAGEREF _Toc243401753 \h </w:instrText>
         </w:r>
         <w:r>
           <w:rPr>
@@ -2029,7 +2102,7 @@
           <w:tab w:val="right" w:leader="dot" w:pos="9062"/>
         </w:tabs>
         <w:rPr>
-          <w:rFonts w:asciiTheme="minorHAnsi" w:eastAsiaTheme="minorEastAsia" w:hAnsiTheme="minorHAnsi"/>
+          <w:rFonts w:asciiTheme="minorHAnsi" w:eastAsiaTheme="minorEastAsia" w:hAnsiTheme="minorHAnsi" w:cstheme="minorBidi"/>
           <w:noProof/>
           <w:kern w:val="2"/>
           <w:szCs w:val="24"/>
@@ -2037,7 +2110,7 @@
           <w14:ligatures w14:val="standardContextual"/>
         </w:rPr>
       </w:pPr>
-      <w:hyperlink w:anchor="_Toc243350509" w:history="1">
+      <w:hyperlink w:anchor="_Toc243401754" w:history="1">
         <w:r>
           <w:rPr>
             <w:rStyle w:val="Hipervnculo"/>
@@ -2064,7 +2137,7 @@
             <w:noProof/>
             <w:webHidden/>
           </w:rPr>
-          <w:instrText xml:space="preserve"> PAGEREF _Toc243350509 \h </w:instrText>
+          <w:instrText xml:space="preserve"> PAGEREF _Toc243401754 \h </w:instrText>
         </w:r>
         <w:r>
           <w:rPr>
@@ -2102,7 +2175,7 @@
           <w:tab w:val="right" w:leader="dot" w:pos="9062"/>
         </w:tabs>
         <w:rPr>
-          <w:rFonts w:asciiTheme="minorHAnsi" w:eastAsiaTheme="minorEastAsia" w:hAnsiTheme="minorHAnsi"/>
+          <w:rFonts w:asciiTheme="minorHAnsi" w:eastAsiaTheme="minorEastAsia" w:hAnsiTheme="minorHAnsi" w:cstheme="minorBidi"/>
           <w:noProof/>
           <w:kern w:val="2"/>
           <w:szCs w:val="24"/>
@@ -2110,7 +2183,7 @@
           <w14:ligatures w14:val="standardContextual"/>
         </w:rPr>
       </w:pPr>
-      <w:hyperlink w:anchor="_Toc243350510" w:history="1">
+      <w:hyperlink w:anchor="_Toc243401755" w:history="1">
         <w:r>
           <w:rPr>
             <w:rStyle w:val="Hipervnculo"/>
@@ -2137,7 +2210,7 @@
             <w:noProof/>
             <w:webHidden/>
           </w:rPr>
-          <w:instrText xml:space="preserve"> PAGEREF _Toc243350510 \h </w:instrText>
+          <w:instrText xml:space="preserve"> PAGEREF _Toc243401755 \h </w:instrText>
         </w:r>
         <w:r>
           <w:rPr>
@@ -2175,7 +2248,7 @@
           <w:tab w:val="right" w:leader="dot" w:pos="9062"/>
         </w:tabs>
         <w:rPr>
-          <w:rFonts w:asciiTheme="minorHAnsi" w:eastAsiaTheme="minorEastAsia" w:hAnsiTheme="minorHAnsi"/>
+          <w:rFonts w:asciiTheme="minorHAnsi" w:eastAsiaTheme="minorEastAsia" w:hAnsiTheme="minorHAnsi" w:cstheme="minorBidi"/>
           <w:noProof/>
           <w:kern w:val="2"/>
           <w:szCs w:val="24"/>
@@ -2183,7 +2256,7 @@
           <w14:ligatures w14:val="standardContextual"/>
         </w:rPr>
       </w:pPr>
-      <w:hyperlink w:anchor="_Toc243350511" w:history="1">
+      <w:hyperlink w:anchor="_Toc243401756" w:history="1">
         <w:r>
           <w:rPr>
             <w:rStyle w:val="Hipervnculo"/>
@@ -2210,7 +2283,7 @@
             <w:noProof/>
             <w:webHidden/>
           </w:rPr>
-          <w:instrText xml:space="preserve"> PAGEREF _Toc243350511 \h </w:instrText>
+          <w:instrText xml:space="preserve"> PAGEREF _Toc243401756 \h </w:instrText>
         </w:r>
         <w:r>
           <w:rPr>
@@ -2248,7 +2321,7 @@
           <w:tab w:val="right" w:leader="dot" w:pos="9062"/>
         </w:tabs>
         <w:rPr>
-          <w:rFonts w:asciiTheme="minorHAnsi" w:eastAsiaTheme="minorEastAsia" w:hAnsiTheme="minorHAnsi"/>
+          <w:rFonts w:asciiTheme="minorHAnsi" w:eastAsiaTheme="minorEastAsia" w:hAnsiTheme="minorHAnsi" w:cstheme="minorBidi"/>
           <w:noProof/>
           <w:kern w:val="2"/>
           <w:szCs w:val="24"/>
@@ -2256,7 +2329,7 @@
           <w14:ligatures w14:val="standardContextual"/>
         </w:rPr>
       </w:pPr>
-      <w:hyperlink w:anchor="_Toc243350512" w:history="1">
+      <w:hyperlink w:anchor="_Toc243401757" w:history="1">
         <w:r>
           <w:rPr>
             <w:rStyle w:val="Hipervnculo"/>
@@ -2283,7 +2356,7 @@
             <w:noProof/>
             <w:webHidden/>
           </w:rPr>
-          <w:instrText xml:space="preserve"> PAGEREF _Toc243350512 \h </w:instrText>
+          <w:instrText xml:space="preserve"> PAGEREF _Toc243401757 \h </w:instrText>
         </w:r>
         <w:r>
           <w:rPr>
@@ -2321,7 +2394,7 @@
           <w:tab w:val="right" w:leader="dot" w:pos="9062"/>
         </w:tabs>
         <w:rPr>
-          <w:rFonts w:asciiTheme="minorHAnsi" w:eastAsiaTheme="minorEastAsia" w:hAnsiTheme="minorHAnsi"/>
+          <w:rFonts w:asciiTheme="minorHAnsi" w:eastAsiaTheme="minorEastAsia" w:hAnsiTheme="minorHAnsi" w:cstheme="minorBidi"/>
           <w:noProof/>
           <w:kern w:val="2"/>
           <w:szCs w:val="24"/>
@@ -2329,7 +2402,7 @@
           <w14:ligatures w14:val="standardContextual"/>
         </w:rPr>
       </w:pPr>
-      <w:hyperlink w:anchor="_Toc243350513" w:history="1">
+      <w:hyperlink w:anchor="_Toc243401758" w:history="1">
         <w:r>
           <w:rPr>
             <w:rStyle w:val="Hipervnculo"/>
@@ -2356,7 +2429,7 @@
             <w:noProof/>
             <w:webHidden/>
           </w:rPr>
-          <w:instrText xml:space="preserve"> PAGEREF _Toc243350513 \h </w:instrText>
+          <w:instrText xml:space="preserve"> PAGEREF _Toc243401758 \h </w:instrText>
         </w:r>
         <w:r>
           <w:rPr>
@@ -2394,7 +2467,7 @@
           <w:tab w:val="right" w:leader="dot" w:pos="9062"/>
         </w:tabs>
         <w:rPr>
-          <w:rFonts w:asciiTheme="minorHAnsi" w:eastAsiaTheme="minorEastAsia" w:hAnsiTheme="minorHAnsi"/>
+          <w:rFonts w:asciiTheme="minorHAnsi" w:eastAsiaTheme="minorEastAsia" w:hAnsiTheme="minorHAnsi" w:cstheme="minorBidi"/>
           <w:noProof/>
           <w:kern w:val="2"/>
           <w:szCs w:val="24"/>
@@ -2402,7 +2475,7 @@
           <w14:ligatures w14:val="standardContextual"/>
         </w:rPr>
       </w:pPr>
-      <w:hyperlink w:anchor="_Toc243350514" w:history="1">
+      <w:hyperlink w:anchor="_Toc243401759" w:history="1">
         <w:r>
           <w:rPr>
             <w:rStyle w:val="Hipervnculo"/>
@@ -2429,7 +2502,7 @@
             <w:noProof/>
             <w:webHidden/>
           </w:rPr>
-          <w:instrText xml:space="preserve"> PAGEREF _Toc243350514 \h </w:instrText>
+          <w:instrText xml:space="preserve"> PAGEREF _Toc243401759 \h </w:instrText>
         </w:r>
         <w:r>
           <w:rPr>
@@ -2462,12 +2535,12 @@
     </w:p>
     <w:p>
       <w:pPr>
-        <w:pStyle w:val="TDC1"/>
+        <w:pStyle w:val="TDC2"/>
         <w:tabs>
           <w:tab w:val="right" w:leader="dot" w:pos="9062"/>
         </w:tabs>
         <w:rPr>
-          <w:rFonts w:asciiTheme="minorHAnsi" w:eastAsiaTheme="minorEastAsia" w:hAnsiTheme="minorHAnsi"/>
+          <w:rFonts w:asciiTheme="minorHAnsi" w:eastAsiaTheme="minorEastAsia" w:hAnsiTheme="minorHAnsi" w:cstheme="minorBidi"/>
           <w:noProof/>
           <w:kern w:val="2"/>
           <w:szCs w:val="24"/>
@@ -2475,13 +2548,13 @@
           <w14:ligatures w14:val="standardContextual"/>
         </w:rPr>
       </w:pPr>
-      <w:hyperlink w:anchor="_Toc243350515" w:history="1">
+      <w:hyperlink w:anchor="_Toc243401760" w:history="1">
         <w:r>
           <w:rPr>
             <w:rStyle w:val="Hipervnculo"/>
             <w:noProof/>
           </w:rPr>
-          <w:t>9. Conclusiones y trabajo futuro (avance)</w:t>
+          <w:t>8.1 Beneficiario y actividad</w:t>
         </w:r>
         <w:r>
           <w:rPr>
@@ -2502,7 +2575,7 @@
             <w:noProof/>
             <w:webHidden/>
           </w:rPr>
-          <w:instrText xml:space="preserve"> PAGEREF _Toc243350515 \h </w:instrText>
+          <w:instrText xml:space="preserve"> PAGEREF _Toc243401760 \h </w:instrText>
         </w:r>
         <w:r>
           <w:rPr>
@@ -2522,7 +2595,7 @@
             <w:noProof/>
             <w:webHidden/>
           </w:rPr>
-          <w:t>19</w:t>
+          <w:t>18</w:t>
         </w:r>
         <w:r>
           <w:rPr>
@@ -2535,12 +2608,12 @@
     </w:p>
     <w:p>
       <w:pPr>
-        <w:pStyle w:val="TDC1"/>
+        <w:pStyle w:val="TDC2"/>
         <w:tabs>
           <w:tab w:val="right" w:leader="dot" w:pos="9062"/>
         </w:tabs>
         <w:rPr>
-          <w:rFonts w:asciiTheme="minorHAnsi" w:eastAsiaTheme="minorEastAsia" w:hAnsiTheme="minorHAnsi"/>
+          <w:rFonts w:asciiTheme="minorHAnsi" w:eastAsiaTheme="minorEastAsia" w:hAnsiTheme="minorHAnsi" w:cstheme="minorBidi"/>
           <w:noProof/>
           <w:kern w:val="2"/>
           <w:szCs w:val="24"/>
@@ -2548,13 +2621,13 @@
           <w14:ligatures w14:val="standardContextual"/>
         </w:rPr>
       </w:pPr>
-      <w:hyperlink w:anchor="_Toc243350516" w:history="1">
+      <w:hyperlink w:anchor="_Toc243401761" w:history="1">
         <w:r>
           <w:rPr>
             <w:rStyle w:val="Hipervnculo"/>
             <w:noProof/>
           </w:rPr>
-          <w:t>10. Referencias</w:t>
+          <w:t>8.2 Evidencias</w:t>
         </w:r>
         <w:r>
           <w:rPr>
@@ -2575,7 +2648,7 @@
             <w:noProof/>
             <w:webHidden/>
           </w:rPr>
-          <w:instrText xml:space="preserve"> PAGEREF _Toc243350516 \h </w:instrText>
+          <w:instrText xml:space="preserve"> PAGEREF _Toc243401761 \h </w:instrText>
         </w:r>
         <w:r>
           <w:rPr>
@@ -2608,12 +2681,12 @@
     </w:p>
     <w:p>
       <w:pPr>
-        <w:pStyle w:val="TDC1"/>
+        <w:pStyle w:val="TDC2"/>
         <w:tabs>
           <w:tab w:val="right" w:leader="dot" w:pos="9062"/>
         </w:tabs>
         <w:rPr>
-          <w:rFonts w:asciiTheme="minorHAnsi" w:eastAsiaTheme="minorEastAsia" w:hAnsiTheme="minorHAnsi"/>
+          <w:rFonts w:asciiTheme="minorHAnsi" w:eastAsiaTheme="minorEastAsia" w:hAnsiTheme="minorHAnsi" w:cstheme="minorBidi"/>
           <w:noProof/>
           <w:kern w:val="2"/>
           <w:szCs w:val="24"/>
@@ -2621,13 +2694,13 @@
           <w14:ligatures w14:val="standardContextual"/>
         </w:rPr>
       </w:pPr>
-      <w:hyperlink w:anchor="_Toc243350517" w:history="1">
+      <w:hyperlink w:anchor="_Toc243401762" w:history="1">
         <w:r>
           <w:rPr>
             <w:rStyle w:val="Hipervnculo"/>
             <w:noProof/>
           </w:rPr>
-          <w:t>11. Anexos (avance)</w:t>
+          <w:t>8.3 Resultados y siguiente etapa</w:t>
         </w:r>
         <w:r>
           <w:rPr>
@@ -2648,7 +2721,7 @@
             <w:noProof/>
             <w:webHidden/>
           </w:rPr>
-          <w:instrText xml:space="preserve"> PAGEREF _Toc243350517 \h </w:instrText>
+          <w:instrText xml:space="preserve"> PAGEREF _Toc243401762 \h </w:instrText>
         </w:r>
         <w:r>
           <w:rPr>
@@ -2681,12 +2754,12 @@
     </w:p>
     <w:p>
       <w:pPr>
-        <w:pStyle w:val="TDC2"/>
+        <w:pStyle w:val="TDC1"/>
         <w:tabs>
           <w:tab w:val="right" w:leader="dot" w:pos="9062"/>
         </w:tabs>
         <w:rPr>
-          <w:rFonts w:asciiTheme="minorHAnsi" w:eastAsiaTheme="minorEastAsia" w:hAnsiTheme="minorHAnsi"/>
+          <w:rFonts w:asciiTheme="minorHAnsi" w:eastAsiaTheme="minorEastAsia" w:hAnsiTheme="minorHAnsi" w:cstheme="minorBidi"/>
           <w:noProof/>
           <w:kern w:val="2"/>
           <w:szCs w:val="24"/>
@@ -2694,13 +2767,13 @@
           <w14:ligatures w14:val="standardContextual"/>
         </w:rPr>
       </w:pPr>
-      <w:hyperlink w:anchor="_Toc243350518" w:history="1">
+      <w:hyperlink w:anchor="_Toc243401763" w:history="1">
         <w:r>
           <w:rPr>
             <w:rStyle w:val="Hipervnculo"/>
             <w:noProof/>
           </w:rPr>
-          <w:t>11.1 Aporte de cada integrante</w:t>
+          <w:t>9. Conclusiones y trabajo futuro (avance)</w:t>
         </w:r>
         <w:r>
           <w:rPr>
@@ -2721,7 +2794,7 @@
             <w:noProof/>
             <w:webHidden/>
           </w:rPr>
-          <w:instrText xml:space="preserve"> PAGEREF _Toc243350518 \h </w:instrText>
+          <w:instrText xml:space="preserve"> PAGEREF _Toc243401763 \h </w:instrText>
         </w:r>
         <w:r>
           <w:rPr>
@@ -2754,12 +2827,12 @@
     </w:p>
     <w:p>
       <w:pPr>
-        <w:pStyle w:val="TDC2"/>
+        <w:pStyle w:val="TDC1"/>
         <w:tabs>
           <w:tab w:val="right" w:leader="dot" w:pos="9062"/>
         </w:tabs>
         <w:rPr>
-          <w:rFonts w:asciiTheme="minorHAnsi" w:eastAsiaTheme="minorEastAsia" w:hAnsiTheme="minorHAnsi"/>
+          <w:rFonts w:asciiTheme="minorHAnsi" w:eastAsiaTheme="minorEastAsia" w:hAnsiTheme="minorHAnsi" w:cstheme="minorBidi"/>
           <w:noProof/>
           <w:kern w:val="2"/>
           <w:szCs w:val="24"/>
@@ -2767,13 +2840,13 @@
           <w14:ligatures w14:val="standardContextual"/>
         </w:rPr>
       </w:pPr>
-      <w:hyperlink w:anchor="_Toc243350519" w:history="1">
+      <w:hyperlink w:anchor="_Toc243401764" w:history="1">
         <w:r>
           <w:rPr>
             <w:rStyle w:val="Hipervnculo"/>
             <w:noProof/>
           </w:rPr>
-          <w:t>11.2 Enlaces</w:t>
+          <w:t>10. Referencias</w:t>
         </w:r>
         <w:r>
           <w:rPr>
@@ -2794,7 +2867,7 @@
             <w:noProof/>
             <w:webHidden/>
           </w:rPr>
-          <w:instrText xml:space="preserve"> PAGEREF _Toc243350519 \h </w:instrText>
+          <w:instrText xml:space="preserve"> PAGEREF _Toc243401764 \h </w:instrText>
         </w:r>
         <w:r>
           <w:rPr>
@@ -2827,12 +2900,12 @@
     </w:p>
     <w:p>
       <w:pPr>
-        <w:pStyle w:val="TDC2"/>
+        <w:pStyle w:val="TDC1"/>
         <w:tabs>
           <w:tab w:val="right" w:leader="dot" w:pos="9062"/>
         </w:tabs>
         <w:rPr>
-          <w:rFonts w:asciiTheme="minorHAnsi" w:eastAsiaTheme="minorEastAsia" w:hAnsiTheme="minorHAnsi"/>
+          <w:rFonts w:asciiTheme="minorHAnsi" w:eastAsiaTheme="minorEastAsia" w:hAnsiTheme="minorHAnsi" w:cstheme="minorBidi"/>
           <w:noProof/>
           <w:kern w:val="2"/>
           <w:szCs w:val="24"/>
@@ -2840,13 +2913,13 @@
           <w14:ligatures w14:val="standardContextual"/>
         </w:rPr>
       </w:pPr>
-      <w:hyperlink w:anchor="_Toc243350520" w:history="1">
+      <w:hyperlink w:anchor="_Toc243401765" w:history="1">
         <w:r>
           <w:rPr>
             <w:rStyle w:val="Hipervnculo"/>
             <w:noProof/>
           </w:rPr>
-          <w:t>11.3 Ficha del proyecto</w:t>
+          <w:t>11. Anexos (avance)</w:t>
         </w:r>
         <w:r>
           <w:rPr>
@@ -2867,7 +2940,7 @@
             <w:noProof/>
             <w:webHidden/>
           </w:rPr>
-          <w:instrText xml:space="preserve"> PAGEREF _Toc243350520 \h </w:instrText>
+          <w:instrText xml:space="preserve"> PAGEREF _Toc243401765 \h </w:instrText>
         </w:r>
         <w:r>
           <w:rPr>
@@ -2887,7 +2960,7 @@
             <w:noProof/>
             <w:webHidden/>
           </w:rPr>
-          <w:t>20</w:t>
+          <w:t>21</w:t>
         </w:r>
         <w:r>
           <w:rPr>
@@ -2905,7 +2978,7 @@
           <w:tab w:val="right" w:leader="dot" w:pos="9062"/>
         </w:tabs>
         <w:rPr>
-          <w:rFonts w:asciiTheme="minorHAnsi" w:eastAsiaTheme="minorEastAsia" w:hAnsiTheme="minorHAnsi"/>
+          <w:rFonts w:asciiTheme="minorHAnsi" w:eastAsiaTheme="minorEastAsia" w:hAnsiTheme="minorHAnsi" w:cstheme="minorBidi"/>
           <w:noProof/>
           <w:kern w:val="2"/>
           <w:szCs w:val="24"/>
@@ -2913,12 +2986,231 @@
           <w14:ligatures w14:val="standardContextual"/>
         </w:rPr>
       </w:pPr>
-      <w:hyperlink w:anchor="_Toc243350521" w:history="1">
+      <w:hyperlink w:anchor="_Toc243401766" w:history="1">
         <w:r>
           <w:rPr>
             <w:rStyle w:val="Hipervnculo"/>
             <w:noProof/>
           </w:rPr>
+          <w:t>11.1 Aporte de cada integrante</w:t>
+        </w:r>
+        <w:r>
+          <w:rPr>
+            <w:noProof/>
+            <w:webHidden/>
+          </w:rPr>
+          <w:tab/>
+        </w:r>
+        <w:r>
+          <w:rPr>
+            <w:noProof/>
+            <w:webHidden/>
+          </w:rPr>
+          <w:fldChar w:fldCharType="begin"/>
+        </w:r>
+        <w:r>
+          <w:rPr>
+            <w:noProof/>
+            <w:webHidden/>
+          </w:rPr>
+          <w:instrText xml:space="preserve"> PAGEREF _Toc243401766 \h </w:instrText>
+        </w:r>
+        <w:r>
+          <w:rPr>
+            <w:noProof/>
+            <w:webHidden/>
+          </w:rPr>
+        </w:r>
+        <w:r>
+          <w:rPr>
+            <w:noProof/>
+            <w:webHidden/>
+          </w:rPr>
+          <w:fldChar w:fldCharType="separate"/>
+        </w:r>
+        <w:r>
+          <w:rPr>
+            <w:noProof/>
+            <w:webHidden/>
+          </w:rPr>
+          <w:t>21</w:t>
+        </w:r>
+        <w:r>
+          <w:rPr>
+            <w:noProof/>
+            <w:webHidden/>
+          </w:rPr>
+          <w:fldChar w:fldCharType="end"/>
+        </w:r>
+      </w:hyperlink>
+    </w:p>
+    <w:p>
+      <w:pPr>
+        <w:pStyle w:val="TDC2"/>
+        <w:tabs>
+          <w:tab w:val="right" w:leader="dot" w:pos="9062"/>
+        </w:tabs>
+        <w:rPr>
+          <w:rFonts w:asciiTheme="minorHAnsi" w:eastAsiaTheme="minorEastAsia" w:hAnsiTheme="minorHAnsi" w:cstheme="minorBidi"/>
+          <w:noProof/>
+          <w:kern w:val="2"/>
+          <w:szCs w:val="24"/>
+          <w:lang w:val="es-PE" w:eastAsia="es-PE"/>
+          <w14:ligatures w14:val="standardContextual"/>
+        </w:rPr>
+      </w:pPr>
+      <w:hyperlink w:anchor="_Toc243401767" w:history="1">
+        <w:r>
+          <w:rPr>
+            <w:rStyle w:val="Hipervnculo"/>
+            <w:noProof/>
+          </w:rPr>
+          <w:t>11.2 Enlaces</w:t>
+        </w:r>
+        <w:r>
+          <w:rPr>
+            <w:noProof/>
+            <w:webHidden/>
+          </w:rPr>
+          <w:tab/>
+        </w:r>
+        <w:r>
+          <w:rPr>
+            <w:noProof/>
+            <w:webHidden/>
+          </w:rPr>
+          <w:fldChar w:fldCharType="begin"/>
+        </w:r>
+        <w:r>
+          <w:rPr>
+            <w:noProof/>
+            <w:webHidden/>
+          </w:rPr>
+          <w:instrText xml:space="preserve"> PAGEREF _Toc243401767 \h </w:instrText>
+        </w:r>
+        <w:r>
+          <w:rPr>
+            <w:noProof/>
+            <w:webHidden/>
+          </w:rPr>
+        </w:r>
+        <w:r>
+          <w:rPr>
+            <w:noProof/>
+            <w:webHidden/>
+          </w:rPr>
+          <w:fldChar w:fldCharType="separate"/>
+        </w:r>
+        <w:r>
+          <w:rPr>
+            <w:noProof/>
+            <w:webHidden/>
+          </w:rPr>
+          <w:t>21</w:t>
+        </w:r>
+        <w:r>
+          <w:rPr>
+            <w:noProof/>
+            <w:webHidden/>
+          </w:rPr>
+          <w:fldChar w:fldCharType="end"/>
+        </w:r>
+      </w:hyperlink>
+    </w:p>
+    <w:p>
+      <w:pPr>
+        <w:pStyle w:val="TDC2"/>
+        <w:tabs>
+          <w:tab w:val="right" w:leader="dot" w:pos="9062"/>
+        </w:tabs>
+        <w:rPr>
+          <w:rFonts w:asciiTheme="minorHAnsi" w:eastAsiaTheme="minorEastAsia" w:hAnsiTheme="minorHAnsi" w:cstheme="minorBidi"/>
+          <w:noProof/>
+          <w:kern w:val="2"/>
+          <w:szCs w:val="24"/>
+          <w:lang w:val="es-PE" w:eastAsia="es-PE"/>
+          <w14:ligatures w14:val="standardContextual"/>
+        </w:rPr>
+      </w:pPr>
+      <w:hyperlink w:anchor="_Toc243401768" w:history="1">
+        <w:r>
+          <w:rPr>
+            <w:rStyle w:val="Hipervnculo"/>
+            <w:noProof/>
+          </w:rPr>
+          <w:t>11.3 Ficha del proyecto</w:t>
+        </w:r>
+        <w:r>
+          <w:rPr>
+            <w:noProof/>
+            <w:webHidden/>
+          </w:rPr>
+          <w:tab/>
+        </w:r>
+        <w:r>
+          <w:rPr>
+            <w:noProof/>
+            <w:webHidden/>
+          </w:rPr>
+          <w:fldChar w:fldCharType="begin"/>
+        </w:r>
+        <w:r>
+          <w:rPr>
+            <w:noProof/>
+            <w:webHidden/>
+          </w:rPr>
+          <w:instrText xml:space="preserve"> PAGEREF _Toc243401768 \h </w:instrText>
+        </w:r>
+        <w:r>
+          <w:rPr>
+            <w:noProof/>
+            <w:webHidden/>
+          </w:rPr>
+        </w:r>
+        <w:r>
+          <w:rPr>
+            <w:noProof/>
+            <w:webHidden/>
+          </w:rPr>
+          <w:fldChar w:fldCharType="separate"/>
+        </w:r>
+        <w:r>
+          <w:rPr>
+            <w:noProof/>
+            <w:webHidden/>
+          </w:rPr>
+          <w:t>21</w:t>
+        </w:r>
+        <w:r>
+          <w:rPr>
+            <w:noProof/>
+            <w:webHidden/>
+          </w:rPr>
+          <w:fldChar w:fldCharType="end"/>
+        </w:r>
+      </w:hyperlink>
+    </w:p>
+    <w:p>
+      <w:pPr>
+        <w:pStyle w:val="TDC2"/>
+        <w:tabs>
+          <w:tab w:val="right" w:leader="dot" w:pos="9062"/>
+        </w:tabs>
+        <w:rPr>
+          <w:rFonts w:asciiTheme="minorHAnsi" w:eastAsiaTheme="minorEastAsia" w:hAnsiTheme="minorHAnsi" w:cstheme="minorBidi"/>
+          <w:noProof/>
+          <w:kern w:val="2"/>
+          <w:szCs w:val="24"/>
+          <w:lang w:val="es-PE" w:eastAsia="es-PE"/>
+          <w14:ligatures w14:val="standardContextual"/>
+        </w:rPr>
+      </w:pPr>
+      <w:hyperlink w:anchor="_Toc243401769" w:history="1">
+        <w:r>
+          <w:rPr>
+            <w:rStyle w:val="Hipervnculo"/>
+            <w:noProof/>
+          </w:rPr>
           <w:t>11.4 Declaración de uso de inteligencia artificial</w:t>
         </w:r>
         <w:r>
@@ -2940,7 +3232,7 @@
             <w:noProof/>
             <w:webHidden/>
           </w:rPr>
-          <w:instrText xml:space="preserve"> PAGEREF _Toc243350521 \h </w:instrText>
+          <w:instrText xml:space="preserve"> PAGEREF _Toc243401769 \h </w:instrText>
         </w:r>
         <w:r>
           <w:rPr>
@@ -2960,7 +3252,7 @@
             <w:noProof/>
             <w:webHidden/>
           </w:rPr>
-          <w:t>20</w:t>
+          <w:t>21</w:t>
         </w:r>
         <w:r>
           <w:rPr>
@@ -2985,7 +3277,7 @@
       <w:pPr>
         <w:pStyle w:val="Ttulo1"/>
       </w:pPr>
-      <w:bookmarkStart w:id="0" w:name="_Toc243350484"/>
+      <w:bookmarkStart w:id="0" w:name="_Toc243401729"/>
       <w:r>
         <w:lastRenderedPageBreak/>
         <w:t>2. Resumen</w:t>
@@ -2997,7 +3289,7 @@
         <w:jc w:val="both"/>
       </w:pPr>
       <w:r>
-        <w:t>Las transformaciones geométricas suelen enseñarse con fórmulas y matrices en papel, sin ver de inmediato su efecto sobre la figura, lo que dificulta comprender por qué una matriz produce un movimiento y por qué el orden de las operaciones cambia el resultado. Para atender este problema se desarrolló GeoMatriz 2D, una aplicación web educativa dirigida a docentes de matemática que permite dibujar puntos, segmentos y polígonos en un plano cartesiano y aplicarles traslación, rotación y escalado mediante matrice</w:t>
+        <w:t>Las transformaciones geométricas suelen enseñarse con fórmulas y matrices en papel, sin ver de inmediato su efecto sobre la figura, lo que dificulta comprender por qué una matriz produce un movimiento y por qué el orden de las operaciones cambia el resultado. Para atender este problema se desarrolló GeoMatriz 2D, una aplicación web educativa dirigida a docentes y estudiantes que permite dibujar puntos, segmentos y polígonos en un plano cartesiano y aplicarles traslación, rotación y escalado mediante matrice</w:t>
       </w:r>
       <w:r>
         <w:t>s homogéneas de 3×3. El programa muestra al mismo tiempo la figura original y la transformada, cada matriz, la matriz compuesta con su determinante, las coordenadas homogéneas de cada vértice y el cálculo paso a paso. Se implementó con HTML5, CSS3, JavaScript y la API Canvas 2D, sin bibliotecas externas: el producto de matrices, la composición, la transformación respecto a un pivote y la transformación de viewport fueron programados por el grupo. Las 39 pruebas automáticas, con resultados calculados a mano,</w:t>
@@ -3021,7 +3313,7 @@
       <w:pPr>
         <w:pStyle w:val="Ttulo1"/>
       </w:pPr>
-      <w:bookmarkStart w:id="1" w:name="_Toc243350485"/>
+      <w:bookmarkStart w:id="1" w:name="_Toc243401730"/>
       <w:r>
         <w:t>3. Introducción</w:t>
       </w:r>
@@ -3031,7 +3323,7 @@
       <w:pPr>
         <w:pStyle w:val="Ttulo2"/>
       </w:pPr>
-      <w:bookmarkStart w:id="2" w:name="_Toc243350486"/>
+      <w:bookmarkStart w:id="2" w:name="_Toc243401731"/>
       <w:r>
         <w:t>3.1 Contexto</w:t>
       </w:r>
@@ -3049,7 +3341,7 @@
       <w:pPr>
         <w:pStyle w:val="Ttulo2"/>
       </w:pPr>
-      <w:bookmarkStart w:id="3" w:name="_Toc243350487"/>
+      <w:bookmarkStart w:id="3" w:name="_Toc243401732"/>
       <w:r>
         <w:t>3.2 Problema</w:t>
       </w:r>
@@ -3060,156 +3352,213 @@
         <w:jc w:val="both"/>
       </w:pPr>
       <w:r>
-        <w:t xml:space="preserve">Al estudiar las transformaciones solo con fórmulas, el estudiante no ve la relación entre los números de la matriz y el movimiento de la figura. Además, es difícil comprobar a mano que la composición no es conmutativa (T·R ≠ R·T) o que el área cambia según el determinante. Los docentes de matemática no disponen de una </w:t>
-      </w:r>
+        <w:t>Al estudiar las transformaciones solo con fórmulas, el estudiante no ve la relación entre los números de la matriz y el movimiento de la figura. Además, es difícil comprobar a mano que la composición no es conmutativa (T·R ≠ R·T) o que el área cambia según el determinante. Los docentes no disponen de una herramienta local, gratuita y en español que muestre a la vez la figura, las matrices y las coordenadas.</w:t>
+      </w:r>
+    </w:p>
+    <w:p>
+      <w:pPr>
+        <w:pStyle w:val="Ttulo2"/>
+      </w:pPr>
+      <w:bookmarkStart w:id="4" w:name="_Toc243401733"/>
       <w:r>
         <w:lastRenderedPageBreak/>
-        <w:t>herramienta local, gratuita y en español que muestre a la vez la figura, las matrices y las coordenadas.</w:t>
+        <w:t>3.3 Justificación</w:t>
+      </w:r>
+      <w:bookmarkEnd w:id="4"/>
+    </w:p>
+    <w:p>
+      <w:pPr>
+        <w:jc w:val="both"/>
+      </w:pPr>
+      <w:r>
+        <w:t>Una herramienta visual e interactiva reduce la abstracción: cada cambio de un parámetro se refleja de inmediato en el plano, en la matriz y en la tabla de coordenadas. Al ejecutarse en el navegador sin instalación ni internet, puede usarse en el laboratorio de la universidad y en las aulas de las instituciones de Andahuaylas.</w:t>
       </w:r>
     </w:p>
     <w:p>
       <w:pPr>
         <w:pStyle w:val="Ttulo2"/>
       </w:pPr>
-      <w:bookmarkStart w:id="4" w:name="_Toc243350488"/>
-      <w:r>
-        <w:t>3.3 Justificación</w:t>
-      </w:r>
-      <w:bookmarkEnd w:id="4"/>
+      <w:bookmarkStart w:id="5" w:name="_Toc243401734"/>
+      <w:r>
+        <w:t>3.4 Objetivos</w:t>
+      </w:r>
+      <w:bookmarkEnd w:id="5"/>
     </w:p>
     <w:p>
       <w:pPr>
         <w:jc w:val="both"/>
       </w:pPr>
       <w:r>
-        <w:t>Una herramienta visual e interactiva reduce la abstracción: cada cambio de un parámetro se refleja de inmediato en el plano, en la matriz y en la tabla de coordenadas. Al ejecutarse en el navegador sin instalación ni internet, puede usarse en el laboratorio de la universidad y en las aulas de las instituciones de Andahuaylas.</w:t>
+        <w:rPr>
+          <w:b/>
+        </w:rPr>
+        <w:t xml:space="preserve">Objetivo general. </w:t>
+      </w:r>
+      <w:r>
+        <w:t>Desarrollar una aplicación web educativa que permita construir figuras bidimensionales y aplicarles traslación, rotación y escalado mediante matrices homogéneas de 3×3, mostrando simultáneamente el resultado gráfico, las matrices utilizadas y las coordenadas antes y después de cada transformación.</w:t>
+      </w:r>
+    </w:p>
+    <w:p>
+      <w:pPr>
+        <w:spacing w:after="40"/>
+      </w:pPr>
+      <w:r>
+        <w:rPr>
+          <w:b/>
+        </w:rPr>
+        <w:t>Objetivos específicos.</w:t>
+      </w:r>
+    </w:p>
+    <w:p>
+      <w:pPr>
+        <w:tabs>
+          <w:tab w:val="left" w:pos="510"/>
+        </w:tabs>
+        <w:spacing w:after="60"/>
+        <w:ind w:left="510" w:hanging="340"/>
+      </w:pPr>
+      <w:r>
+        <w:t>1.</w:t>
+      </w:r>
+      <w:r>
+        <w:tab/>
+      </w:r>
+      <w:r>
+        <w:t>Representar puntos, segmentos y polígonos en un plano cartesiano con cuadrícula y ejes, usando Canvas 2D.</w:t>
+      </w:r>
+    </w:p>
+    <w:p>
+      <w:pPr>
+        <w:tabs>
+          <w:tab w:val="left" w:pos="510"/>
+        </w:tabs>
+        <w:spacing w:after="60"/>
+        <w:ind w:left="510" w:hanging="340"/>
+      </w:pPr>
+      <w:r>
+        <w:t>2.</w:t>
+      </w:r>
+      <w:r>
+        <w:tab/>
+      </w:r>
+      <w:r>
+        <w:t>Programar las matrices homogéneas de traslación, rotación y escalado, incluida la transformación respecto a un pivote.</w:t>
+      </w:r>
+    </w:p>
+    <w:p>
+      <w:pPr>
+        <w:tabs>
+          <w:tab w:val="left" w:pos="510"/>
+        </w:tabs>
+        <w:spacing w:after="60"/>
+        <w:ind w:left="510" w:hanging="340"/>
+      </w:pPr>
+      <w:r>
+        <w:t>3.</w:t>
+      </w:r>
+      <w:r>
+        <w:tab/>
+      </w:r>
+      <w:r>
+        <w:t>Implementar la composición de transformaciones en un orden editable y mostrar la matriz compuesta.</w:t>
+      </w:r>
+    </w:p>
+    <w:p>
+      <w:pPr>
+        <w:tabs>
+          <w:tab w:val="left" w:pos="510"/>
+        </w:tabs>
+        <w:spacing w:after="60"/>
+        <w:ind w:left="510" w:hanging="340"/>
+      </w:pPr>
+      <w:r>
+        <w:t>4.</w:t>
+      </w:r>
+      <w:r>
+        <w:tab/>
+      </w:r>
+      <w:r>
+        <w:t>Mostrar las coordenadas de cada vértice antes y después, con una explicación paso a paso del cálculo.</w:t>
+      </w:r>
+    </w:p>
+    <w:p>
+      <w:pPr>
+        <w:tabs>
+          <w:tab w:val="left" w:pos="510"/>
+        </w:tabs>
+        <w:spacing w:after="60"/>
+        <w:ind w:left="510" w:hanging="340"/>
+      </w:pPr>
+      <w:r>
+        <w:t>5.</w:t>
+      </w:r>
+      <w:r>
+        <w:tab/>
+      </w:r>
+      <w:r>
+        <w:t>Verificar los resultados con casos de prueba calculados a mano.</w:t>
+      </w:r>
+    </w:p>
+    <w:p>
+      <w:pPr>
+        <w:tabs>
+          <w:tab w:val="left" w:pos="510"/>
+        </w:tabs>
+        <w:spacing w:after="60"/>
+        <w:ind w:left="510" w:hanging="340"/>
+      </w:pPr>
+      <w:r>
+        <w:t>6.</w:t>
+      </w:r>
+      <w:r>
+        <w:tab/>
+      </w:r>
+      <w:r>
+        <w:t>Presentar la herramienta a docentes de una institución educativa del distrito de Turpo (Andahuaylas) mediante una demostración.</w:t>
       </w:r>
     </w:p>
     <w:p>
       <w:pPr>
         <w:pStyle w:val="Ttulo2"/>
       </w:pPr>
-      <w:bookmarkStart w:id="5" w:name="_Toc243350489"/>
-      <w:r>
-        <w:t>3.4 Objetivos</w:t>
-      </w:r>
-      <w:bookmarkEnd w:id="5"/>
+      <w:bookmarkStart w:id="6" w:name="_Toc243401735"/>
+      <w:r>
+        <w:t>3.5 Alcance y limitaciones</w:t>
+      </w:r>
+      <w:bookmarkEnd w:id="6"/>
     </w:p>
     <w:p>
       <w:pPr>
         <w:jc w:val="both"/>
       </w:pPr>
       <w:r>
-        <w:rPr>
-          <w:b/>
-        </w:rPr>
-        <w:t xml:space="preserve">Objetivo general. </w:t>
-      </w:r>
-      <w:r>
-        <w:t>Desarrollar una aplicación web educativa que permita construir figuras bidimensionales y aplicarles traslación, rotación y escalado mediante matrices homogéneas de 3×3, mostrando simultáneamente el resultado gráfico, las matrices utilizadas y las coordenadas antes y después de cada transformación.</w:t>
-      </w:r>
-    </w:p>
-    <w:p>
-      <w:pPr>
-        <w:spacing w:after="40"/>
-      </w:pPr>
-      <w:r>
-        <w:rPr>
-          <w:b/>
-        </w:rPr>
-        <w:t>Objetivos específicos.</w:t>
-      </w:r>
-    </w:p>
-    <w:p>
-      <w:pPr>
-        <w:pStyle w:val="Listaconnmeros"/>
-      </w:pPr>
-      <w:r>
-        <w:t>Representar puntos, segmentos y polígonos en un plano cartesiano con cuadrícula y ejes, usando Canvas 2D.</w:t>
-      </w:r>
-    </w:p>
-    <w:p>
-      <w:pPr>
-        <w:pStyle w:val="Listaconnmeros"/>
-      </w:pPr>
-      <w:r>
-        <w:t>Programar las matrices homogéneas de traslación, rotación y escalado, incluida la transformación respecto a un pivote.</w:t>
-      </w:r>
-    </w:p>
-    <w:p>
-      <w:pPr>
-        <w:pStyle w:val="Listaconnmeros"/>
-      </w:pPr>
-      <w:r>
-        <w:t>Implementar la composición de transformaciones en un orden editable y mostrar la matriz compuesta.</w:t>
-      </w:r>
-    </w:p>
-    <w:p>
-      <w:pPr>
-        <w:pStyle w:val="Listaconnmeros"/>
-      </w:pPr>
-      <w:r>
-        <w:t>Mostrar las coordenadas de cada vértice antes y después, con una explicación paso a paso del cálculo.</w:t>
-      </w:r>
-    </w:p>
-    <w:p>
-      <w:pPr>
-        <w:pStyle w:val="Listaconnmeros"/>
-      </w:pPr>
-      <w:r>
-        <w:t>Verificar los resultados con casos de prueba calculados a mano.</w:t>
-      </w:r>
-    </w:p>
-    <w:p>
-      <w:pPr>
-        <w:pStyle w:val="Listaconnmeros"/>
-      </w:pPr>
-      <w:r>
-        <w:t>Presentar la herramienta a docentes de matemática de una institución local mediante una demostración o taller breve.</w:t>
-      </w:r>
+        <w:t>El programa trabaja con una figura a la vez (punto, segmento, triángulo, cuadrado, rectángulo o polígono de hasta 12 vértices) y con una lista de hasta 10 transformaciones. Incluye herramientas de dibujo al estilo de GeoGebra, edición de coordenadas, validación de entradas, exportación a imagen y PDF y diseño adaptable a computadora, tableta y celular.</w:t>
+      </w:r>
+    </w:p>
+    <w:p>
+      <w:pPr>
+        <w:jc w:val="both"/>
+      </w:pPr>
+      <w:r>
+        <w:t>Limitaciones: no maneja varias figuras simultáneas ni guarda proyectos en archivos; el recorte de polígonos (Sutherland–Hodgman), que no es una técnica exigida para el tema 3, quedó como mejora futura; y la actividad de Responsabilidad Social Universitaria se realizó en una primera etapa, de forma virtual y con un docente (parte 8).</w:t>
+      </w:r>
+    </w:p>
+    <w:p>
+      <w:pPr>
+        <w:pStyle w:val="Ttulo1"/>
+      </w:pPr>
+      <w:bookmarkStart w:id="7" w:name="_Toc243401736"/>
+      <w:r>
+        <w:lastRenderedPageBreak/>
+        <w:t>4. Marco teórico</w:t>
+      </w:r>
+      <w:bookmarkEnd w:id="7"/>
     </w:p>
     <w:p>
       <w:pPr>
         <w:pStyle w:val="Ttulo2"/>
       </w:pPr>
-      <w:bookmarkStart w:id="6" w:name="_Toc243350490"/>
-      <w:r>
-        <w:t>3.5 Alcance y limitaciones</w:t>
-      </w:r>
-      <w:bookmarkEnd w:id="6"/>
-    </w:p>
-    <w:p>
-      <w:pPr>
-        <w:jc w:val="both"/>
-      </w:pPr>
-      <w:r>
-        <w:t>El programa trabaja con una figura a la vez (punto, segmento, triángulo, cuadrado, rectángulo o polígono de hasta 12 vértices) y con una lista de hasta 10 transformaciones. Incluye herramientas de dibujo al estilo de GeoGebra, edición de coordenadas, validación de entradas, exportación a imagen y PDF y diseño adaptable a computadora, tableta y celular.</w:t>
-      </w:r>
-    </w:p>
-    <w:p>
-      <w:pPr>
-        <w:jc w:val="both"/>
-      </w:pPr>
-      <w:r>
-        <w:lastRenderedPageBreak/>
-        <w:t>Limitaciones: no maneja varias figuras simultáneas ni guarda proyectos en archivos; el recorte de polígonos (Sutherland–Hodgman), que no es una técnica exigida para el tema 3, quedó como mejora futura; y la actividad de Responsabilidad Social Universitaria aún no se ha ejecutado (parte 8).</w:t>
-      </w:r>
-    </w:p>
-    <w:p>
-      <w:pPr>
-        <w:pStyle w:val="Ttulo1"/>
-      </w:pPr>
-      <w:bookmarkStart w:id="7" w:name="_Toc243350491"/>
-      <w:r>
-        <w:t>4. Marco teórico</w:t>
-      </w:r>
-      <w:bookmarkEnd w:id="7"/>
-    </w:p>
-    <w:p>
-      <w:pPr>
-        <w:pStyle w:val="Ttulo2"/>
-      </w:pPr>
-      <w:bookmarkStart w:id="8" w:name="_Toc243350492"/>
+      <w:bookmarkStart w:id="8" w:name="_Toc243401737"/>
       <w:r>
         <w:t>4.1 Coordenadas homogéneas</w:t>
       </w:r>
@@ -3239,14 +3588,7 @@
           <w:rFonts w:ascii="Cambria Math" w:hAnsi="Cambria Math"/>
           <w:sz w:val="25"/>
         </w:rPr>
-        <w:t>P = [x, y, 1]</w:t>
-      </w:r>
-      <w:r>
-        <w:rPr>
-          <w:rFonts w:ascii="Cambria Math" w:hAnsi="Cambria Math"/>
-          <w:sz w:val="25"/>
-        </w:rPr>
-        <w:t>ᵀ</w:t>
+        <w:t>P = [x, y, 1]ᵀ</w:t>
       </w:r>
       <w:r>
         <w:tab/>
@@ -3257,7 +3599,7 @@
       <w:pPr>
         <w:pStyle w:val="Ttulo2"/>
       </w:pPr>
-      <w:bookmarkStart w:id="9" w:name="_Toc243350493"/>
+      <w:bookmarkStart w:id="9" w:name="_Toc243401738"/>
       <w:r>
         <w:t>4.2 Matrices de traslación, rotación y escalado</w:t>
       </w:r>
@@ -3693,13 +4035,7 @@
               <w:rPr>
                 <w:rFonts w:ascii="Cambria Math" w:hAnsi="Cambria Math"/>
               </w:rPr>
-              <w:t>−</w:t>
-            </w:r>
-            <w:r>
-              <w:rPr>
-                <w:rFonts w:ascii="Cambria Math" w:hAnsi="Cambria Math"/>
-              </w:rPr>
-              <w:t>sen θ</w:t>
+              <w:t>−sen θ</w:t>
             </w:r>
           </w:p>
         </w:tc>
@@ -4284,9 +4620,8 @@
       <w:pPr>
         <w:pStyle w:val="Ttulo2"/>
       </w:pPr>
-      <w:bookmarkStart w:id="10" w:name="_Toc243350494"/>
-      <w:r>
-        <w:lastRenderedPageBreak/>
+      <w:bookmarkStart w:id="10" w:name="_Toc243401739"/>
+      <w:r>
         <w:t>4.3 Composición de transformaciones</w:t>
       </w:r>
       <w:bookmarkEnd w:id="10"/>
@@ -4334,8 +4669,9 @@
       <w:pPr>
         <w:pStyle w:val="Ttulo2"/>
       </w:pPr>
-      <w:bookmarkStart w:id="11" w:name="_Toc243350495"/>
-      <w:r>
+      <w:bookmarkStart w:id="11" w:name="_Toc243401740"/>
+      <w:r>
+        <w:lastRenderedPageBreak/>
         <w:t>4.4 Transformación respecto a un pivote</w:t>
       </w:r>
       <w:bookmarkEnd w:id="11"/>
@@ -4634,7 +4970,7 @@
       <w:pPr>
         <w:pStyle w:val="Ttulo2"/>
       </w:pPr>
-      <w:bookmarkStart w:id="12" w:name="_Toc243350496"/>
+      <w:bookmarkStart w:id="12" w:name="_Toc243401741"/>
       <w:r>
         <w:t>4.5 Determinante y área</w:t>
       </w:r>
@@ -4663,19 +4999,7 @@
         <w:t>y</w:t>
       </w:r>
       <w:r>
-        <w:t>. El área de un polígono de vértices (x</w:t>
-      </w:r>
-      <w:r>
-        <w:t>ᵢ</w:t>
-      </w:r>
-      <w:r>
-        <w:t>, y</w:t>
-      </w:r>
-      <w:r>
-        <w:t>ᵢ</w:t>
-      </w:r>
-      <w:r>
-        <w:t>) se calcula con la fórmula del zapato (shoelace):</w:t>
+        <w:t>. El área de un polígono de vértices (xᵢ, yᵢ) se calcula con la fórmula del zapato (shoelace):</w:t>
       </w:r>
     </w:p>
     <w:p>
@@ -4694,77 +5018,7 @@
           <w:rFonts w:ascii="Cambria Math" w:hAnsi="Cambria Math"/>
           <w:sz w:val="25"/>
         </w:rPr>
-        <w:t>A = ½ · | Σ (x</w:t>
-      </w:r>
-      <w:r>
-        <w:rPr>
-          <w:rFonts w:ascii="Cambria Math" w:hAnsi="Cambria Math"/>
-          <w:sz w:val="25"/>
-        </w:rPr>
-        <w:t>ᵢ</w:t>
-      </w:r>
-      <w:r>
-        <w:rPr>
-          <w:rFonts w:ascii="Cambria Math" w:hAnsi="Cambria Math"/>
-          <w:sz w:val="25"/>
-        </w:rPr>
-        <w:t xml:space="preserve"> · y</w:t>
-      </w:r>
-      <w:r>
-        <w:rPr>
-          <w:rFonts w:ascii="Cambria Math" w:hAnsi="Cambria Math"/>
-          <w:sz w:val="25"/>
-        </w:rPr>
-        <w:t>ᵢ</w:t>
-      </w:r>
-      <w:r>
-        <w:rPr>
-          <w:rFonts w:ascii="Cambria Math" w:hAnsi="Cambria Math"/>
-          <w:sz w:val="25"/>
-        </w:rPr>
-        <w:t>₊₁</w:t>
-      </w:r>
-      <w:r>
-        <w:rPr>
-          <w:rFonts w:ascii="Cambria Math" w:hAnsi="Cambria Math"/>
-          <w:sz w:val="25"/>
-        </w:rPr>
-        <w:t xml:space="preserve"> − x</w:t>
-      </w:r>
-      <w:r>
-        <w:rPr>
-          <w:rFonts w:ascii="Cambria Math" w:hAnsi="Cambria Math"/>
-          <w:sz w:val="25"/>
-        </w:rPr>
-        <w:t>ᵢ</w:t>
-      </w:r>
-      <w:r>
-        <w:rPr>
-          <w:rFonts w:ascii="Cambria Math" w:hAnsi="Cambria Math"/>
-          <w:sz w:val="25"/>
-        </w:rPr>
-        <w:t>₊₁</w:t>
-      </w:r>
-      <w:r>
-        <w:rPr>
-          <w:rFonts w:ascii="Cambria Math" w:hAnsi="Cambria Math"/>
-          <w:sz w:val="25"/>
-        </w:rPr>
-        <w:t xml:space="preserve"> · y</w:t>
-      </w:r>
-      <w:r>
-        <w:rPr>
-          <w:rFonts w:ascii="Cambria Math" w:hAnsi="Cambria Math"/>
-          <w:sz w:val="25"/>
-        </w:rPr>
-        <w:t>ᵢ</w:t>
-      </w:r>
-      <w:r>
-        <w:rPr>
-          <w:rFonts w:ascii="Cambria Math" w:hAnsi="Cambria Math"/>
-          <w:sz w:val="25"/>
-        </w:rPr>
-        <w:t>) |,      A′ = |det(M)| · A</w:t>
+        <w:t>A = ½ · | Σ (xᵢ · yᵢ₊₁ − xᵢ₊₁ · yᵢ) |,      A′ = |det(M)| · A</w:t>
       </w:r>
       <w:r>
         <w:tab/>
@@ -4775,7 +5029,7 @@
       <w:pPr>
         <w:pStyle w:val="Ttulo2"/>
       </w:pPr>
-      <w:bookmarkStart w:id="13" w:name="_Toc243350497"/>
+      <w:bookmarkStart w:id="13" w:name="_Toc243401742"/>
       <w:r>
         <w:t>4.6 Transformación de viewport</w:t>
       </w:r>
@@ -4975,13 +5229,7 @@
               <w:rPr>
                 <w:rFonts w:ascii="Cambria Math" w:hAnsi="Cambria Math"/>
               </w:rPr>
-              <w:t>−</w:t>
-            </w:r>
-            <w:r>
-              <w:rPr>
-                <w:rFonts w:ascii="Cambria Math" w:hAnsi="Cambria Math"/>
-              </w:rPr>
-              <w:t>k</w:t>
+              <w:t>−k</w:t>
             </w:r>
           </w:p>
         </w:tc>
@@ -5131,7 +5379,6 @@
         <w:jc w:val="both"/>
       </w:pPr>
       <w:r>
-        <w:lastRenderedPageBreak/>
         <w:t>La inversa V⁻¹ permite llevar la posición del puntero al plano para colocar y arrastrar puntos (Eck, 2023). Para acercar o alejar sin que se mueva el punto a = (a</w:t>
       </w:r>
       <w:r>
@@ -5240,7 +5487,7 @@
       <w:pPr>
         <w:pStyle w:val="Ttulo2"/>
       </w:pPr>
-      <w:bookmarkStart w:id="14" w:name="_Toc243350498"/>
+      <w:bookmarkStart w:id="14" w:name="_Toc243401743"/>
       <w:r>
         <w:t>4.7 Rasterización con Canvas 2D</w:t>
       </w:r>
@@ -5258,8 +5505,9 @@
       <w:pPr>
         <w:pStyle w:val="Ttulo1"/>
       </w:pPr>
-      <w:bookmarkStart w:id="15" w:name="_Toc243350499"/>
-      <w:r>
+      <w:bookmarkStart w:id="15" w:name="_Toc243401744"/>
+      <w:r>
+        <w:lastRenderedPageBreak/>
         <w:t>5. Análisis y diseño</w:t>
       </w:r>
       <w:bookmarkEnd w:id="15"/>
@@ -5268,7 +5516,7 @@
       <w:pPr>
         <w:pStyle w:val="Ttulo2"/>
       </w:pPr>
-      <w:bookmarkStart w:id="16" w:name="_Toc243350500"/>
+      <w:bookmarkStart w:id="16" w:name="_Toc243401745"/>
       <w:r>
         <w:t>5.1 Requisitos</w:t>
       </w:r>
@@ -6292,7 +6540,6 @@
               <w:rPr>
                 <w:sz w:val="21"/>
               </w:rPr>
-              <w:lastRenderedPageBreak/>
               <w:t>RNF04</w:t>
             </w:r>
           </w:p>
@@ -6467,7 +6714,7 @@
       <w:pPr>
         <w:pStyle w:val="Ttulo2"/>
       </w:pPr>
-      <w:bookmarkStart w:id="17" w:name="_Toc243350501"/>
+      <w:bookmarkStart w:id="17" w:name="_Toc243401746"/>
       <w:r>
         <w:t>5.2 Diagrama de módulos</w:t>
       </w:r>
@@ -6490,6 +6737,7 @@
         <w:rPr>
           <w:b/>
         </w:rPr>
+        <w:lastRenderedPageBreak/>
         <w:t>Figura 1</w:t>
       </w:r>
     </w:p>
@@ -6516,10 +6764,10 @@
           <w:noProof/>
         </w:rPr>
         <w:drawing>
-          <wp:inline distT="0" distB="0" distL="0" distR="0" wp14:anchorId="12F8B993" wp14:editId="6AF406E1">
+          <wp:inline distT="0" distB="0" distL="0" distR="0" wp14:anchorId="0B9F537E" wp14:editId="7A52C1CA">
             <wp:extent cx="5760000" cy="3936536"/>
             <wp:effectExtent l="0" t="0" r="0" b="0"/>
-            <wp:docPr id="1" name="Picture 1"/>
+            <wp:docPr id="2" name="Picture 2"/>
             <wp:cNvGraphicFramePr>
               <a:graphicFrameLocks xmlns:a="http://schemas.openxmlformats.org/drawingml/2006/main" noChangeAspect="1"/>
             </wp:cNvGraphicFramePr>
@@ -6531,7 +6779,7 @@
                     <pic:cNvPicPr/>
                   </pic:nvPicPr>
                   <pic:blipFill>
-                    <a:blip r:embed="rId8"/>
+                    <a:blip r:embed="rId9"/>
                     <a:stretch>
                       <a:fillRect/>
                     </a:stretch>
@@ -6574,9 +6822,8 @@
       <w:pPr>
         <w:pStyle w:val="Ttulo2"/>
       </w:pPr>
-      <w:bookmarkStart w:id="18" w:name="_Toc243350502"/>
-      <w:r>
-        <w:lastRenderedPageBreak/>
+      <w:bookmarkStart w:id="18" w:name="_Toc243401747"/>
+      <w:r>
         <w:t>5.3 Pipeline gráfico</w:t>
       </w:r>
       <w:bookmarkEnd w:id="18"/>
@@ -6616,10 +6863,10 @@
           <w:noProof/>
         </w:rPr>
         <w:drawing>
-          <wp:inline distT="0" distB="0" distL="0" distR="0" wp14:anchorId="2EB8D4B5" wp14:editId="03C4FE0C">
+          <wp:inline distT="0" distB="0" distL="0" distR="0" wp14:anchorId="53E16B5A" wp14:editId="09E03709">
             <wp:extent cx="5760000" cy="1060950"/>
             <wp:effectExtent l="0" t="0" r="0" b="0"/>
-            <wp:docPr id="2" name="Picture 2"/>
+            <wp:docPr id="3" name="Picture 3"/>
             <wp:cNvGraphicFramePr>
               <a:graphicFrameLocks xmlns:a="http://schemas.openxmlformats.org/drawingml/2006/main" noChangeAspect="1"/>
             </wp:cNvGraphicFramePr>
@@ -6631,7 +6878,7 @@
                     <pic:cNvPicPr/>
                   </pic:nvPicPr>
                   <pic:blipFill>
-                    <a:blip r:embed="rId9"/>
+                    <a:blip r:embed="rId10"/>
                     <a:stretch>
                       <a:fillRect/>
                     </a:stretch>
@@ -6674,7 +6921,7 @@
       <w:pPr>
         <w:pStyle w:val="Ttulo2"/>
       </w:pPr>
-      <w:bookmarkStart w:id="19" w:name="_Toc243350503"/>
+      <w:bookmarkStart w:id="19" w:name="_Toc243401748"/>
       <w:r>
         <w:t>5.4 Boceto de la interfaz</w:t>
       </w:r>
@@ -6697,6 +6944,7 @@
         <w:rPr>
           <w:b/>
         </w:rPr>
+        <w:lastRenderedPageBreak/>
         <w:t>Figura 3</w:t>
       </w:r>
     </w:p>
@@ -6723,10 +6971,10 @@
           <w:noProof/>
         </w:rPr>
         <w:drawing>
-          <wp:inline distT="0" distB="0" distL="0" distR="0" wp14:anchorId="3752C11E" wp14:editId="7CC75C8F">
+          <wp:inline distT="0" distB="0" distL="0" distR="0" wp14:anchorId="79AC17DA" wp14:editId="5A1C0041">
             <wp:extent cx="5040000" cy="3249721"/>
             <wp:effectExtent l="0" t="0" r="0" b="0"/>
-            <wp:docPr id="3" name="Picture 3"/>
+            <wp:docPr id="4" name="Picture 4"/>
             <wp:cNvGraphicFramePr>
               <a:graphicFrameLocks xmlns:a="http://schemas.openxmlformats.org/drawingml/2006/main" noChangeAspect="1"/>
             </wp:cNvGraphicFramePr>
@@ -6738,7 +6986,7 @@
                     <pic:cNvPicPr/>
                   </pic:nvPicPr>
                   <pic:blipFill>
-                    <a:blip r:embed="rId10"/>
+                    <a:blip r:embed="rId11"/>
                     <a:stretch>
                       <a:fillRect/>
                     </a:stretch>
@@ -6781,9 +7029,8 @@
       <w:pPr>
         <w:pStyle w:val="Ttulo1"/>
       </w:pPr>
-      <w:bookmarkStart w:id="20" w:name="_Toc243350504"/>
-      <w:r>
-        <w:lastRenderedPageBreak/>
+      <w:bookmarkStart w:id="20" w:name="_Toc243401749"/>
+      <w:r>
         <w:t>6. Implementación</w:t>
       </w:r>
       <w:bookmarkEnd w:id="20"/>
@@ -6792,7 +7039,7 @@
       <w:pPr>
         <w:pStyle w:val="Ttulo2"/>
       </w:pPr>
-      <w:bookmarkStart w:id="21" w:name="_Toc243350505"/>
+      <w:bookmarkStart w:id="21" w:name="_Toc243401750"/>
       <w:r>
         <w:t>6.1 Tecnologías</w:t>
       </w:r>
@@ -7103,7 +7350,7 @@
       <w:pPr>
         <w:pStyle w:val="Ttulo2"/>
       </w:pPr>
-      <w:bookmarkStart w:id="22" w:name="_Toc243350506"/>
+      <w:bookmarkStart w:id="22" w:name="_Toc243401751"/>
       <w:r>
         <w:t>6.2 Módulos principales</w:t>
       </w:r>
@@ -7226,6 +7473,7 @@
                 <w:rFonts w:ascii="Consolas" w:hAnsi="Consolas"/>
                 <w:sz w:val="21"/>
               </w:rPr>
+              <w:lastRenderedPageBreak/>
               <w:t>math/matrix.js</w:t>
             </w:r>
           </w:p>
@@ -7700,7 +7948,7 @@
       <w:pPr>
         <w:pStyle w:val="Ttulo2"/>
       </w:pPr>
-      <w:bookmarkStart w:id="23" w:name="_Toc243350507"/>
+      <w:bookmarkStart w:id="23" w:name="_Toc243401752"/>
       <w:r>
         <w:t>6.3 Fragmentos clave</w:t>
       </w:r>
@@ -7779,7 +8027,6 @@
           <w:rFonts w:ascii="Consolas" w:hAnsi="Consolas"/>
           <w:sz w:val="19"/>
         </w:rPr>
-        <w:lastRenderedPageBreak/>
         <w:t xml:space="preserve"> */</w:t>
       </w:r>
     </w:p>
@@ -8141,6 +8388,7 @@
           <w:rFonts w:ascii="Consolas" w:hAnsi="Consolas"/>
           <w:sz w:val="19"/>
         </w:rPr>
+        <w:lastRenderedPageBreak/>
         <w:t xml:space="preserve">  const steps = [];</w:t>
       </w:r>
     </w:p>
@@ -8429,7 +8677,6 @@
           <w:rFonts w:ascii="Consolas" w:hAnsi="Consolas"/>
           <w:sz w:val="19"/>
         </w:rPr>
-        <w:lastRenderedPageBreak/>
         <w:t>/**</w:t>
       </w:r>
     </w:p>
@@ -8638,8 +8885,9 @@
       <w:pPr>
         <w:pStyle w:val="Ttulo2"/>
       </w:pPr>
-      <w:bookmarkStart w:id="24" w:name="_Toc243350508"/>
-      <w:r>
+      <w:bookmarkStart w:id="24" w:name="_Toc243401753"/>
+      <w:r>
+        <w:lastRenderedPageBreak/>
         <w:t>6.4 Interfaz resultante</w:t>
       </w:r>
       <w:bookmarkEnd w:id="24"/>
@@ -8679,10 +8927,10 @@
           <w:noProof/>
         </w:rPr>
         <w:drawing>
-          <wp:inline distT="0" distB="0" distL="0" distR="0" wp14:anchorId="0736D0CA" wp14:editId="5CF48C27">
+          <wp:inline distT="0" distB="0" distL="0" distR="0" wp14:anchorId="7F429367" wp14:editId="381DD5CC">
             <wp:extent cx="5760000" cy="3600000"/>
             <wp:effectExtent l="0" t="0" r="0" b="0"/>
-            <wp:docPr id="4" name="Picture 4"/>
+            <wp:docPr id="5" name="Picture 5"/>
             <wp:cNvGraphicFramePr>
               <a:graphicFrameLocks xmlns:a="http://schemas.openxmlformats.org/drawingml/2006/main" noChangeAspect="1"/>
             </wp:cNvGraphicFramePr>
@@ -8694,7 +8942,7 @@
                     <pic:cNvPicPr/>
                   </pic:nvPicPr>
                   <pic:blipFill>
-                    <a:blip r:embed="rId11"/>
+                    <a:blip r:embed="rId12"/>
                     <a:stretch>
                       <a:fillRect/>
                     </a:stretch>
@@ -8769,10 +9017,10 @@
           <w:noProof/>
         </w:rPr>
         <w:drawing>
-          <wp:inline distT="0" distB="0" distL="0" distR="0" wp14:anchorId="2CB1ABE8" wp14:editId="371CA0CC">
+          <wp:inline distT="0" distB="0" distL="0" distR="0" wp14:anchorId="6B9FC4DB" wp14:editId="6B4FE5EA">
             <wp:extent cx="5760000" cy="3510857"/>
             <wp:effectExtent l="0" t="0" r="0" b="0"/>
-            <wp:docPr id="5" name="Picture 5"/>
+            <wp:docPr id="6" name="Picture 6"/>
             <wp:cNvGraphicFramePr>
               <a:graphicFrameLocks xmlns:a="http://schemas.openxmlformats.org/drawingml/2006/main" noChangeAspect="1"/>
             </wp:cNvGraphicFramePr>
@@ -8784,7 +9032,7 @@
                     <pic:cNvPicPr/>
                   </pic:nvPicPr>
                   <pic:blipFill>
-                    <a:blip r:embed="rId12"/>
+                    <a:blip r:embed="rId13"/>
                     <a:stretch>
                       <a:fillRect/>
                     </a:stretch>
@@ -8827,7 +9075,7 @@
       <w:pPr>
         <w:pStyle w:val="Ttulo1"/>
       </w:pPr>
-      <w:bookmarkStart w:id="25" w:name="_Toc243350509"/>
+      <w:bookmarkStart w:id="25" w:name="_Toc243401754"/>
       <w:r>
         <w:t>7. Pruebas y resultados</w:t>
       </w:r>
@@ -8837,7 +9085,7 @@
       <w:pPr>
         <w:pStyle w:val="Ttulo2"/>
       </w:pPr>
-      <w:bookmarkStart w:id="26" w:name="_Toc243350510"/>
+      <w:bookmarkStart w:id="26" w:name="_Toc243401755"/>
       <w:r>
         <w:t>7.1 Casos de prueba</w:t>
       </w:r>
@@ -9425,7 +9673,6 @@
               <w:rPr>
                 <w:sz w:val="19"/>
               </w:rPr>
-              <w:lastRenderedPageBreak/>
               <w:t>CP18</w:t>
             </w:r>
           </w:p>
@@ -9572,6 +9819,7 @@
               <w:rPr>
                 <w:sz w:val="19"/>
               </w:rPr>
+              <w:lastRenderedPageBreak/>
               <w:t>CV03</w:t>
             </w:r>
           </w:p>
@@ -9754,7 +10002,7 @@
       <w:pPr>
         <w:pStyle w:val="Ttulo2"/>
       </w:pPr>
-      <w:bookmarkStart w:id="27" w:name="_Toc243350511"/>
+      <w:bookmarkStart w:id="27" w:name="_Toc243401756"/>
       <w:r>
         <w:t>7.2 Capturas de funcionamiento</w:t>
       </w:r>
@@ -9795,10 +10043,10 @@
           <w:noProof/>
         </w:rPr>
         <w:drawing>
-          <wp:inline distT="0" distB="0" distL="0" distR="0" wp14:anchorId="605190D1" wp14:editId="342D928B">
+          <wp:inline distT="0" distB="0" distL="0" distR="0" wp14:anchorId="7334329F" wp14:editId="3486FE44">
             <wp:extent cx="5040000" cy="3165217"/>
             <wp:effectExtent l="0" t="0" r="0" b="0"/>
-            <wp:docPr id="6" name="Picture 6"/>
+            <wp:docPr id="7" name="Picture 7"/>
             <wp:cNvGraphicFramePr>
               <a:graphicFrameLocks xmlns:a="http://schemas.openxmlformats.org/drawingml/2006/main" noChangeAspect="1"/>
             </wp:cNvGraphicFramePr>
@@ -9810,7 +10058,7 @@
                     <pic:cNvPicPr/>
                   </pic:nvPicPr>
                   <pic:blipFill>
-                    <a:blip r:embed="rId13"/>
+                    <a:blip r:embed="rId14"/>
                     <a:stretch>
                       <a:fillRect/>
                     </a:stretch>
@@ -9885,10 +10133,10 @@
           <w:noProof/>
         </w:rPr>
         <w:drawing>
-          <wp:inline distT="0" distB="0" distL="0" distR="0" wp14:anchorId="535BB88F" wp14:editId="00C42C88">
+          <wp:inline distT="0" distB="0" distL="0" distR="0" wp14:anchorId="39D53DF6" wp14:editId="44B6D63E">
             <wp:extent cx="5040000" cy="3150000"/>
             <wp:effectExtent l="0" t="0" r="0" b="0"/>
-            <wp:docPr id="7" name="Picture 7"/>
+            <wp:docPr id="8" name="Picture 8"/>
             <wp:cNvGraphicFramePr>
               <a:graphicFrameLocks xmlns:a="http://schemas.openxmlformats.org/drawingml/2006/main" noChangeAspect="1"/>
             </wp:cNvGraphicFramePr>
@@ -9900,7 +10148,7 @@
                     <pic:cNvPicPr/>
                   </pic:nvPicPr>
                   <pic:blipFill>
-                    <a:blip r:embed="rId14"/>
+                    <a:blip r:embed="rId15"/>
                     <a:stretch>
                       <a:fillRect/>
                     </a:stretch>
@@ -9975,10 +10223,10 @@
           <w:noProof/>
         </w:rPr>
         <w:drawing>
-          <wp:inline distT="0" distB="0" distL="0" distR="0" wp14:anchorId="00ED0413" wp14:editId="1FC1F5E4">
+          <wp:inline distT="0" distB="0" distL="0" distR="0" wp14:anchorId="3545D421" wp14:editId="52E7B407">
             <wp:extent cx="2160000" cy="4674462"/>
             <wp:effectExtent l="0" t="0" r="0" b="0"/>
-            <wp:docPr id="8" name="Picture 8"/>
+            <wp:docPr id="9" name="Picture 9"/>
             <wp:cNvGraphicFramePr>
               <a:graphicFrameLocks xmlns:a="http://schemas.openxmlformats.org/drawingml/2006/main" noChangeAspect="1"/>
             </wp:cNvGraphicFramePr>
@@ -9990,7 +10238,7 @@
                     <pic:cNvPicPr/>
                   </pic:nvPicPr>
                   <pic:blipFill>
-                    <a:blip r:embed="rId15"/>
+                    <a:blip r:embed="rId16"/>
                     <a:stretch>
                       <a:fillRect/>
                     </a:stretch>
@@ -10033,7 +10281,7 @@
       <w:pPr>
         <w:pStyle w:val="Ttulo2"/>
       </w:pPr>
-      <w:bookmarkStart w:id="28" w:name="_Toc243350512"/>
+      <w:bookmarkStart w:id="28" w:name="_Toc243401757"/>
       <w:r>
         <w:t>7.3 Rendimiento</w:t>
       </w:r>
@@ -10408,7 +10656,7 @@
       <w:pPr>
         <w:pStyle w:val="Ttulo2"/>
       </w:pPr>
-      <w:bookmarkStart w:id="29" w:name="_Toc243350513"/>
+      <w:bookmarkStart w:id="29" w:name="_Toc243401758"/>
       <w:r>
         <w:lastRenderedPageBreak/>
         <w:t>7.4 Errores encontrados y corregidos</w:t>
@@ -10817,7 +11065,7 @@
       <w:pPr>
         <w:pStyle w:val="Ttulo1"/>
       </w:pPr>
-      <w:bookmarkStart w:id="30" w:name="_Toc243350514"/>
+      <w:bookmarkStart w:id="30" w:name="_Toc243401759"/>
       <w:r>
         <w:t>8. Componente de Responsabilidad Social Universitaria (RSU)</w:t>
       </w:r>
@@ -10825,270 +11073,20 @@
     </w:p>
     <w:p>
       <w:pPr>
+        <w:pStyle w:val="Ttulo2"/>
+      </w:pPr>
+      <w:bookmarkStart w:id="31" w:name="_Toc243401760"/>
+      <w:r>
+        <w:t>8.1 Beneficiario y actividad</w:t>
+      </w:r>
+      <w:bookmarkEnd w:id="31"/>
+    </w:p>
+    <w:p>
+      <w:pPr>
         <w:jc w:val="both"/>
       </w:pPr>
       <w:r>
-        <w:rPr>
-          <w:b/>
-        </w:rPr>
-        <w:t xml:space="preserve">Beneficiario previsto: </w:t>
-      </w:r>
-      <w:r>
-        <w:t>Docentes de matemática de una institución educativa de Andahuaylas (por confirmar).</w:t>
-      </w:r>
-    </w:p>
-    <w:p>
-      <w:pPr>
-        <w:jc w:val="both"/>
-      </w:pPr>
-      <w:r>
-        <w:rPr>
-          <w:b/>
-        </w:rPr>
-        <w:t xml:space="preserve">Actividad prevista: </w:t>
-      </w:r>
-      <w:r>
-        <w:t>demostración y taller breve (aproximadamente 45 minutos) sobre el uso de GeoMatriz 2D para enseñar traslación, rotación y escalado, con entrega del programa y de su manual de usuario. Se aplicará una breve encuesta de satisfacción y utilidad.</w:t>
-      </w:r>
-    </w:p>
-    <w:p>
-      <w:pPr>
-        <w:jc w:val="both"/>
-      </w:pPr>
-      <w:r>
-        <w:rPr>
-          <w:b/>
-        </w:rPr>
-        <w:t xml:space="preserve">Estado: </w:t>
-      </w:r>
-      <w:r>
-        <w:t>a la fecha de este informe de avance la actividad todavía no se ha realizado. La institución, la fecha, los participantes y la constancia se registrarán en la ficha de la actividad una vez ejecutada; no se incluyen datos que aún no existen.</w:t>
-      </w:r>
-    </w:p>
-    <w:p>
-      <w:pPr>
-        <w:jc w:val="both"/>
-      </w:pPr>
-      <w:r>
-        <w:rPr>
-          <w:b/>
-        </w:rPr>
-        <w:t xml:space="preserve">Evidencias previstas: </w:t>
-      </w:r>
-      <w:r>
-        <w:t>ficha de la actividad (objetivo, fecha, lugar, participantes), fotografías tomadas con el consentimiento de los asistentes, lista de asistentes y constancia o carta de conformidad del beneficiario.</w:t>
-      </w:r>
-    </w:p>
-    <w:p>
-      <w:pPr>
-        <w:jc w:val="both"/>
-      </w:pPr>
-      <w:r>
-        <w:rPr>
-          <w:b/>
-        </w:rPr>
-        <w:t xml:space="preserve">Indicadores: </w:t>
-      </w:r>
-      <w:r>
-        <w:t>número de docentes participantes, porcentaje que logra aplicar una composición de transformaciones durante el taller y valoración media de la utilidad del programa en la encuesta.</w:t>
-      </w:r>
-    </w:p>
-    <w:p>
-      <w:pPr>
-        <w:jc w:val="both"/>
-      </w:pPr>
-      <w:r>
-        <w:rPr>
-          <w:b/>
-        </w:rPr>
-        <w:t xml:space="preserve">Ética y uso responsable. </w:t>
-      </w:r>
-      <w:r>
-        <w:t xml:space="preserve">GeoMatriz 2D no recoge datos personales, no usa internet y no almacena información de los usuarios; las imágenes y los informes exportados solo contienen la figura y los cálculos. El código, los textos y las imágenes son del grupo y no se usaron recursos de terceros que requieran licencia. </w:t>
-      </w:r>
-      <w:r>
-        <w:lastRenderedPageBreak/>
-        <w:t>Las fotografías de la actividad solo se tomarán y publicarán con el consentimiento de las personas y sin datos sensibles. El uso de inteligencia artificial se declara en los anexos.</w:t>
-      </w:r>
-    </w:p>
-    <w:p>
-      <w:pPr>
-        <w:pStyle w:val="Ttulo1"/>
-      </w:pPr>
-      <w:bookmarkStart w:id="31" w:name="_Toc243350515"/>
-      <w:r>
-        <w:t>9. Conclusiones y trabajo futuro (avance)</w:t>
-      </w:r>
-      <w:bookmarkEnd w:id="31"/>
-    </w:p>
-    <w:p>
-      <w:pPr>
-        <w:pStyle w:val="Listaconvietas"/>
-      </w:pPr>
-      <w:r>
-        <w:t>Se cumplió el objetivo general: el programa muestra a la vez la figura, las matrices homogéneas y las coordenadas, y se ejecuta sin instalación.</w:t>
-      </w:r>
-    </w:p>
-    <w:p>
-      <w:pPr>
-        <w:pStyle w:val="Listaconvietas"/>
-      </w:pPr>
-      <w:r>
-        <w:t>Representar la traslación, la rotación, el escalado y también la transformación de viewport como matrices de 3×3 permitió usar una sola operación, el producto de matrices, en todo el pipeline.</w:t>
-      </w:r>
-    </w:p>
-    <w:p>
-      <w:pPr>
-        <w:pStyle w:val="Listaconvietas"/>
-      </w:pPr>
-      <w:r>
-        <w:t>Las pruebas con resultados calculados a mano detectaron errores que la observación visual no mostraba, como el desfase de un píxel o la etiqueta desactualizada del pivote.</w:t>
-      </w:r>
-    </w:p>
-    <w:p>
-      <w:pPr>
-        <w:pStyle w:val="Listaconvietas"/>
-      </w:pPr>
-      <w:r>
-        <w:t>Queda pendiente la actividad RSU y la validación con docentes, cuyos resultados completarán este apartado.</w:t>
-      </w:r>
-    </w:p>
-    <w:p>
-      <w:pPr>
-        <w:jc w:val="both"/>
-      </w:pPr>
-      <w:r>
-        <w:rPr>
-          <w:b/>
-        </w:rPr>
-        <w:t xml:space="preserve">Trabajo futuro: </w:t>
-      </w:r>
-      <w:r>
-        <w:t>recorte de polígonos con Sutherland–Hodgman, varias figuras simultáneas, guardar y abrir escenas, y animación de la transformación paso a paso.</w:t>
-      </w:r>
-    </w:p>
-    <w:p>
-      <w:pPr>
-        <w:pStyle w:val="Ttulo1"/>
-      </w:pPr>
-      <w:bookmarkStart w:id="32" w:name="_Toc243350516"/>
-      <w:r>
-        <w:t>10. Referencias</w:t>
-      </w:r>
-      <w:bookmarkEnd w:id="32"/>
-    </w:p>
-    <w:p>
-      <w:pPr>
-        <w:ind w:left="720" w:hanging="720"/>
-      </w:pPr>
-      <w:r>
-        <w:t xml:space="preserve">Eck, D. J. (2023). </w:t>
-      </w:r>
-      <w:r>
-        <w:rPr>
-          <w:i/>
-        </w:rPr>
-        <w:t>Introduction to computer graphics</w:t>
-      </w:r>
-      <w:r>
-        <w:t xml:space="preserve"> (Versión 1.4). Hobart and William Smith Colleges. https://math.hws.edu/graphicsbook/</w:t>
-      </w:r>
-    </w:p>
-    <w:p>
-      <w:pPr>
-        <w:ind w:left="720" w:hanging="720"/>
-      </w:pPr>
-      <w:r>
-        <w:t xml:space="preserve">Guha, S. (2022). </w:t>
-      </w:r>
-      <w:r>
-        <w:rPr>
-          <w:i/>
-        </w:rPr>
-        <w:t>Computer graphics through OpenGL: From theory to experiments</w:t>
-      </w:r>
-      <w:r>
-        <w:t xml:space="preserve"> (4.ª ed.). Chapman and Hall/CRC.</w:t>
-      </w:r>
-    </w:p>
-    <w:p>
-      <w:pPr>
-        <w:ind w:left="720" w:hanging="720"/>
-      </w:pPr>
-      <w:r>
-        <w:t xml:space="preserve">Hearn, D., y Baker, M. P. (2006). </w:t>
-      </w:r>
-      <w:r>
-        <w:rPr>
-          <w:i/>
-        </w:rPr>
-        <w:t>Gráficos por computadora con OpenGL</w:t>
-      </w:r>
-      <w:r>
-        <w:t xml:space="preserve"> (3.ª ed.). Pearson Educación.</w:t>
-      </w:r>
-    </w:p>
-    <w:p>
-      <w:pPr>
-        <w:ind w:left="720" w:hanging="720"/>
-      </w:pPr>
-      <w:r>
-        <w:t xml:space="preserve">Hughes, J. F., van Dam, A., McGuire, M., Sklar, D. F., Foley, J. D., Feiner, S. K., y Akeley, K. (2014). </w:t>
-      </w:r>
-      <w:r>
-        <w:rPr>
-          <w:i/>
-        </w:rPr>
-        <w:t>Computer graphics: Principles and practice</w:t>
-      </w:r>
-      <w:r>
-        <w:t xml:space="preserve"> (3.ª ed.). Addison-Wesley Professional.</w:t>
-      </w:r>
-    </w:p>
-    <w:p>
-      <w:pPr>
-        <w:ind w:left="720" w:hanging="720"/>
-      </w:pPr>
-      <w:r>
-        <w:t xml:space="preserve">MDN Web Docs. (s. f.). </w:t>
-      </w:r>
-      <w:r>
-        <w:rPr>
-          <w:i/>
-        </w:rPr>
-        <w:t>Canvas API</w:t>
-      </w:r>
-      <w:r>
-        <w:t>. Mozilla. https://developer.mozilla.org/es/docs/Web/API/Canvas_API</w:t>
-      </w:r>
-    </w:p>
-    <w:p>
-      <w:pPr>
-        <w:pStyle w:val="Ttulo1"/>
-      </w:pPr>
-      <w:bookmarkStart w:id="33" w:name="_Toc243350517"/>
-      <w:r>
-        <w:lastRenderedPageBreak/>
-        <w:t>11. Anexos (avance)</w:t>
-      </w:r>
-      <w:bookmarkEnd w:id="33"/>
-    </w:p>
-    <w:p>
-      <w:pPr>
-        <w:pStyle w:val="Ttulo2"/>
-      </w:pPr>
-      <w:bookmarkStart w:id="34" w:name="_Toc243350518"/>
-      <w:r>
-        <w:t>11.1 Aporte de cada integrante</w:t>
-      </w:r>
-      <w:bookmarkEnd w:id="34"/>
-    </w:p>
-    <w:p>
-      <w:pPr>
-        <w:jc w:val="both"/>
-      </w:pPr>
-      <w:r>
-        <w:t>La tabla muestra los roles asignados. La columna de aporte efectivo debe completarla cada integrante con lo que realmente hizo; el historial del repositorio es la evidencia que revisa el docente.</w:t>
+        <w:t>En una primera etapa, GeoMatriz 2D se presentó a un docente de una institución educativa del distrito de Turpo, provincia de Andahuaylas, Apurímac (nombre por confirmar). La actividad fue una demostración del programa en una videollamada: el grupo compartió la pantalla y mostró en vivo cómo se usa.</w:t>
       </w:r>
     </w:p>
     <w:p>
@@ -11101,6 +11099,817 @@
           <w:b/>
         </w:rPr>
         <w:t>Tabla 8</w:t>
+      </w:r>
+    </w:p>
+    <w:p>
+      <w:pPr>
+        <w:keepNext/>
+        <w:spacing w:after="80" w:line="276" w:lineRule="auto"/>
+      </w:pPr>
+      <w:r>
+        <w:rPr>
+          <w:i/>
+        </w:rPr>
+        <w:t>Ficha de la actividad RSU realizada</w:t>
+      </w:r>
+    </w:p>
+    <w:tbl>
+      <w:tblPr>
+        <w:tblStyle w:val="Tablaconcuadrcula"/>
+        <w:tblW w:w="0" w:type="auto"/>
+        <w:jc w:val="center"/>
+        <w:tblLook w:val="04A0" w:firstRow="1" w:lastRow="0" w:firstColumn="1" w:lastColumn="0" w:noHBand="0" w:noVBand="1"/>
+      </w:tblPr>
+      <w:tblGrid>
+        <w:gridCol w:w="2381"/>
+        <w:gridCol w:w="6690"/>
+      </w:tblGrid>
+      <w:tr>
+        <w:trPr>
+          <w:tblHeader/>
+          <w:jc w:val="center"/>
+        </w:trPr>
+        <w:tc>
+          <w:tcPr>
+            <w:tcW w:w="2381" w:type="dxa"/>
+            <w:shd w:val="clear" w:color="auto" w:fill="DBEAFE"/>
+            <w:vAlign w:val="center"/>
+          </w:tcPr>
+          <w:p>
+            <w:pPr>
+              <w:spacing w:after="20" w:line="264" w:lineRule="auto"/>
+            </w:pPr>
+            <w:r>
+              <w:rPr>
+                <w:b/>
+                <w:sz w:val="20"/>
+              </w:rPr>
+              <w:t>Dato</w:t>
+            </w:r>
+          </w:p>
+        </w:tc>
+        <w:tc>
+          <w:tcPr>
+            <w:tcW w:w="6690" w:type="dxa"/>
+            <w:shd w:val="clear" w:color="auto" w:fill="DBEAFE"/>
+            <w:vAlign w:val="center"/>
+          </w:tcPr>
+          <w:p>
+            <w:pPr>
+              <w:spacing w:after="20" w:line="264" w:lineRule="auto"/>
+            </w:pPr>
+            <w:r>
+              <w:rPr>
+                <w:b/>
+                <w:sz w:val="20"/>
+              </w:rPr>
+              <w:t>Registro</w:t>
+            </w:r>
+          </w:p>
+        </w:tc>
+      </w:tr>
+      <w:tr>
+        <w:trPr>
+          <w:jc w:val="center"/>
+        </w:trPr>
+        <w:tc>
+          <w:tcPr>
+            <w:tcW w:w="2381" w:type="dxa"/>
+            <w:vAlign w:val="center"/>
+          </w:tcPr>
+          <w:p>
+            <w:pPr>
+              <w:spacing w:after="20" w:line="264" w:lineRule="auto"/>
+            </w:pPr>
+            <w:r>
+              <w:rPr>
+                <w:sz w:val="20"/>
+              </w:rPr>
+              <w:t>Objetivo</w:t>
+            </w:r>
+          </w:p>
+        </w:tc>
+        <w:tc>
+          <w:tcPr>
+            <w:tcW w:w="6690" w:type="dxa"/>
+            <w:vAlign w:val="center"/>
+          </w:tcPr>
+          <w:p>
+            <w:pPr>
+              <w:spacing w:after="20" w:line="264" w:lineRule="auto"/>
+            </w:pPr>
+            <w:r>
+              <w:rPr>
+                <w:sz w:val="20"/>
+              </w:rPr>
+              <w:t>Presentar GeoMatriz 2D a un docente de la zona y recoger su opinión sobre la utilidad del programa para enseñar transformaciones geométricas</w:t>
+            </w:r>
+          </w:p>
+        </w:tc>
+      </w:tr>
+      <w:tr>
+        <w:trPr>
+          <w:jc w:val="center"/>
+        </w:trPr>
+        <w:tc>
+          <w:tcPr>
+            <w:tcW w:w="2381" w:type="dxa"/>
+            <w:vAlign w:val="center"/>
+          </w:tcPr>
+          <w:p>
+            <w:pPr>
+              <w:spacing w:after="20" w:line="264" w:lineRule="auto"/>
+            </w:pPr>
+            <w:r>
+              <w:rPr>
+                <w:sz w:val="20"/>
+              </w:rPr>
+              <w:t>Beneficiario</w:t>
+            </w:r>
+          </w:p>
+        </w:tc>
+        <w:tc>
+          <w:tcPr>
+            <w:tcW w:w="6690" w:type="dxa"/>
+            <w:vAlign w:val="center"/>
+          </w:tcPr>
+          <w:p>
+            <w:pPr>
+              <w:spacing w:after="20" w:line="264" w:lineRule="auto"/>
+            </w:pPr>
+            <w:r>
+              <w:rPr>
+                <w:sz w:val="20"/>
+              </w:rPr>
+              <w:t>Valerio Palacios Chambi (docente; estadístico e informático), institución educativa del distrito de Turpo, provincia de Andahuaylas, Apurímac (nombre por confirmar)</w:t>
+            </w:r>
+          </w:p>
+        </w:tc>
+      </w:tr>
+      <w:tr>
+        <w:trPr>
+          <w:jc w:val="center"/>
+        </w:trPr>
+        <w:tc>
+          <w:tcPr>
+            <w:tcW w:w="2381" w:type="dxa"/>
+            <w:vAlign w:val="center"/>
+          </w:tcPr>
+          <w:p>
+            <w:pPr>
+              <w:spacing w:after="20" w:line="264" w:lineRule="auto"/>
+            </w:pPr>
+            <w:r>
+              <w:rPr>
+                <w:sz w:val="20"/>
+              </w:rPr>
+              <w:t>Fecha y hora</w:t>
+            </w:r>
+          </w:p>
+        </w:tc>
+        <w:tc>
+          <w:tcPr>
+            <w:tcW w:w="6690" w:type="dxa"/>
+            <w:vAlign w:val="center"/>
+          </w:tcPr>
+          <w:p>
+            <w:pPr>
+              <w:spacing w:after="20" w:line="264" w:lineRule="auto"/>
+            </w:pPr>
+            <w:r>
+              <w:rPr>
+                <w:sz w:val="20"/>
+              </w:rPr>
+              <w:t>20 de octubre de 2026, inicio aproximado a las 8:20 a. m.; duración aproximadamente 1 hora</w:t>
+            </w:r>
+          </w:p>
+        </w:tc>
+      </w:tr>
+      <w:tr>
+        <w:trPr>
+          <w:jc w:val="center"/>
+        </w:trPr>
+        <w:tc>
+          <w:tcPr>
+            <w:tcW w:w="2381" w:type="dxa"/>
+            <w:vAlign w:val="center"/>
+          </w:tcPr>
+          <w:p>
+            <w:pPr>
+              <w:spacing w:after="20" w:line="264" w:lineRule="auto"/>
+            </w:pPr>
+            <w:r>
+              <w:rPr>
+                <w:sz w:val="20"/>
+              </w:rPr>
+              <w:t>Modalidad y lugar</w:t>
+            </w:r>
+          </w:p>
+        </w:tc>
+        <w:tc>
+          <w:tcPr>
+            <w:tcW w:w="6690" w:type="dxa"/>
+            <w:vAlign w:val="center"/>
+          </w:tcPr>
+          <w:p>
+            <w:pPr>
+              <w:spacing w:after="20" w:line="264" w:lineRule="auto"/>
+            </w:pPr>
+            <w:r>
+              <w:rPr>
+                <w:sz w:val="20"/>
+              </w:rPr>
+              <w:t>Actividad virtual, por videollamada de Google Meet (se compartió la pantalla con el programa); distrito de Turpo, provincia de Andahuaylas, departamento de Apurímac (ubicación del docente)</w:t>
+            </w:r>
+          </w:p>
+        </w:tc>
+      </w:tr>
+      <w:tr>
+        <w:trPr>
+          <w:jc w:val="center"/>
+        </w:trPr>
+        <w:tc>
+          <w:tcPr>
+            <w:tcW w:w="2381" w:type="dxa"/>
+            <w:vAlign w:val="center"/>
+          </w:tcPr>
+          <w:p>
+            <w:pPr>
+              <w:spacing w:after="20" w:line="264" w:lineRule="auto"/>
+            </w:pPr>
+            <w:r>
+              <w:rPr>
+                <w:sz w:val="20"/>
+              </w:rPr>
+              <w:t>Integrantes presentes</w:t>
+            </w:r>
+          </w:p>
+        </w:tc>
+        <w:tc>
+          <w:tcPr>
+            <w:tcW w:w="6690" w:type="dxa"/>
+            <w:vAlign w:val="center"/>
+          </w:tcPr>
+          <w:p>
+            <w:pPr>
+              <w:spacing w:after="20" w:line="264" w:lineRule="auto"/>
+            </w:pPr>
+            <w:r>
+              <w:rPr>
+                <w:sz w:val="20"/>
+              </w:rPr>
+              <w:t>Oscco Zarabia Rider Gilmar, Vargas Alhuay Hernan, Chilingano Lazo Albert</w:t>
+            </w:r>
+          </w:p>
+        </w:tc>
+      </w:tr>
+      <w:tr>
+        <w:trPr>
+          <w:jc w:val="center"/>
+        </w:trPr>
+        <w:tc>
+          <w:tcPr>
+            <w:tcW w:w="2381" w:type="dxa"/>
+            <w:vAlign w:val="center"/>
+          </w:tcPr>
+          <w:p>
+            <w:pPr>
+              <w:spacing w:after="20" w:line="264" w:lineRule="auto"/>
+            </w:pPr>
+            <w:r>
+              <w:rPr>
+                <w:sz w:val="20"/>
+              </w:rPr>
+              <w:t>Qué se mostró</w:t>
+            </w:r>
+          </w:p>
+        </w:tc>
+        <w:tc>
+          <w:tcPr>
+            <w:tcW w:w="6690" w:type="dxa"/>
+            <w:vAlign w:val="center"/>
+          </w:tcPr>
+          <w:p>
+            <w:pPr>
+              <w:spacing w:after="20" w:line="264" w:lineRule="auto"/>
+            </w:pPr>
+            <w:r>
+              <w:rPr>
+                <w:sz w:val="20"/>
+              </w:rPr>
+              <w:t>Dibujo de un triángulo con la herramienta Polígono, traslación T(3, 0) aplicada a la figura, lista de puntos, plano con zoom, borrado de la figura y reinicio del programa</w:t>
+            </w:r>
+          </w:p>
+        </w:tc>
+      </w:tr>
+      <w:tr>
+        <w:trPr>
+          <w:jc w:val="center"/>
+        </w:trPr>
+        <w:tc>
+          <w:tcPr>
+            <w:tcW w:w="2381" w:type="dxa"/>
+            <w:vAlign w:val="center"/>
+          </w:tcPr>
+          <w:p>
+            <w:pPr>
+              <w:spacing w:after="20" w:line="264" w:lineRule="auto"/>
+            </w:pPr>
+            <w:r>
+              <w:rPr>
+                <w:sz w:val="20"/>
+              </w:rPr>
+              <w:t>Uso de imágenes</w:t>
+            </w:r>
+          </w:p>
+        </w:tc>
+        <w:tc>
+          <w:tcPr>
+            <w:tcW w:w="6690" w:type="dxa"/>
+            <w:vAlign w:val="center"/>
+          </w:tcPr>
+          <w:p>
+            <w:pPr>
+              <w:spacing w:after="20" w:line="264" w:lineRule="auto"/>
+            </w:pPr>
+            <w:r>
+              <w:rPr>
+                <w:sz w:val="20"/>
+              </w:rPr>
+              <w:t>El docente aceptó aparecer en las imágenes.</w:t>
+            </w:r>
+          </w:p>
+        </w:tc>
+      </w:tr>
+    </w:tbl>
+    <w:p>
+      <w:pPr>
+        <w:spacing w:before="60" w:after="200"/>
+      </w:pPr>
+      <w:r>
+        <w:rPr>
+          <w:i/>
+          <w:sz w:val="20"/>
+        </w:rPr>
+        <w:t xml:space="preserve">Fuente: </w:t>
+      </w:r>
+      <w:r>
+        <w:rPr>
+          <w:sz w:val="20"/>
+        </w:rPr>
+        <w:t>Registro del grupo.</w:t>
+      </w:r>
+    </w:p>
+    <w:p>
+      <w:pPr>
+        <w:pStyle w:val="Ttulo2"/>
+      </w:pPr>
+      <w:bookmarkStart w:id="32" w:name="_Toc243401761"/>
+      <w:r>
+        <w:lastRenderedPageBreak/>
+        <w:t>8.2 Evidencias</w:t>
+      </w:r>
+      <w:bookmarkEnd w:id="32"/>
+    </w:p>
+    <w:p>
+      <w:pPr>
+        <w:keepNext/>
+        <w:spacing w:after="0"/>
+      </w:pPr>
+      <w:r>
+        <w:rPr>
+          <w:b/>
+        </w:rPr>
+        <w:t>Figura 9</w:t>
+      </w:r>
+    </w:p>
+    <w:p>
+      <w:pPr>
+        <w:keepNext/>
+        <w:spacing w:after="80" w:line="276" w:lineRule="auto"/>
+      </w:pPr>
+      <w:r>
+        <w:rPr>
+          <w:i/>
+        </w:rPr>
+        <w:t>Demostración por Google Meet (8:25 a. m.): triángulo A, B, C con la traslación T(3, 0) y su figura transformada</w:t>
+      </w:r>
+    </w:p>
+    <w:p>
+      <w:pPr>
+        <w:keepNext/>
+        <w:spacing w:after="40"/>
+        <w:jc w:val="center"/>
+      </w:pPr>
+      <w:r>
+        <w:rPr>
+          <w:noProof/>
+        </w:rPr>
+        <w:drawing>
+          <wp:inline distT="0" distB="0" distL="0" distR="0" wp14:anchorId="1DF259AB" wp14:editId="7566C8E3">
+            <wp:extent cx="5580000" cy="2246646"/>
+            <wp:effectExtent l="0" t="0" r="0" b="0"/>
+            <wp:docPr id="10" name="Picture 10"/>
+            <wp:cNvGraphicFramePr>
+              <a:graphicFrameLocks xmlns:a="http://schemas.openxmlformats.org/drawingml/2006/main" noChangeAspect="1"/>
+            </wp:cNvGraphicFramePr>
+            <a:graphic xmlns:a="http://schemas.openxmlformats.org/drawingml/2006/main">
+              <a:graphicData uri="http://schemas.openxmlformats.org/drawingml/2006/picture">
+                <pic:pic xmlns:pic="http://schemas.openxmlformats.org/drawingml/2006/picture">
+                  <pic:nvPicPr>
+                    <pic:cNvPr id="0" name="rsu_01_0825_triangulo_traslacion.png"/>
+                    <pic:cNvPicPr/>
+                  </pic:nvPicPr>
+                  <pic:blipFill>
+                    <a:blip r:embed="rId17"/>
+                    <a:stretch>
+                      <a:fillRect/>
+                    </a:stretch>
+                  </pic:blipFill>
+                  <pic:spPr>
+                    <a:xfrm>
+                      <a:off x="0" y="0"/>
+                      <a:ext cx="5580000" cy="2246646"/>
+                    </a:xfrm>
+                    <a:prstGeom prst="rect">
+                      <a:avLst/>
+                    </a:prstGeom>
+                  </pic:spPr>
+                </pic:pic>
+              </a:graphicData>
+            </a:graphic>
+          </wp:inline>
+        </w:drawing>
+      </w:r>
+    </w:p>
+    <w:p>
+      <w:pPr>
+        <w:spacing w:after="200"/>
+      </w:pPr>
+      <w:r>
+        <w:rPr>
+          <w:i/>
+          <w:sz w:val="20"/>
+        </w:rPr>
+        <w:t xml:space="preserve">Fuente: </w:t>
+      </w:r>
+      <w:r>
+        <w:rPr>
+          <w:sz w:val="20"/>
+        </w:rPr>
+        <w:t>Captura de pantalla de la videollamada del 20 de octubre de 2026, tomada por el grupo.</w:t>
+      </w:r>
+    </w:p>
+    <w:p>
+      <w:pPr>
+        <w:keepNext/>
+        <w:spacing w:after="0"/>
+      </w:pPr>
+      <w:r>
+        <w:rPr>
+          <w:b/>
+        </w:rPr>
+        <w:t>Figura 10</w:t>
+      </w:r>
+    </w:p>
+    <w:p>
+      <w:pPr>
+        <w:keepNext/>
+        <w:spacing w:after="80" w:line="276" w:lineRule="auto"/>
+      </w:pPr>
+      <w:r>
+        <w:rPr>
+          <w:i/>
+        </w:rPr>
+        <w:t>Demostración del botón Borrar (8:26 a. m.); a la derecha, los participantes de la videollamada</w:t>
+      </w:r>
+    </w:p>
+    <w:p>
+      <w:pPr>
+        <w:keepNext/>
+        <w:spacing w:after="40"/>
+        <w:jc w:val="center"/>
+      </w:pPr>
+      <w:r>
+        <w:rPr>
+          <w:noProof/>
+        </w:rPr>
+        <w:drawing>
+          <wp:inline distT="0" distB="0" distL="0" distR="0" wp14:anchorId="0335AF85" wp14:editId="3D9B28F4">
+            <wp:extent cx="5580000" cy="2571119"/>
+            <wp:effectExtent l="0" t="0" r="0" b="0"/>
+            <wp:docPr id="11" name="Picture 11"/>
+            <wp:cNvGraphicFramePr>
+              <a:graphicFrameLocks xmlns:a="http://schemas.openxmlformats.org/drawingml/2006/main" noChangeAspect="1"/>
+            </wp:cNvGraphicFramePr>
+            <a:graphic xmlns:a="http://schemas.openxmlformats.org/drawingml/2006/main">
+              <a:graphicData uri="http://schemas.openxmlformats.org/drawingml/2006/picture">
+                <pic:pic xmlns:pic="http://schemas.openxmlformats.org/drawingml/2006/picture">
+                  <pic:nvPicPr>
+                    <pic:cNvPr id="0" name="rsu_02_0826_borrar_figura.png"/>
+                    <pic:cNvPicPr/>
+                  </pic:nvPicPr>
+                  <pic:blipFill>
+                    <a:blip r:embed="rId18"/>
+                    <a:stretch>
+                      <a:fillRect/>
+                    </a:stretch>
+                  </pic:blipFill>
+                  <pic:spPr>
+                    <a:xfrm>
+                      <a:off x="0" y="0"/>
+                      <a:ext cx="5580000" cy="2571119"/>
+                    </a:xfrm>
+                    <a:prstGeom prst="rect">
+                      <a:avLst/>
+                    </a:prstGeom>
+                  </pic:spPr>
+                </pic:pic>
+              </a:graphicData>
+            </a:graphic>
+          </wp:inline>
+        </w:drawing>
+      </w:r>
+    </w:p>
+    <w:p>
+      <w:pPr>
+        <w:spacing w:after="200"/>
+      </w:pPr>
+      <w:r>
+        <w:rPr>
+          <w:i/>
+          <w:sz w:val="20"/>
+        </w:rPr>
+        <w:t xml:space="preserve">Fuente: </w:t>
+      </w:r>
+      <w:r>
+        <w:rPr>
+          <w:sz w:val="20"/>
+        </w:rPr>
+        <w:t>Captura de pantalla de la videollamada del 20 de octubre de 2026, tomada por el grupo.</w:t>
+      </w:r>
+    </w:p>
+    <w:p>
+      <w:pPr>
+        <w:jc w:val="both"/>
+      </w:pPr>
+      <w:r>
+        <w:rPr>
+          <w:b/>
+        </w:rPr>
+        <w:t xml:space="preserve">Evidencias pendientes: </w:t>
+      </w:r>
+      <w:r>
+        <w:t xml:space="preserve">todavía no se cuenta con constancia ni carta de conformidad, no se firmó una lista de asistentes y no se aplicó la encuesta. La opinión del docente sobre el programa aún no se ha registrado. Estas evidencias se recogerán en la siguiente etapa con los formatos del documento </w:t>
+      </w:r>
+      <w:r>
+        <w:rPr>
+          <w:rFonts w:ascii="Consolas" w:hAnsi="Consolas"/>
+          <w:sz w:val="21"/>
+        </w:rPr>
+        <w:t>7_Evidencias_RSU.pdf</w:t>
+      </w:r>
+      <w:r>
+        <w:t>.</w:t>
+      </w:r>
+    </w:p>
+    <w:p>
+      <w:pPr>
+        <w:pStyle w:val="Ttulo2"/>
+      </w:pPr>
+      <w:bookmarkStart w:id="33" w:name="_Toc243401762"/>
+      <w:r>
+        <w:lastRenderedPageBreak/>
+        <w:t>8.3 Resultados y siguiente etapa</w:t>
+      </w:r>
+      <w:bookmarkEnd w:id="33"/>
+    </w:p>
+    <w:p>
+      <w:pPr>
+        <w:jc w:val="both"/>
+      </w:pPr>
+      <w:r>
+        <w:t>Resultado de esta etapa: el programa se mostró completo y funcionando a un docente de la zona, con la participación de los tres integrantes. Como siguiente paso, y después de incorporar mejoras, el grupo presentará GeoMatriz 2D en la institución educativa mediante un taller con sus docentes, en el que se recogerán la lista de asistentes firmada, la encuesta de utilidad y la constancia de conformidad.</w:t>
+      </w:r>
+    </w:p>
+    <w:p>
+      <w:pPr>
+        <w:jc w:val="both"/>
+      </w:pPr>
+      <w:r>
+        <w:rPr>
+          <w:b/>
+        </w:rPr>
+        <w:t xml:space="preserve">Indicadores: </w:t>
+      </w:r>
+      <w:r>
+        <w:t>docentes participantes (en esta etapa: 1), opinión del docente (pendiente) y, en el taller, porcentaje de docentes que logra aplicar una composición de transformaciones y valoración media en la encuesta.</w:t>
+      </w:r>
+    </w:p>
+    <w:p>
+      <w:pPr>
+        <w:jc w:val="both"/>
+      </w:pPr>
+      <w:r>
+        <w:rPr>
+          <w:b/>
+        </w:rPr>
+        <w:t xml:space="preserve">Ética y uso responsable. </w:t>
+      </w:r>
+      <w:r>
+        <w:t>GeoMatriz 2D no recoge datos personales, no usa internet y no almacena información de los usuarios; las imágenes y los informes exportados solo contienen la figura y los cálculos. El código, los textos y las imágenes son del grupo y no se usaron recursos de terceros que requieran licencia. Las capturas de la videollamada se incluyen con el consentimiento del docente y sin datos sensibles. El uso de inteligencia artificial se declara en los anexos.</w:t>
+      </w:r>
+    </w:p>
+    <w:p>
+      <w:pPr>
+        <w:pStyle w:val="Ttulo1"/>
+      </w:pPr>
+      <w:bookmarkStart w:id="34" w:name="_Toc243401763"/>
+      <w:r>
+        <w:t>9. Conclusiones y trabajo futuro (avance)</w:t>
+      </w:r>
+      <w:bookmarkEnd w:id="34"/>
+    </w:p>
+    <w:p>
+      <w:pPr>
+        <w:pStyle w:val="Listaconvietas"/>
+      </w:pPr>
+      <w:r>
+        <w:t>Se cumplió el objetivo general: el programa muestra a la vez la figura, las matrices homogéneas y las coordenadas, y se ejecuta sin instalación.</w:t>
+      </w:r>
+    </w:p>
+    <w:p>
+      <w:pPr>
+        <w:pStyle w:val="Listaconvietas"/>
+      </w:pPr>
+      <w:r>
+        <w:t>Representar la traslación, la rotación, el escalado y también la transformación de viewport como matrices de 3×3 permitió usar una sola operación, el producto de matrices, en todo el pipeline.</w:t>
+      </w:r>
+    </w:p>
+    <w:p>
+      <w:pPr>
+        <w:pStyle w:val="Listaconvietas"/>
+      </w:pPr>
+      <w:r>
+        <w:t>Las pruebas con resultados calculados a mano detectaron errores que la observación visual no mostraba, como el desfase de un píxel o la etiqueta desactualizada del pivote.</w:t>
+      </w:r>
+    </w:p>
+    <w:p>
+      <w:pPr>
+        <w:pStyle w:val="Listaconvietas"/>
+      </w:pPr>
+      <w:r>
+        <w:t>La primera presentación a un docente de Turpo mostró que el programa puede usarse en una sesión remota; falta registrar su opinión y realizar el taller en la institución.</w:t>
+      </w:r>
+    </w:p>
+    <w:p>
+      <w:pPr>
+        <w:jc w:val="both"/>
+      </w:pPr>
+      <w:r>
+        <w:rPr>
+          <w:b/>
+        </w:rPr>
+        <w:t xml:space="preserve">Trabajo futuro: </w:t>
+      </w:r>
+      <w:r>
+        <w:t>recorte de polígonos con Sutherland–Hodgman, varias figuras simultáneas, guardar y abrir escenas, y animación de la transformación paso a paso.</w:t>
+      </w:r>
+    </w:p>
+    <w:p>
+      <w:pPr>
+        <w:pStyle w:val="Ttulo1"/>
+      </w:pPr>
+      <w:bookmarkStart w:id="35" w:name="_Toc243401764"/>
+      <w:r>
+        <w:t>10. Referencias</w:t>
+      </w:r>
+      <w:bookmarkEnd w:id="35"/>
+    </w:p>
+    <w:p>
+      <w:pPr>
+        <w:ind w:left="720" w:hanging="720"/>
+      </w:pPr>
+      <w:r>
+        <w:t xml:space="preserve">Eck, D. J. (2023). </w:t>
+      </w:r>
+      <w:r>
+        <w:rPr>
+          <w:i/>
+        </w:rPr>
+        <w:t>Introduction to computer graphics</w:t>
+      </w:r>
+      <w:r>
+        <w:t xml:space="preserve"> (Versión 1.4). Hobart and William Smith Colleges. https://math.hws.edu/graphicsbook/</w:t>
+      </w:r>
+    </w:p>
+    <w:p>
+      <w:pPr>
+        <w:ind w:left="720" w:hanging="720"/>
+      </w:pPr>
+      <w:r>
+        <w:lastRenderedPageBreak/>
+        <w:t xml:space="preserve">Guha, S. (2022). </w:t>
+      </w:r>
+      <w:r>
+        <w:rPr>
+          <w:i/>
+        </w:rPr>
+        <w:t>Computer graphics through OpenGL: From theory to experiments</w:t>
+      </w:r>
+      <w:r>
+        <w:t xml:space="preserve"> (4.ª ed.). Chapman and Hall/CRC.</w:t>
+      </w:r>
+    </w:p>
+    <w:p>
+      <w:pPr>
+        <w:ind w:left="720" w:hanging="720"/>
+      </w:pPr>
+      <w:r>
+        <w:t xml:space="preserve">Hearn, D., y Baker, M. P. (2006). </w:t>
+      </w:r>
+      <w:r>
+        <w:rPr>
+          <w:i/>
+        </w:rPr>
+        <w:t>Gráficos por computadora con OpenGL</w:t>
+      </w:r>
+      <w:r>
+        <w:t xml:space="preserve"> (3.ª ed.). Pearson Educación.</w:t>
+      </w:r>
+    </w:p>
+    <w:p>
+      <w:pPr>
+        <w:ind w:left="720" w:hanging="720"/>
+      </w:pPr>
+      <w:r>
+        <w:t xml:space="preserve">Hughes, J. F., van Dam, A., McGuire, M., Sklar, D. F., Foley, J. D., Feiner, S. K., y Akeley, K. (2014). </w:t>
+      </w:r>
+      <w:r>
+        <w:rPr>
+          <w:i/>
+        </w:rPr>
+        <w:t>Computer graphics: Principles and practice</w:t>
+      </w:r>
+      <w:r>
+        <w:t xml:space="preserve"> (3.ª ed.). Addison-Wesley Professional.</w:t>
+      </w:r>
+    </w:p>
+    <w:p>
+      <w:pPr>
+        <w:ind w:left="720" w:hanging="720"/>
+      </w:pPr>
+      <w:r>
+        <w:t xml:space="preserve">MDN Web Docs. (s. f.). </w:t>
+      </w:r>
+      <w:r>
+        <w:rPr>
+          <w:i/>
+        </w:rPr>
+        <w:t>Canvas API</w:t>
+      </w:r>
+      <w:r>
+        <w:t>. Mozilla. https://developer.mozilla.org/es/docs/Web/API/Canvas_API</w:t>
+      </w:r>
+    </w:p>
+    <w:p>
+      <w:pPr>
+        <w:pStyle w:val="Ttulo1"/>
+      </w:pPr>
+      <w:bookmarkStart w:id="36" w:name="_Toc243401765"/>
+      <w:r>
+        <w:t>11. Anexos (avance)</w:t>
+      </w:r>
+      <w:bookmarkEnd w:id="36"/>
+    </w:p>
+    <w:p>
+      <w:pPr>
+        <w:pStyle w:val="Ttulo2"/>
+      </w:pPr>
+      <w:bookmarkStart w:id="37" w:name="_Toc243401766"/>
+      <w:r>
+        <w:t>11.1 Aporte de cada integrante</w:t>
+      </w:r>
+      <w:bookmarkEnd w:id="37"/>
+    </w:p>
+    <w:p>
+      <w:pPr>
+        <w:jc w:val="both"/>
+      </w:pPr>
+      <w:r>
+        <w:t>La tabla muestra los roles asignados. La columna de aporte efectivo debe completarla cada integrante con lo que realmente hizo; el historial del repositorio es la evidencia que revisa el docente.</w:t>
+      </w:r>
+    </w:p>
+    <w:p>
+      <w:pPr>
+        <w:keepNext/>
+        <w:spacing w:after="0"/>
+      </w:pPr>
+      <w:r>
+        <w:rPr>
+          <w:b/>
+        </w:rPr>
+        <w:t>Tabla 9</w:t>
       </w:r>
     </w:p>
     <w:p>
@@ -11363,11 +12172,11 @@
       <w:pPr>
         <w:pStyle w:val="Ttulo2"/>
       </w:pPr>
-      <w:bookmarkStart w:id="35" w:name="_Toc243350519"/>
+      <w:bookmarkStart w:id="38" w:name="_Toc243401767"/>
       <w:r>
         <w:t>11.2 Enlaces</w:t>
       </w:r>
-      <w:bookmarkEnd w:id="35"/>
+      <w:bookmarkEnd w:id="38"/>
     </w:p>
     <w:p>
       <w:pPr>
@@ -11389,11 +12198,11 @@
       <w:pPr>
         <w:pStyle w:val="Ttulo2"/>
       </w:pPr>
-      <w:bookmarkStart w:id="36" w:name="_Toc243350520"/>
+      <w:bookmarkStart w:id="39" w:name="_Toc243401768"/>
       <w:r>
         <w:t>11.3 Ficha del proyecto</w:t>
       </w:r>
-      <w:bookmarkEnd w:id="36"/>
+      <w:bookmarkEnd w:id="39"/>
     </w:p>
     <w:p>
       <w:pPr>
@@ -11417,11 +12226,11 @@
       <w:pPr>
         <w:pStyle w:val="Ttulo2"/>
       </w:pPr>
-      <w:bookmarkStart w:id="37" w:name="_Toc243350521"/>
+      <w:bookmarkStart w:id="40" w:name="_Toc243401769"/>
       <w:r>
         <w:t>11.4 Declaración de uso de inteligencia artificial</w:t>
       </w:r>
-      <w:bookmarkEnd w:id="37"/>
+      <w:bookmarkEnd w:id="40"/>
     </w:p>
     <w:p>
       <w:pPr>
@@ -11442,7 +12251,7 @@
       </w:r>
     </w:p>
     <w:sectPr>
-      <w:footerReference w:type="default" r:id="rId16"/>
+      <w:footerReference w:type="default" r:id="rId19"/>
       <w:pgSz w:w="11906" w:h="16838"/>
       <w:pgMar w:top="1417" w:right="1417" w:bottom="1417" w:left="1417" w:header="720" w:footer="720" w:gutter="0"/>
       <w:cols w:space="720"/>
@@ -11730,31 +12539,31 @@
       </w:rPr>
     </w:lvl>
   </w:abstractNum>
-  <w:num w:numId="1" w16cid:durableId="1311248393">
+  <w:num w:numId="1" w16cid:durableId="1422794167">
     <w:abstractNumId w:val="8"/>
   </w:num>
-  <w:num w:numId="2" w16cid:durableId="1178930885">
+  <w:num w:numId="2" w16cid:durableId="1985894047">
     <w:abstractNumId w:val="6"/>
   </w:num>
-  <w:num w:numId="3" w16cid:durableId="1393845949">
+  <w:num w:numId="3" w16cid:durableId="1731339320">
     <w:abstractNumId w:val="5"/>
   </w:num>
-  <w:num w:numId="4" w16cid:durableId="421142612">
+  <w:num w:numId="4" w16cid:durableId="1361588799">
     <w:abstractNumId w:val="4"/>
   </w:num>
-  <w:num w:numId="5" w16cid:durableId="153879489">
+  <w:num w:numId="5" w16cid:durableId="329261577">
     <w:abstractNumId w:val="7"/>
   </w:num>
-  <w:num w:numId="6" w16cid:durableId="650868715">
+  <w:num w:numId="6" w16cid:durableId="1300724672">
     <w:abstractNumId w:val="3"/>
   </w:num>
-  <w:num w:numId="7" w16cid:durableId="622542443">
+  <w:num w:numId="7" w16cid:durableId="1325668263">
     <w:abstractNumId w:val="2"/>
   </w:num>
-  <w:num w:numId="8" w16cid:durableId="1321738427">
+  <w:num w:numId="8" w16cid:durableId="1141310659">
     <w:abstractNumId w:val="1"/>
   </w:num>
-  <w:num w:numId="9" w16cid:durableId="1824813989">
+  <w:num w:numId="9" w16cid:durableId="502355747">
     <w:abstractNumId w:val="0"/>
   </w:num>
 </w:numbering>
@@ -12154,7 +12963,7 @@
       <w:spacing w:after="120" w:line="360" w:lineRule="auto"/>
     </w:pPr>
     <w:rPr>
-      <w:rFonts w:ascii="Arial" w:eastAsia="Arial" w:hAnsi="Arial"/>
+      <w:rFonts w:ascii="Times New Roman" w:eastAsia="Times New Roman" w:hAnsi="Times New Roman" w:cs="Times New Roman"/>
       <w:sz w:val="24"/>
     </w:rPr>
   </w:style>
@@ -12173,7 +12982,6 @@
       <w:outlineLvl w:val="0"/>
     </w:pPr>
     <w:rPr>
-      <w:rFonts w:asciiTheme="majorHAnsi" w:eastAsiaTheme="majorEastAsia" w:hAnsiTheme="majorHAnsi" w:cstheme="majorBidi"/>
       <w:b/>
       <w:bCs/>
       <w:color w:val="1E3A8A"/>
@@ -12197,7 +13005,6 @@
       <w:outlineLvl w:val="1"/>
     </w:pPr>
     <w:rPr>
-      <w:rFonts w:asciiTheme="majorHAnsi" w:eastAsiaTheme="majorEastAsia" w:hAnsiTheme="majorHAnsi" w:cstheme="majorBidi"/>
       <w:b/>
       <w:bCs/>
       <w:color w:val="1E3A8A"/>
@@ -12221,7 +13028,6 @@
       <w:outlineLvl w:val="2"/>
     </w:pPr>
     <w:rPr>
-      <w:rFonts w:asciiTheme="majorHAnsi" w:eastAsiaTheme="majorEastAsia" w:hAnsiTheme="majorHAnsi" w:cstheme="majorBidi"/>
       <w:b/>
       <w:bCs/>
       <w:color w:val="1E3A8A"/>
@@ -23146,7 +23952,7 @@
     <w:autoRedefine/>
     <w:uiPriority w:val="39"/>
     <w:unhideWhenUsed/>
-    <w:rsid w:val="009A3200"/>
+    <w:rsid w:val="00CD1810"/>
     <w:pPr>
       <w:spacing w:after="100"/>
     </w:pPr>
@@ -23158,7 +23964,7 @@
     <w:autoRedefine/>
     <w:uiPriority w:val="39"/>
     <w:unhideWhenUsed/>
-    <w:rsid w:val="009A3200"/>
+    <w:rsid w:val="00CD1810"/>
     <w:pPr>
       <w:spacing w:after="100"/>
       <w:ind w:left="240"/>
@@ -23169,7 +23975,7 @@
     <w:basedOn w:val="Fuentedeprrafopredeter"/>
     <w:uiPriority w:val="99"/>
     <w:unhideWhenUsed/>
-    <w:rsid w:val="009A3200"/>
+    <w:rsid w:val="00CD1810"/>
     <w:rPr>
       <w:color w:val="0000FF" w:themeColor="hyperlink"/>
       <w:u w:val="single"/>

</xml_diff>

<commit_message>
docs: enlace al repositorio de GitHub en README y documentos
Co-Authored-By: Claude Opus 5.5 <noreply@anthropic.com>
</commit_message>
<xml_diff>
--- a/docs/entrega/2_Informe.docx
+++ b/docs/entrega/2_Informe.docx
@@ -56,7 +56,7 @@
           <w:noProof/>
         </w:rPr>
         <w:drawing>
-          <wp:inline distT="0" distB="0" distL="0" distR="0" wp14:anchorId="63F026F8" wp14:editId="0F13F4B4">
+          <wp:inline distT="0" distB="0" distL="0" distR="0" wp14:anchorId="0ECD97A3" wp14:editId="003EF267">
             <wp:extent cx="1872000" cy="2186496"/>
             <wp:effectExtent l="0" t="0" r="0" b="0"/>
             <wp:docPr id="1" name="Picture 1"/>
@@ -285,7 +285,7 @@
       <w:r>
         <w:fldChar w:fldCharType="separate"/>
       </w:r>
-      <w:hyperlink w:anchor="_Toc243401729" w:history="1">
+      <w:hyperlink w:anchor="_Toc243402207" w:history="1">
         <w:r>
           <w:rPr>
             <w:rStyle w:val="Hipervnculo"/>
@@ -312,7 +312,7 @@
             <w:noProof/>
             <w:webHidden/>
           </w:rPr>
-          <w:instrText xml:space="preserve"> PAGEREF _Toc243401729 \h </w:instrText>
+          <w:instrText xml:space="preserve"> PAGEREF _Toc243402207 \h </w:instrText>
         </w:r>
         <w:r>
           <w:rPr>
@@ -358,7 +358,7 @@
           <w14:ligatures w14:val="standardContextual"/>
         </w:rPr>
       </w:pPr>
-      <w:hyperlink w:anchor="_Toc243401730" w:history="1">
+      <w:hyperlink w:anchor="_Toc243402208" w:history="1">
         <w:r>
           <w:rPr>
             <w:rStyle w:val="Hipervnculo"/>
@@ -385,7 +385,7 @@
             <w:noProof/>
             <w:webHidden/>
           </w:rPr>
-          <w:instrText xml:space="preserve"> PAGEREF _Toc243401730 \h </w:instrText>
+          <w:instrText xml:space="preserve"> PAGEREF _Toc243402208 \h </w:instrText>
         </w:r>
         <w:r>
           <w:rPr>
@@ -431,7 +431,7 @@
           <w14:ligatures w14:val="standardContextual"/>
         </w:rPr>
       </w:pPr>
-      <w:hyperlink w:anchor="_Toc243401731" w:history="1">
+      <w:hyperlink w:anchor="_Toc243402209" w:history="1">
         <w:r>
           <w:rPr>
             <w:rStyle w:val="Hipervnculo"/>
@@ -458,7 +458,7 @@
             <w:noProof/>
             <w:webHidden/>
           </w:rPr>
-          <w:instrText xml:space="preserve"> PAGEREF _Toc243401731 \h </w:instrText>
+          <w:instrText xml:space="preserve"> PAGEREF _Toc243402209 \h </w:instrText>
         </w:r>
         <w:r>
           <w:rPr>
@@ -504,7 +504,7 @@
           <w14:ligatures w14:val="standardContextual"/>
         </w:rPr>
       </w:pPr>
-      <w:hyperlink w:anchor="_Toc243401732" w:history="1">
+      <w:hyperlink w:anchor="_Toc243402210" w:history="1">
         <w:r>
           <w:rPr>
             <w:rStyle w:val="Hipervnculo"/>
@@ -531,7 +531,7 @@
             <w:noProof/>
             <w:webHidden/>
           </w:rPr>
-          <w:instrText xml:space="preserve"> PAGEREF _Toc243401732 \h </w:instrText>
+          <w:instrText xml:space="preserve"> PAGEREF _Toc243402210 \h </w:instrText>
         </w:r>
         <w:r>
           <w:rPr>
@@ -577,7 +577,7 @@
           <w14:ligatures w14:val="standardContextual"/>
         </w:rPr>
       </w:pPr>
-      <w:hyperlink w:anchor="_Toc243401733" w:history="1">
+      <w:hyperlink w:anchor="_Toc243402211" w:history="1">
         <w:r>
           <w:rPr>
             <w:rStyle w:val="Hipervnculo"/>
@@ -604,7 +604,7 @@
             <w:noProof/>
             <w:webHidden/>
           </w:rPr>
-          <w:instrText xml:space="preserve"> PAGEREF _Toc243401733 \h </w:instrText>
+          <w:instrText xml:space="preserve"> PAGEREF _Toc243402211 \h </w:instrText>
         </w:r>
         <w:r>
           <w:rPr>
@@ -650,7 +650,7 @@
           <w14:ligatures w14:val="standardContextual"/>
         </w:rPr>
       </w:pPr>
-      <w:hyperlink w:anchor="_Toc243401734" w:history="1">
+      <w:hyperlink w:anchor="_Toc243402212" w:history="1">
         <w:r>
           <w:rPr>
             <w:rStyle w:val="Hipervnculo"/>
@@ -677,7 +677,7 @@
             <w:noProof/>
             <w:webHidden/>
           </w:rPr>
-          <w:instrText xml:space="preserve"> PAGEREF _Toc243401734 \h </w:instrText>
+          <w:instrText xml:space="preserve"> PAGEREF _Toc243402212 \h </w:instrText>
         </w:r>
         <w:r>
           <w:rPr>
@@ -723,7 +723,7 @@
           <w14:ligatures w14:val="standardContextual"/>
         </w:rPr>
       </w:pPr>
-      <w:hyperlink w:anchor="_Toc243401735" w:history="1">
+      <w:hyperlink w:anchor="_Toc243402213" w:history="1">
         <w:r>
           <w:rPr>
             <w:rStyle w:val="Hipervnculo"/>
@@ -750,7 +750,7 @@
             <w:noProof/>
             <w:webHidden/>
           </w:rPr>
-          <w:instrText xml:space="preserve"> PAGEREF _Toc243401735 \h </w:instrText>
+          <w:instrText xml:space="preserve"> PAGEREF _Toc243402213 \h </w:instrText>
         </w:r>
         <w:r>
           <w:rPr>
@@ -796,7 +796,7 @@
           <w14:ligatures w14:val="standardContextual"/>
         </w:rPr>
       </w:pPr>
-      <w:hyperlink w:anchor="_Toc243401736" w:history="1">
+      <w:hyperlink w:anchor="_Toc243402214" w:history="1">
         <w:r>
           <w:rPr>
             <w:rStyle w:val="Hipervnculo"/>
@@ -823,7 +823,7 @@
             <w:noProof/>
             <w:webHidden/>
           </w:rPr>
-          <w:instrText xml:space="preserve"> PAGEREF _Toc243401736 \h </w:instrText>
+          <w:instrText xml:space="preserve"> PAGEREF _Toc243402214 \h </w:instrText>
         </w:r>
         <w:r>
           <w:rPr>
@@ -869,7 +869,7 @@
           <w14:ligatures w14:val="standardContextual"/>
         </w:rPr>
       </w:pPr>
-      <w:hyperlink w:anchor="_Toc243401737" w:history="1">
+      <w:hyperlink w:anchor="_Toc243402215" w:history="1">
         <w:r>
           <w:rPr>
             <w:rStyle w:val="Hipervnculo"/>
@@ -896,7 +896,7 @@
             <w:noProof/>
             <w:webHidden/>
           </w:rPr>
-          <w:instrText xml:space="preserve"> PAGEREF _Toc243401737 \h </w:instrText>
+          <w:instrText xml:space="preserve"> PAGEREF _Toc243402215 \h </w:instrText>
         </w:r>
         <w:r>
           <w:rPr>
@@ -942,7 +942,7 @@
           <w14:ligatures w14:val="standardContextual"/>
         </w:rPr>
       </w:pPr>
-      <w:hyperlink w:anchor="_Toc243401738" w:history="1">
+      <w:hyperlink w:anchor="_Toc243402216" w:history="1">
         <w:r>
           <w:rPr>
             <w:rStyle w:val="Hipervnculo"/>
@@ -969,7 +969,7 @@
             <w:noProof/>
             <w:webHidden/>
           </w:rPr>
-          <w:instrText xml:space="preserve"> PAGEREF _Toc243401738 \h </w:instrText>
+          <w:instrText xml:space="preserve"> PAGEREF _Toc243402216 \h </w:instrText>
         </w:r>
         <w:r>
           <w:rPr>
@@ -1015,7 +1015,7 @@
           <w14:ligatures w14:val="standardContextual"/>
         </w:rPr>
       </w:pPr>
-      <w:hyperlink w:anchor="_Toc243401739" w:history="1">
+      <w:hyperlink w:anchor="_Toc243402217" w:history="1">
         <w:r>
           <w:rPr>
             <w:rStyle w:val="Hipervnculo"/>
@@ -1042,7 +1042,7 @@
             <w:noProof/>
             <w:webHidden/>
           </w:rPr>
-          <w:instrText xml:space="preserve"> PAGEREF _Toc243401739 \h </w:instrText>
+          <w:instrText xml:space="preserve"> PAGEREF _Toc243402217 \h </w:instrText>
         </w:r>
         <w:r>
           <w:rPr>
@@ -1088,7 +1088,7 @@
           <w14:ligatures w14:val="standardContextual"/>
         </w:rPr>
       </w:pPr>
-      <w:hyperlink w:anchor="_Toc243401740" w:history="1">
+      <w:hyperlink w:anchor="_Toc243402218" w:history="1">
         <w:r>
           <w:rPr>
             <w:rStyle w:val="Hipervnculo"/>
@@ -1115,7 +1115,7 @@
             <w:noProof/>
             <w:webHidden/>
           </w:rPr>
-          <w:instrText xml:space="preserve"> PAGEREF _Toc243401740 \h </w:instrText>
+          <w:instrText xml:space="preserve"> PAGEREF _Toc243402218 \h </w:instrText>
         </w:r>
         <w:r>
           <w:rPr>
@@ -1161,7 +1161,7 @@
           <w14:ligatures w14:val="standardContextual"/>
         </w:rPr>
       </w:pPr>
-      <w:hyperlink w:anchor="_Toc243401741" w:history="1">
+      <w:hyperlink w:anchor="_Toc243402219" w:history="1">
         <w:r>
           <w:rPr>
             <w:rStyle w:val="Hipervnculo"/>
@@ -1188,7 +1188,7 @@
             <w:noProof/>
             <w:webHidden/>
           </w:rPr>
-          <w:instrText xml:space="preserve"> PAGEREF _Toc243401741 \h </w:instrText>
+          <w:instrText xml:space="preserve"> PAGEREF _Toc243402219 \h </w:instrText>
         </w:r>
         <w:r>
           <w:rPr>
@@ -1234,7 +1234,7 @@
           <w14:ligatures w14:val="standardContextual"/>
         </w:rPr>
       </w:pPr>
-      <w:hyperlink w:anchor="_Toc243401742" w:history="1">
+      <w:hyperlink w:anchor="_Toc243402220" w:history="1">
         <w:r>
           <w:rPr>
             <w:rStyle w:val="Hipervnculo"/>
@@ -1261,7 +1261,7 @@
             <w:noProof/>
             <w:webHidden/>
           </w:rPr>
-          <w:instrText xml:space="preserve"> PAGEREF _Toc243401742 \h </w:instrText>
+          <w:instrText xml:space="preserve"> PAGEREF _Toc243402220 \h </w:instrText>
         </w:r>
         <w:r>
           <w:rPr>
@@ -1307,7 +1307,7 @@
           <w14:ligatures w14:val="standardContextual"/>
         </w:rPr>
       </w:pPr>
-      <w:hyperlink w:anchor="_Toc243401743" w:history="1">
+      <w:hyperlink w:anchor="_Toc243402221" w:history="1">
         <w:r>
           <w:rPr>
             <w:rStyle w:val="Hipervnculo"/>
@@ -1334,7 +1334,7 @@
             <w:noProof/>
             <w:webHidden/>
           </w:rPr>
-          <w:instrText xml:space="preserve"> PAGEREF _Toc243401743 \h </w:instrText>
+          <w:instrText xml:space="preserve"> PAGEREF _Toc243402221 \h </w:instrText>
         </w:r>
         <w:r>
           <w:rPr>
@@ -1380,7 +1380,7 @@
           <w14:ligatures w14:val="standardContextual"/>
         </w:rPr>
       </w:pPr>
-      <w:hyperlink w:anchor="_Toc243401744" w:history="1">
+      <w:hyperlink w:anchor="_Toc243402222" w:history="1">
         <w:r>
           <w:rPr>
             <w:rStyle w:val="Hipervnculo"/>
@@ -1407,7 +1407,7 @@
             <w:noProof/>
             <w:webHidden/>
           </w:rPr>
-          <w:instrText xml:space="preserve"> PAGEREF _Toc243401744 \h </w:instrText>
+          <w:instrText xml:space="preserve"> PAGEREF _Toc243402222 \h </w:instrText>
         </w:r>
         <w:r>
           <w:rPr>
@@ -1453,7 +1453,7 @@
           <w14:ligatures w14:val="standardContextual"/>
         </w:rPr>
       </w:pPr>
-      <w:hyperlink w:anchor="_Toc243401745" w:history="1">
+      <w:hyperlink w:anchor="_Toc243402223" w:history="1">
         <w:r>
           <w:rPr>
             <w:rStyle w:val="Hipervnculo"/>
@@ -1480,7 +1480,7 @@
             <w:noProof/>
             <w:webHidden/>
           </w:rPr>
-          <w:instrText xml:space="preserve"> PAGEREF _Toc243401745 \h </w:instrText>
+          <w:instrText xml:space="preserve"> PAGEREF _Toc243402223 \h </w:instrText>
         </w:r>
         <w:r>
           <w:rPr>
@@ -1526,7 +1526,7 @@
           <w14:ligatures w14:val="standardContextual"/>
         </w:rPr>
       </w:pPr>
-      <w:hyperlink w:anchor="_Toc243401746" w:history="1">
+      <w:hyperlink w:anchor="_Toc243402224" w:history="1">
         <w:r>
           <w:rPr>
             <w:rStyle w:val="Hipervnculo"/>
@@ -1553,7 +1553,7 @@
             <w:noProof/>
             <w:webHidden/>
           </w:rPr>
-          <w:instrText xml:space="preserve"> PAGEREF _Toc243401746 \h </w:instrText>
+          <w:instrText xml:space="preserve"> PAGEREF _Toc243402224 \h </w:instrText>
         </w:r>
         <w:r>
           <w:rPr>
@@ -1599,7 +1599,7 @@
           <w14:ligatures w14:val="standardContextual"/>
         </w:rPr>
       </w:pPr>
-      <w:hyperlink w:anchor="_Toc243401747" w:history="1">
+      <w:hyperlink w:anchor="_Toc243402225" w:history="1">
         <w:r>
           <w:rPr>
             <w:rStyle w:val="Hipervnculo"/>
@@ -1626,7 +1626,7 @@
             <w:noProof/>
             <w:webHidden/>
           </w:rPr>
-          <w:instrText xml:space="preserve"> PAGEREF _Toc243401747 \h </w:instrText>
+          <w:instrText xml:space="preserve"> PAGEREF _Toc243402225 \h </w:instrText>
         </w:r>
         <w:r>
           <w:rPr>
@@ -1672,7 +1672,7 @@
           <w14:ligatures w14:val="standardContextual"/>
         </w:rPr>
       </w:pPr>
-      <w:hyperlink w:anchor="_Toc243401748" w:history="1">
+      <w:hyperlink w:anchor="_Toc243402226" w:history="1">
         <w:r>
           <w:rPr>
             <w:rStyle w:val="Hipervnculo"/>
@@ -1699,7 +1699,7 @@
             <w:noProof/>
             <w:webHidden/>
           </w:rPr>
-          <w:instrText xml:space="preserve"> PAGEREF _Toc243401748 \h </w:instrText>
+          <w:instrText xml:space="preserve"> PAGEREF _Toc243402226 \h </w:instrText>
         </w:r>
         <w:r>
           <w:rPr>
@@ -1745,7 +1745,7 @@
           <w14:ligatures w14:val="standardContextual"/>
         </w:rPr>
       </w:pPr>
-      <w:hyperlink w:anchor="_Toc243401749" w:history="1">
+      <w:hyperlink w:anchor="_Toc243402227" w:history="1">
         <w:r>
           <w:rPr>
             <w:rStyle w:val="Hipervnculo"/>
@@ -1772,7 +1772,7 @@
             <w:noProof/>
             <w:webHidden/>
           </w:rPr>
-          <w:instrText xml:space="preserve"> PAGEREF _Toc243401749 \h </w:instrText>
+          <w:instrText xml:space="preserve"> PAGEREF _Toc243402227 \h </w:instrText>
         </w:r>
         <w:r>
           <w:rPr>
@@ -1818,7 +1818,7 @@
           <w14:ligatures w14:val="standardContextual"/>
         </w:rPr>
       </w:pPr>
-      <w:hyperlink w:anchor="_Toc243401750" w:history="1">
+      <w:hyperlink w:anchor="_Toc243402228" w:history="1">
         <w:r>
           <w:rPr>
             <w:rStyle w:val="Hipervnculo"/>
@@ -1845,7 +1845,7 @@
             <w:noProof/>
             <w:webHidden/>
           </w:rPr>
-          <w:instrText xml:space="preserve"> PAGEREF _Toc243401750 \h </w:instrText>
+          <w:instrText xml:space="preserve"> PAGEREF _Toc243402228 \h </w:instrText>
         </w:r>
         <w:r>
           <w:rPr>
@@ -1891,7 +1891,7 @@
           <w14:ligatures w14:val="standardContextual"/>
         </w:rPr>
       </w:pPr>
-      <w:hyperlink w:anchor="_Toc243401751" w:history="1">
+      <w:hyperlink w:anchor="_Toc243402229" w:history="1">
         <w:r>
           <w:rPr>
             <w:rStyle w:val="Hipervnculo"/>
@@ -1918,7 +1918,7 @@
             <w:noProof/>
             <w:webHidden/>
           </w:rPr>
-          <w:instrText xml:space="preserve"> PAGEREF _Toc243401751 \h </w:instrText>
+          <w:instrText xml:space="preserve"> PAGEREF _Toc243402229 \h </w:instrText>
         </w:r>
         <w:r>
           <w:rPr>
@@ -1964,7 +1964,7 @@
           <w14:ligatures w14:val="standardContextual"/>
         </w:rPr>
       </w:pPr>
-      <w:hyperlink w:anchor="_Toc243401752" w:history="1">
+      <w:hyperlink w:anchor="_Toc243402230" w:history="1">
         <w:r>
           <w:rPr>
             <w:rStyle w:val="Hipervnculo"/>
@@ -1991,7 +1991,7 @@
             <w:noProof/>
             <w:webHidden/>
           </w:rPr>
-          <w:instrText xml:space="preserve"> PAGEREF _Toc243401752 \h </w:instrText>
+          <w:instrText xml:space="preserve"> PAGEREF _Toc243402230 \h </w:instrText>
         </w:r>
         <w:r>
           <w:rPr>
@@ -2037,7 +2037,7 @@
           <w14:ligatures w14:val="standardContextual"/>
         </w:rPr>
       </w:pPr>
-      <w:hyperlink w:anchor="_Toc243401753" w:history="1">
+      <w:hyperlink w:anchor="_Toc243402231" w:history="1">
         <w:r>
           <w:rPr>
             <w:rStyle w:val="Hipervnculo"/>
@@ -2064,7 +2064,7 @@
             <w:noProof/>
             <w:webHidden/>
           </w:rPr>
-          <w:instrText xml:space="preserve"> PAGEREF _Toc243401753 \h </w:instrText>
+          <w:instrText xml:space="preserve"> PAGEREF _Toc243402231 \h </w:instrText>
         </w:r>
         <w:r>
           <w:rPr>
@@ -2110,7 +2110,7 @@
           <w14:ligatures w14:val="standardContextual"/>
         </w:rPr>
       </w:pPr>
-      <w:hyperlink w:anchor="_Toc243401754" w:history="1">
+      <w:hyperlink w:anchor="_Toc243402232" w:history="1">
         <w:r>
           <w:rPr>
             <w:rStyle w:val="Hipervnculo"/>
@@ -2137,7 +2137,7 @@
             <w:noProof/>
             <w:webHidden/>
           </w:rPr>
-          <w:instrText xml:space="preserve"> PAGEREF _Toc243401754 \h </w:instrText>
+          <w:instrText xml:space="preserve"> PAGEREF _Toc243402232 \h </w:instrText>
         </w:r>
         <w:r>
           <w:rPr>
@@ -2183,7 +2183,7 @@
           <w14:ligatures w14:val="standardContextual"/>
         </w:rPr>
       </w:pPr>
-      <w:hyperlink w:anchor="_Toc243401755" w:history="1">
+      <w:hyperlink w:anchor="_Toc243402233" w:history="1">
         <w:r>
           <w:rPr>
             <w:rStyle w:val="Hipervnculo"/>
@@ -2210,7 +2210,7 @@
             <w:noProof/>
             <w:webHidden/>
           </w:rPr>
-          <w:instrText xml:space="preserve"> PAGEREF _Toc243401755 \h </w:instrText>
+          <w:instrText xml:space="preserve"> PAGEREF _Toc243402233 \h </w:instrText>
         </w:r>
         <w:r>
           <w:rPr>
@@ -2256,7 +2256,7 @@
           <w14:ligatures w14:val="standardContextual"/>
         </w:rPr>
       </w:pPr>
-      <w:hyperlink w:anchor="_Toc243401756" w:history="1">
+      <w:hyperlink w:anchor="_Toc243402234" w:history="1">
         <w:r>
           <w:rPr>
             <w:rStyle w:val="Hipervnculo"/>
@@ -2283,7 +2283,7 @@
             <w:noProof/>
             <w:webHidden/>
           </w:rPr>
-          <w:instrText xml:space="preserve"> PAGEREF _Toc243401756 \h </w:instrText>
+          <w:instrText xml:space="preserve"> PAGEREF _Toc243402234 \h </w:instrText>
         </w:r>
         <w:r>
           <w:rPr>
@@ -2329,7 +2329,7 @@
           <w14:ligatures w14:val="standardContextual"/>
         </w:rPr>
       </w:pPr>
-      <w:hyperlink w:anchor="_Toc243401757" w:history="1">
+      <w:hyperlink w:anchor="_Toc243402235" w:history="1">
         <w:r>
           <w:rPr>
             <w:rStyle w:val="Hipervnculo"/>
@@ -2356,7 +2356,7 @@
             <w:noProof/>
             <w:webHidden/>
           </w:rPr>
-          <w:instrText xml:space="preserve"> PAGEREF _Toc243401757 \h </w:instrText>
+          <w:instrText xml:space="preserve"> PAGEREF _Toc243402235 \h </w:instrText>
         </w:r>
         <w:r>
           <w:rPr>
@@ -2402,7 +2402,7 @@
           <w14:ligatures w14:val="standardContextual"/>
         </w:rPr>
       </w:pPr>
-      <w:hyperlink w:anchor="_Toc243401758" w:history="1">
+      <w:hyperlink w:anchor="_Toc243402236" w:history="1">
         <w:r>
           <w:rPr>
             <w:rStyle w:val="Hipervnculo"/>
@@ -2429,7 +2429,7 @@
             <w:noProof/>
             <w:webHidden/>
           </w:rPr>
-          <w:instrText xml:space="preserve"> PAGEREF _Toc243401758 \h </w:instrText>
+          <w:instrText xml:space="preserve"> PAGEREF _Toc243402236 \h </w:instrText>
         </w:r>
         <w:r>
           <w:rPr>
@@ -2475,7 +2475,7 @@
           <w14:ligatures w14:val="standardContextual"/>
         </w:rPr>
       </w:pPr>
-      <w:hyperlink w:anchor="_Toc243401759" w:history="1">
+      <w:hyperlink w:anchor="_Toc243402237" w:history="1">
         <w:r>
           <w:rPr>
             <w:rStyle w:val="Hipervnculo"/>
@@ -2502,7 +2502,7 @@
             <w:noProof/>
             <w:webHidden/>
           </w:rPr>
-          <w:instrText xml:space="preserve"> PAGEREF _Toc243401759 \h </w:instrText>
+          <w:instrText xml:space="preserve"> PAGEREF _Toc243402237 \h </w:instrText>
         </w:r>
         <w:r>
           <w:rPr>
@@ -2548,7 +2548,7 @@
           <w14:ligatures w14:val="standardContextual"/>
         </w:rPr>
       </w:pPr>
-      <w:hyperlink w:anchor="_Toc243401760" w:history="1">
+      <w:hyperlink w:anchor="_Toc243402238" w:history="1">
         <w:r>
           <w:rPr>
             <w:rStyle w:val="Hipervnculo"/>
@@ -2575,7 +2575,7 @@
             <w:noProof/>
             <w:webHidden/>
           </w:rPr>
-          <w:instrText xml:space="preserve"> PAGEREF _Toc243401760 \h </w:instrText>
+          <w:instrText xml:space="preserve"> PAGEREF _Toc243402238 \h </w:instrText>
         </w:r>
         <w:r>
           <w:rPr>
@@ -2621,7 +2621,7 @@
           <w14:ligatures w14:val="standardContextual"/>
         </w:rPr>
       </w:pPr>
-      <w:hyperlink w:anchor="_Toc243401761" w:history="1">
+      <w:hyperlink w:anchor="_Toc243402239" w:history="1">
         <w:r>
           <w:rPr>
             <w:rStyle w:val="Hipervnculo"/>
@@ -2648,7 +2648,7 @@
             <w:noProof/>
             <w:webHidden/>
           </w:rPr>
-          <w:instrText xml:space="preserve"> PAGEREF _Toc243401761 \h </w:instrText>
+          <w:instrText xml:space="preserve"> PAGEREF _Toc243402239 \h </w:instrText>
         </w:r>
         <w:r>
           <w:rPr>
@@ -2694,7 +2694,7 @@
           <w14:ligatures w14:val="standardContextual"/>
         </w:rPr>
       </w:pPr>
-      <w:hyperlink w:anchor="_Toc243401762" w:history="1">
+      <w:hyperlink w:anchor="_Toc243402240" w:history="1">
         <w:r>
           <w:rPr>
             <w:rStyle w:val="Hipervnculo"/>
@@ -2721,7 +2721,7 @@
             <w:noProof/>
             <w:webHidden/>
           </w:rPr>
-          <w:instrText xml:space="preserve"> PAGEREF _Toc243401762 \h </w:instrText>
+          <w:instrText xml:space="preserve"> PAGEREF _Toc243402240 \h </w:instrText>
         </w:r>
         <w:r>
           <w:rPr>
@@ -2767,7 +2767,7 @@
           <w14:ligatures w14:val="standardContextual"/>
         </w:rPr>
       </w:pPr>
-      <w:hyperlink w:anchor="_Toc243401763" w:history="1">
+      <w:hyperlink w:anchor="_Toc243402241" w:history="1">
         <w:r>
           <w:rPr>
             <w:rStyle w:val="Hipervnculo"/>
@@ -2794,7 +2794,7 @@
             <w:noProof/>
             <w:webHidden/>
           </w:rPr>
-          <w:instrText xml:space="preserve"> PAGEREF _Toc243401763 \h </w:instrText>
+          <w:instrText xml:space="preserve"> PAGEREF _Toc243402241 \h </w:instrText>
         </w:r>
         <w:r>
           <w:rPr>
@@ -2840,7 +2840,7 @@
           <w14:ligatures w14:val="standardContextual"/>
         </w:rPr>
       </w:pPr>
-      <w:hyperlink w:anchor="_Toc243401764" w:history="1">
+      <w:hyperlink w:anchor="_Toc243402242" w:history="1">
         <w:r>
           <w:rPr>
             <w:rStyle w:val="Hipervnculo"/>
@@ -2867,7 +2867,7 @@
             <w:noProof/>
             <w:webHidden/>
           </w:rPr>
-          <w:instrText xml:space="preserve"> PAGEREF _Toc243401764 \h </w:instrText>
+          <w:instrText xml:space="preserve"> PAGEREF _Toc243402242 \h </w:instrText>
         </w:r>
         <w:r>
           <w:rPr>
@@ -2913,7 +2913,7 @@
           <w14:ligatures w14:val="standardContextual"/>
         </w:rPr>
       </w:pPr>
-      <w:hyperlink w:anchor="_Toc243401765" w:history="1">
+      <w:hyperlink w:anchor="_Toc243402243" w:history="1">
         <w:r>
           <w:rPr>
             <w:rStyle w:val="Hipervnculo"/>
@@ -2940,7 +2940,7 @@
             <w:noProof/>
             <w:webHidden/>
           </w:rPr>
-          <w:instrText xml:space="preserve"> PAGEREF _Toc243401765 \h </w:instrText>
+          <w:instrText xml:space="preserve"> PAGEREF _Toc243402243 \h </w:instrText>
         </w:r>
         <w:r>
           <w:rPr>
@@ -2986,7 +2986,7 @@
           <w14:ligatures w14:val="standardContextual"/>
         </w:rPr>
       </w:pPr>
-      <w:hyperlink w:anchor="_Toc243401766" w:history="1">
+      <w:hyperlink w:anchor="_Toc243402244" w:history="1">
         <w:r>
           <w:rPr>
             <w:rStyle w:val="Hipervnculo"/>
@@ -3013,7 +3013,7 @@
             <w:noProof/>
             <w:webHidden/>
           </w:rPr>
-          <w:instrText xml:space="preserve"> PAGEREF _Toc243401766 \h </w:instrText>
+          <w:instrText xml:space="preserve"> PAGEREF _Toc243402244 \h </w:instrText>
         </w:r>
         <w:r>
           <w:rPr>
@@ -3059,7 +3059,7 @@
           <w14:ligatures w14:val="standardContextual"/>
         </w:rPr>
       </w:pPr>
-      <w:hyperlink w:anchor="_Toc243401767" w:history="1">
+      <w:hyperlink w:anchor="_Toc243402245" w:history="1">
         <w:r>
           <w:rPr>
             <w:rStyle w:val="Hipervnculo"/>
@@ -3086,7 +3086,7 @@
             <w:noProof/>
             <w:webHidden/>
           </w:rPr>
-          <w:instrText xml:space="preserve"> PAGEREF _Toc243401767 \h </w:instrText>
+          <w:instrText xml:space="preserve"> PAGEREF _Toc243402245 \h </w:instrText>
         </w:r>
         <w:r>
           <w:rPr>
@@ -3132,7 +3132,7 @@
           <w14:ligatures w14:val="standardContextual"/>
         </w:rPr>
       </w:pPr>
-      <w:hyperlink w:anchor="_Toc243401768" w:history="1">
+      <w:hyperlink w:anchor="_Toc243402246" w:history="1">
         <w:r>
           <w:rPr>
             <w:rStyle w:val="Hipervnculo"/>
@@ -3159,7 +3159,7 @@
             <w:noProof/>
             <w:webHidden/>
           </w:rPr>
-          <w:instrText xml:space="preserve"> PAGEREF _Toc243401768 \h </w:instrText>
+          <w:instrText xml:space="preserve"> PAGEREF _Toc243402246 \h </w:instrText>
         </w:r>
         <w:r>
           <w:rPr>
@@ -3205,7 +3205,7 @@
           <w14:ligatures w14:val="standardContextual"/>
         </w:rPr>
       </w:pPr>
-      <w:hyperlink w:anchor="_Toc243401769" w:history="1">
+      <w:hyperlink w:anchor="_Toc243402247" w:history="1">
         <w:r>
           <w:rPr>
             <w:rStyle w:val="Hipervnculo"/>
@@ -3232,7 +3232,7 @@
             <w:noProof/>
             <w:webHidden/>
           </w:rPr>
-          <w:instrText xml:space="preserve"> PAGEREF _Toc243401769 \h </w:instrText>
+          <w:instrText xml:space="preserve"> PAGEREF _Toc243402247 \h </w:instrText>
         </w:r>
         <w:r>
           <w:rPr>
@@ -3277,7 +3277,7 @@
       <w:pPr>
         <w:pStyle w:val="Ttulo1"/>
       </w:pPr>
-      <w:bookmarkStart w:id="0" w:name="_Toc243401729"/>
+      <w:bookmarkStart w:id="0" w:name="_Toc243402207"/>
       <w:r>
         <w:lastRenderedPageBreak/>
         <w:t>2. Resumen</w:t>
@@ -3313,7 +3313,7 @@
       <w:pPr>
         <w:pStyle w:val="Ttulo1"/>
       </w:pPr>
-      <w:bookmarkStart w:id="1" w:name="_Toc243401730"/>
+      <w:bookmarkStart w:id="1" w:name="_Toc243402208"/>
       <w:r>
         <w:t>3. Introducción</w:t>
       </w:r>
@@ -3323,7 +3323,7 @@
       <w:pPr>
         <w:pStyle w:val="Ttulo2"/>
       </w:pPr>
-      <w:bookmarkStart w:id="2" w:name="_Toc243401731"/>
+      <w:bookmarkStart w:id="2" w:name="_Toc243402209"/>
       <w:r>
         <w:t>3.1 Contexto</w:t>
       </w:r>
@@ -3341,7 +3341,7 @@
       <w:pPr>
         <w:pStyle w:val="Ttulo2"/>
       </w:pPr>
-      <w:bookmarkStart w:id="3" w:name="_Toc243401732"/>
+      <w:bookmarkStart w:id="3" w:name="_Toc243402210"/>
       <w:r>
         <w:t>3.2 Problema</w:t>
       </w:r>
@@ -3359,7 +3359,7 @@
       <w:pPr>
         <w:pStyle w:val="Ttulo2"/>
       </w:pPr>
-      <w:bookmarkStart w:id="4" w:name="_Toc243401733"/>
+      <w:bookmarkStart w:id="4" w:name="_Toc243402211"/>
       <w:r>
         <w:lastRenderedPageBreak/>
         <w:t>3.3 Justificación</w:t>
@@ -3378,7 +3378,7 @@
       <w:pPr>
         <w:pStyle w:val="Ttulo2"/>
       </w:pPr>
-      <w:bookmarkStart w:id="5" w:name="_Toc243401734"/>
+      <w:bookmarkStart w:id="5" w:name="_Toc243402212"/>
       <w:r>
         <w:t>3.4 Objetivos</w:t>
       </w:r>
@@ -3521,7 +3521,7 @@
       <w:pPr>
         <w:pStyle w:val="Ttulo2"/>
       </w:pPr>
-      <w:bookmarkStart w:id="6" w:name="_Toc243401735"/>
+      <w:bookmarkStart w:id="6" w:name="_Toc243402213"/>
       <w:r>
         <w:t>3.5 Alcance y limitaciones</w:t>
       </w:r>
@@ -3547,7 +3547,7 @@
       <w:pPr>
         <w:pStyle w:val="Ttulo1"/>
       </w:pPr>
-      <w:bookmarkStart w:id="7" w:name="_Toc243401736"/>
+      <w:bookmarkStart w:id="7" w:name="_Toc243402214"/>
       <w:r>
         <w:lastRenderedPageBreak/>
         <w:t>4. Marco teórico</w:t>
@@ -3558,7 +3558,7 @@
       <w:pPr>
         <w:pStyle w:val="Ttulo2"/>
       </w:pPr>
-      <w:bookmarkStart w:id="8" w:name="_Toc243401737"/>
+      <w:bookmarkStart w:id="8" w:name="_Toc243402215"/>
       <w:r>
         <w:t>4.1 Coordenadas homogéneas</w:t>
       </w:r>
@@ -3599,7 +3599,7 @@
       <w:pPr>
         <w:pStyle w:val="Ttulo2"/>
       </w:pPr>
-      <w:bookmarkStart w:id="9" w:name="_Toc243401738"/>
+      <w:bookmarkStart w:id="9" w:name="_Toc243402216"/>
       <w:r>
         <w:t>4.2 Matrices de traslación, rotación y escalado</w:t>
       </w:r>
@@ -4620,7 +4620,7 @@
       <w:pPr>
         <w:pStyle w:val="Ttulo2"/>
       </w:pPr>
-      <w:bookmarkStart w:id="10" w:name="_Toc243401739"/>
+      <w:bookmarkStart w:id="10" w:name="_Toc243402217"/>
       <w:r>
         <w:t>4.3 Composición de transformaciones</w:t>
       </w:r>
@@ -4669,7 +4669,7 @@
       <w:pPr>
         <w:pStyle w:val="Ttulo2"/>
       </w:pPr>
-      <w:bookmarkStart w:id="11" w:name="_Toc243401740"/>
+      <w:bookmarkStart w:id="11" w:name="_Toc243402218"/>
       <w:r>
         <w:lastRenderedPageBreak/>
         <w:t>4.4 Transformación respecto a un pivote</w:t>
@@ -4970,7 +4970,7 @@
       <w:pPr>
         <w:pStyle w:val="Ttulo2"/>
       </w:pPr>
-      <w:bookmarkStart w:id="12" w:name="_Toc243401741"/>
+      <w:bookmarkStart w:id="12" w:name="_Toc243402219"/>
       <w:r>
         <w:t>4.5 Determinante y área</w:t>
       </w:r>
@@ -5029,7 +5029,7 @@
       <w:pPr>
         <w:pStyle w:val="Ttulo2"/>
       </w:pPr>
-      <w:bookmarkStart w:id="13" w:name="_Toc243401742"/>
+      <w:bookmarkStart w:id="13" w:name="_Toc243402220"/>
       <w:r>
         <w:t>4.6 Transformación de viewport</w:t>
       </w:r>
@@ -5487,7 +5487,7 @@
       <w:pPr>
         <w:pStyle w:val="Ttulo2"/>
       </w:pPr>
-      <w:bookmarkStart w:id="14" w:name="_Toc243401743"/>
+      <w:bookmarkStart w:id="14" w:name="_Toc243402221"/>
       <w:r>
         <w:t>4.7 Rasterización con Canvas 2D</w:t>
       </w:r>
@@ -5505,7 +5505,7 @@
       <w:pPr>
         <w:pStyle w:val="Ttulo1"/>
       </w:pPr>
-      <w:bookmarkStart w:id="15" w:name="_Toc243401744"/>
+      <w:bookmarkStart w:id="15" w:name="_Toc243402222"/>
       <w:r>
         <w:lastRenderedPageBreak/>
         <w:t>5. Análisis y diseño</w:t>
@@ -5516,7 +5516,7 @@
       <w:pPr>
         <w:pStyle w:val="Ttulo2"/>
       </w:pPr>
-      <w:bookmarkStart w:id="16" w:name="_Toc243401745"/>
+      <w:bookmarkStart w:id="16" w:name="_Toc243402223"/>
       <w:r>
         <w:t>5.1 Requisitos</w:t>
       </w:r>
@@ -6714,7 +6714,7 @@
       <w:pPr>
         <w:pStyle w:val="Ttulo2"/>
       </w:pPr>
-      <w:bookmarkStart w:id="17" w:name="_Toc243401746"/>
+      <w:bookmarkStart w:id="17" w:name="_Toc243402224"/>
       <w:r>
         <w:t>5.2 Diagrama de módulos</w:t>
       </w:r>
@@ -6764,7 +6764,7 @@
           <w:noProof/>
         </w:rPr>
         <w:drawing>
-          <wp:inline distT="0" distB="0" distL="0" distR="0" wp14:anchorId="0B9F537E" wp14:editId="7A52C1CA">
+          <wp:inline distT="0" distB="0" distL="0" distR="0" wp14:anchorId="09E61703" wp14:editId="5B0D8D68">
             <wp:extent cx="5760000" cy="3936536"/>
             <wp:effectExtent l="0" t="0" r="0" b="0"/>
             <wp:docPr id="2" name="Picture 2"/>
@@ -6822,7 +6822,7 @@
       <w:pPr>
         <w:pStyle w:val="Ttulo2"/>
       </w:pPr>
-      <w:bookmarkStart w:id="18" w:name="_Toc243401747"/>
+      <w:bookmarkStart w:id="18" w:name="_Toc243402225"/>
       <w:r>
         <w:t>5.3 Pipeline gráfico</w:t>
       </w:r>
@@ -6863,7 +6863,7 @@
           <w:noProof/>
         </w:rPr>
         <w:drawing>
-          <wp:inline distT="0" distB="0" distL="0" distR="0" wp14:anchorId="53E16B5A" wp14:editId="09E03709">
+          <wp:inline distT="0" distB="0" distL="0" distR="0" wp14:anchorId="31F6A34B" wp14:editId="5DE33A9A">
             <wp:extent cx="5760000" cy="1060950"/>
             <wp:effectExtent l="0" t="0" r="0" b="0"/>
             <wp:docPr id="3" name="Picture 3"/>
@@ -6921,7 +6921,7 @@
       <w:pPr>
         <w:pStyle w:val="Ttulo2"/>
       </w:pPr>
-      <w:bookmarkStart w:id="19" w:name="_Toc243401748"/>
+      <w:bookmarkStart w:id="19" w:name="_Toc243402226"/>
       <w:r>
         <w:t>5.4 Boceto de la interfaz</w:t>
       </w:r>
@@ -6971,7 +6971,7 @@
           <w:noProof/>
         </w:rPr>
         <w:drawing>
-          <wp:inline distT="0" distB="0" distL="0" distR="0" wp14:anchorId="79AC17DA" wp14:editId="5A1C0041">
+          <wp:inline distT="0" distB="0" distL="0" distR="0" wp14:anchorId="714C1549" wp14:editId="0ED98E94">
             <wp:extent cx="5040000" cy="3249721"/>
             <wp:effectExtent l="0" t="0" r="0" b="0"/>
             <wp:docPr id="4" name="Picture 4"/>
@@ -7029,7 +7029,7 @@
       <w:pPr>
         <w:pStyle w:val="Ttulo1"/>
       </w:pPr>
-      <w:bookmarkStart w:id="20" w:name="_Toc243401749"/>
+      <w:bookmarkStart w:id="20" w:name="_Toc243402227"/>
       <w:r>
         <w:t>6. Implementación</w:t>
       </w:r>
@@ -7039,7 +7039,7 @@
       <w:pPr>
         <w:pStyle w:val="Ttulo2"/>
       </w:pPr>
-      <w:bookmarkStart w:id="21" w:name="_Toc243401750"/>
+      <w:bookmarkStart w:id="21" w:name="_Toc243402228"/>
       <w:r>
         <w:t>6.1 Tecnologías</w:t>
       </w:r>
@@ -7350,7 +7350,7 @@
       <w:pPr>
         <w:pStyle w:val="Ttulo2"/>
       </w:pPr>
-      <w:bookmarkStart w:id="22" w:name="_Toc243401751"/>
+      <w:bookmarkStart w:id="22" w:name="_Toc243402229"/>
       <w:r>
         <w:t>6.2 Módulos principales</w:t>
       </w:r>
@@ -7948,7 +7948,7 @@
       <w:pPr>
         <w:pStyle w:val="Ttulo2"/>
       </w:pPr>
-      <w:bookmarkStart w:id="23" w:name="_Toc243401752"/>
+      <w:bookmarkStart w:id="23" w:name="_Toc243402230"/>
       <w:r>
         <w:t>6.3 Fragmentos clave</w:t>
       </w:r>
@@ -8885,7 +8885,7 @@
       <w:pPr>
         <w:pStyle w:val="Ttulo2"/>
       </w:pPr>
-      <w:bookmarkStart w:id="24" w:name="_Toc243401753"/>
+      <w:bookmarkStart w:id="24" w:name="_Toc243402231"/>
       <w:r>
         <w:lastRenderedPageBreak/>
         <w:t>6.4 Interfaz resultante</w:t>
@@ -8927,7 +8927,7 @@
           <w:noProof/>
         </w:rPr>
         <w:drawing>
-          <wp:inline distT="0" distB="0" distL="0" distR="0" wp14:anchorId="7F429367" wp14:editId="381DD5CC">
+          <wp:inline distT="0" distB="0" distL="0" distR="0" wp14:anchorId="4B3F7D63" wp14:editId="5DBA0C97">
             <wp:extent cx="5760000" cy="3600000"/>
             <wp:effectExtent l="0" t="0" r="0" b="0"/>
             <wp:docPr id="5" name="Picture 5"/>
@@ -9017,7 +9017,7 @@
           <w:noProof/>
         </w:rPr>
         <w:drawing>
-          <wp:inline distT="0" distB="0" distL="0" distR="0" wp14:anchorId="6B9FC4DB" wp14:editId="6B4FE5EA">
+          <wp:inline distT="0" distB="0" distL="0" distR="0" wp14:anchorId="4581DD96" wp14:editId="221EB071">
             <wp:extent cx="5760000" cy="3510857"/>
             <wp:effectExtent l="0" t="0" r="0" b="0"/>
             <wp:docPr id="6" name="Picture 6"/>
@@ -9075,7 +9075,7 @@
       <w:pPr>
         <w:pStyle w:val="Ttulo1"/>
       </w:pPr>
-      <w:bookmarkStart w:id="25" w:name="_Toc243401754"/>
+      <w:bookmarkStart w:id="25" w:name="_Toc243402232"/>
       <w:r>
         <w:t>7. Pruebas y resultados</w:t>
       </w:r>
@@ -9085,7 +9085,7 @@
       <w:pPr>
         <w:pStyle w:val="Ttulo2"/>
       </w:pPr>
-      <w:bookmarkStart w:id="26" w:name="_Toc243401755"/>
+      <w:bookmarkStart w:id="26" w:name="_Toc243402233"/>
       <w:r>
         <w:t>7.1 Casos de prueba</w:t>
       </w:r>
@@ -10002,7 +10002,7 @@
       <w:pPr>
         <w:pStyle w:val="Ttulo2"/>
       </w:pPr>
-      <w:bookmarkStart w:id="27" w:name="_Toc243401756"/>
+      <w:bookmarkStart w:id="27" w:name="_Toc243402234"/>
       <w:r>
         <w:t>7.2 Capturas de funcionamiento</w:t>
       </w:r>
@@ -10043,7 +10043,7 @@
           <w:noProof/>
         </w:rPr>
         <w:drawing>
-          <wp:inline distT="0" distB="0" distL="0" distR="0" wp14:anchorId="7334329F" wp14:editId="3486FE44">
+          <wp:inline distT="0" distB="0" distL="0" distR="0" wp14:anchorId="0E639693" wp14:editId="1D944FBC">
             <wp:extent cx="5040000" cy="3165217"/>
             <wp:effectExtent l="0" t="0" r="0" b="0"/>
             <wp:docPr id="7" name="Picture 7"/>
@@ -10133,7 +10133,7 @@
           <w:noProof/>
         </w:rPr>
         <w:drawing>
-          <wp:inline distT="0" distB="0" distL="0" distR="0" wp14:anchorId="39D53DF6" wp14:editId="44B6D63E">
+          <wp:inline distT="0" distB="0" distL="0" distR="0" wp14:anchorId="5DC399F7" wp14:editId="33F67B30">
             <wp:extent cx="5040000" cy="3150000"/>
             <wp:effectExtent l="0" t="0" r="0" b="0"/>
             <wp:docPr id="8" name="Picture 8"/>
@@ -10223,7 +10223,7 @@
           <w:noProof/>
         </w:rPr>
         <w:drawing>
-          <wp:inline distT="0" distB="0" distL="0" distR="0" wp14:anchorId="3545D421" wp14:editId="52E7B407">
+          <wp:inline distT="0" distB="0" distL="0" distR="0" wp14:anchorId="11E0ADD7" wp14:editId="7379DCEE">
             <wp:extent cx="2160000" cy="4674462"/>
             <wp:effectExtent l="0" t="0" r="0" b="0"/>
             <wp:docPr id="9" name="Picture 9"/>
@@ -10281,7 +10281,7 @@
       <w:pPr>
         <w:pStyle w:val="Ttulo2"/>
       </w:pPr>
-      <w:bookmarkStart w:id="28" w:name="_Toc243401757"/>
+      <w:bookmarkStart w:id="28" w:name="_Toc243402235"/>
       <w:r>
         <w:t>7.3 Rendimiento</w:t>
       </w:r>
@@ -10656,7 +10656,7 @@
       <w:pPr>
         <w:pStyle w:val="Ttulo2"/>
       </w:pPr>
-      <w:bookmarkStart w:id="29" w:name="_Toc243401758"/>
+      <w:bookmarkStart w:id="29" w:name="_Toc243402236"/>
       <w:r>
         <w:lastRenderedPageBreak/>
         <w:t>7.4 Errores encontrados y corregidos</w:t>
@@ -11065,7 +11065,7 @@
       <w:pPr>
         <w:pStyle w:val="Ttulo1"/>
       </w:pPr>
-      <w:bookmarkStart w:id="30" w:name="_Toc243401759"/>
+      <w:bookmarkStart w:id="30" w:name="_Toc243402237"/>
       <w:r>
         <w:t>8. Componente de Responsabilidad Social Universitaria (RSU)</w:t>
       </w:r>
@@ -11075,7 +11075,7 @@
       <w:pPr>
         <w:pStyle w:val="Ttulo2"/>
       </w:pPr>
-      <w:bookmarkStart w:id="31" w:name="_Toc243401760"/>
+      <w:bookmarkStart w:id="31" w:name="_Toc243402238"/>
       <w:r>
         <w:t>8.1 Beneficiario y actividad</w:t>
       </w:r>
@@ -11464,7 +11464,7 @@
       <w:pPr>
         <w:pStyle w:val="Ttulo2"/>
       </w:pPr>
-      <w:bookmarkStart w:id="32" w:name="_Toc243401761"/>
+      <w:bookmarkStart w:id="32" w:name="_Toc243402239"/>
       <w:r>
         <w:lastRenderedPageBreak/>
         <w:t>8.2 Evidencias</w:t>
@@ -11506,7 +11506,7 @@
           <w:noProof/>
         </w:rPr>
         <w:drawing>
-          <wp:inline distT="0" distB="0" distL="0" distR="0" wp14:anchorId="1DF259AB" wp14:editId="7566C8E3">
+          <wp:inline distT="0" distB="0" distL="0" distR="0" wp14:anchorId="251D8FC6" wp14:editId="7A215566">
             <wp:extent cx="5580000" cy="2246646"/>
             <wp:effectExtent l="0" t="0" r="0" b="0"/>
             <wp:docPr id="10" name="Picture 10"/>
@@ -11595,7 +11595,7 @@
           <w:noProof/>
         </w:rPr>
         <w:drawing>
-          <wp:inline distT="0" distB="0" distL="0" distR="0" wp14:anchorId="0335AF85" wp14:editId="3D9B28F4">
+          <wp:inline distT="0" distB="0" distL="0" distR="0" wp14:anchorId="6BD62C47" wp14:editId="126D944F">
             <wp:extent cx="5580000" cy="2571119"/>
             <wp:effectExtent l="0" t="0" r="0" b="0"/>
             <wp:docPr id="11" name="Picture 11"/>
@@ -11677,7 +11677,7 @@
       <w:pPr>
         <w:pStyle w:val="Ttulo2"/>
       </w:pPr>
-      <w:bookmarkStart w:id="33" w:name="_Toc243401762"/>
+      <w:bookmarkStart w:id="33" w:name="_Toc243402240"/>
       <w:r>
         <w:lastRenderedPageBreak/>
         <w:t>8.3 Resultados y siguiente etapa</w:t>
@@ -11724,7 +11724,7 @@
       <w:pPr>
         <w:pStyle w:val="Ttulo1"/>
       </w:pPr>
-      <w:bookmarkStart w:id="34" w:name="_Toc243401763"/>
+      <w:bookmarkStart w:id="34" w:name="_Toc243402241"/>
       <w:r>
         <w:t>9. Conclusiones y trabajo futuro (avance)</w:t>
       </w:r>
@@ -11780,7 +11780,7 @@
       <w:pPr>
         <w:pStyle w:val="Ttulo1"/>
       </w:pPr>
-      <w:bookmarkStart w:id="35" w:name="_Toc243401764"/>
+      <w:bookmarkStart w:id="35" w:name="_Toc243402242"/>
       <w:r>
         <w:t>10. Referencias</w:t>
       </w:r>
@@ -11876,7 +11876,7 @@
       <w:pPr>
         <w:pStyle w:val="Ttulo1"/>
       </w:pPr>
-      <w:bookmarkStart w:id="36" w:name="_Toc243401765"/>
+      <w:bookmarkStart w:id="36" w:name="_Toc243402243"/>
       <w:r>
         <w:t>11. Anexos (avance)</w:t>
       </w:r>
@@ -11886,7 +11886,7 @@
       <w:pPr>
         <w:pStyle w:val="Ttulo2"/>
       </w:pPr>
-      <w:bookmarkStart w:id="37" w:name="_Toc243401766"/>
+      <w:bookmarkStart w:id="37" w:name="_Toc243402244"/>
       <w:r>
         <w:t>11.1 Aporte de cada integrante</w:t>
       </w:r>
@@ -12172,7 +12172,7 @@
       <w:pPr>
         <w:pStyle w:val="Ttulo2"/>
       </w:pPr>
-      <w:bookmarkStart w:id="38" w:name="_Toc243401767"/>
+      <w:bookmarkStart w:id="38" w:name="_Toc243402245"/>
       <w:r>
         <w:t>11.2 Enlaces</w:t>
       </w:r>
@@ -12183,7 +12183,7 @@
         <w:pStyle w:val="Listaconvietas"/>
       </w:pPr>
       <w:r>
-        <w:t>Repositorio: [enlace al repositorio de GitHub — por completar]</w:t>
+        <w:t>Repositorio: https://github.com/zarabia123/COMPUTACION-GRAFICA</w:t>
       </w:r>
     </w:p>
     <w:p>
@@ -12198,7 +12198,7 @@
       <w:pPr>
         <w:pStyle w:val="Ttulo2"/>
       </w:pPr>
-      <w:bookmarkStart w:id="39" w:name="_Toc243401768"/>
+      <w:bookmarkStart w:id="39" w:name="_Toc243402246"/>
       <w:r>
         <w:t>11.3 Ficha del proyecto</w:t>
       </w:r>
@@ -12226,7 +12226,7 @@
       <w:pPr>
         <w:pStyle w:val="Ttulo2"/>
       </w:pPr>
-      <w:bookmarkStart w:id="40" w:name="_Toc243401769"/>
+      <w:bookmarkStart w:id="40" w:name="_Toc243402247"/>
       <w:r>
         <w:t>11.4 Declaración de uso de inteligencia artificial</w:t>
       </w:r>
@@ -12539,31 +12539,31 @@
       </w:rPr>
     </w:lvl>
   </w:abstractNum>
-  <w:num w:numId="1" w16cid:durableId="1422794167">
+  <w:num w:numId="1" w16cid:durableId="582836564">
     <w:abstractNumId w:val="8"/>
   </w:num>
-  <w:num w:numId="2" w16cid:durableId="1985894047">
+  <w:num w:numId="2" w16cid:durableId="221840634">
     <w:abstractNumId w:val="6"/>
   </w:num>
-  <w:num w:numId="3" w16cid:durableId="1731339320">
+  <w:num w:numId="3" w16cid:durableId="804199191">
     <w:abstractNumId w:val="5"/>
   </w:num>
-  <w:num w:numId="4" w16cid:durableId="1361588799">
+  <w:num w:numId="4" w16cid:durableId="1385566241">
     <w:abstractNumId w:val="4"/>
   </w:num>
-  <w:num w:numId="5" w16cid:durableId="329261577">
+  <w:num w:numId="5" w16cid:durableId="1564021936">
     <w:abstractNumId w:val="7"/>
   </w:num>
-  <w:num w:numId="6" w16cid:durableId="1300724672">
+  <w:num w:numId="6" w16cid:durableId="191265632">
     <w:abstractNumId w:val="3"/>
   </w:num>
-  <w:num w:numId="7" w16cid:durableId="1325668263">
+  <w:num w:numId="7" w16cid:durableId="2016613133">
     <w:abstractNumId w:val="2"/>
   </w:num>
-  <w:num w:numId="8" w16cid:durableId="1141310659">
+  <w:num w:numId="8" w16cid:durableId="186796472">
     <w:abstractNumId w:val="1"/>
   </w:num>
-  <w:num w:numId="9" w16cid:durableId="502355747">
+  <w:num w:numId="9" w16cid:durableId="1802575389">
     <w:abstractNumId w:val="0"/>
   </w:num>
 </w:numbering>
@@ -23952,7 +23952,7 @@
     <w:autoRedefine/>
     <w:uiPriority w:val="39"/>
     <w:unhideWhenUsed/>
-    <w:rsid w:val="00CD1810"/>
+    <w:rsid w:val="00550091"/>
     <w:pPr>
       <w:spacing w:after="100"/>
     </w:pPr>
@@ -23964,7 +23964,7 @@
     <w:autoRedefine/>
     <w:uiPriority w:val="39"/>
     <w:unhideWhenUsed/>
-    <w:rsid w:val="00CD1810"/>
+    <w:rsid w:val="00550091"/>
     <w:pPr>
       <w:spacing w:after="100"/>
       <w:ind w:left="240"/>
@@ -23975,7 +23975,7 @@
     <w:basedOn w:val="Fuentedeprrafopredeter"/>
     <w:uiPriority w:val="99"/>
     <w:unhideWhenUsed/>
-    <w:rsid w:val="00CD1810"/>
+    <w:rsid w:val="00550091"/>
     <w:rPr>
       <w:color w:val="0000FF" w:themeColor="hyperlink"/>
       <w:u w:val="single"/>

</xml_diff>